<commit_message>
feat: add delivery data generation script and project documentation
- Implemented a Python script (`generate_delivery_data.py`) to generate a synthetic dataset for a local delivery service, including variables such as distance, amount, preparation delay, delivery delay, total delay, lateness indicator, and customer satisfaction.
- Updated the course index (`index.qmd`) to include a section for the integrative project, linking to the new project documentation.
- Created a new project documentation file (`project-integrateur.qmd`) outlining the objectives, context, dataset details, and project guidelines for students.
- Added a quickstart script (`quickstart_project.py`) for students to load, explore, and visualize the generated dataset, facilitating initial data analysis.
</commit_message>
<xml_diff>
--- a/docs/teaching/statistics-probability/exam-3.docx
+++ b/docs/teaching/statistics-probability/exam-3.docx
@@ -7,43 +7,7 @@
         <w:pStyle w:val="Title"/>
       </w:pPr>
       <w:r>
-        <w:t xml:space="preserve">Examen</w:t>
-      </w:r>
-      <w:r>
-        <w:t xml:space="preserve"> </w:t>
-      </w:r>
-      <w:r>
-        <w:t xml:space="preserve">(Sujet</w:t>
-      </w:r>
-      <w:r>
-        <w:t xml:space="preserve"> </w:t>
-      </w:r>
-      <w:r>
-        <w:t xml:space="preserve">3)</w:t>
-      </w:r>
-      <w:r>
-        <w:t xml:space="preserve"> </w:t>
-      </w:r>
-      <w:r>
-        <w:t xml:space="preserve">—</w:t>
-      </w:r>
-      <w:r>
-        <w:t xml:space="preserve"> </w:t>
-      </w:r>
-      <w:r>
-        <w:t xml:space="preserve">Statistiques</w:t>
-      </w:r>
-      <w:r>
-        <w:t xml:space="preserve"> </w:t>
-      </w:r>
-      <w:r>
-        <w:t xml:space="preserve">et</w:t>
-      </w:r>
-      <w:r>
-        <w:t xml:space="preserve"> </w:t>
-      </w:r>
-      <w:r>
-        <w:t xml:space="preserve">Probabilités</w:t>
+        <w:t xml:space="preserve">Examen (Sujet 3) — Statistiques et Probabilités</w:t>
       </w:r>
     </w:p>
     <w:p>
@@ -51,61 +15,7 @@
         <w:pStyle w:val="Subtitle"/>
       </w:pPr>
       <w:r>
-        <w:t xml:space="preserve">Statistiques</w:t>
-      </w:r>
-      <w:r>
-        <w:t xml:space="preserve"> </w:t>
-      </w:r>
-      <w:r>
-        <w:t xml:space="preserve">descriptives</w:t>
-      </w:r>
-      <w:r>
-        <w:t xml:space="preserve"> </w:t>
-      </w:r>
-      <w:r>
-        <w:t xml:space="preserve">·</w:t>
-      </w:r>
-      <w:r>
-        <w:t xml:space="preserve"> </w:t>
-      </w:r>
-      <w:r>
-        <w:t xml:space="preserve">Variables</w:t>
-      </w:r>
-      <w:r>
-        <w:t xml:space="preserve"> </w:t>
-      </w:r>
-      <w:r>
-        <w:t xml:space="preserve">aléatoires</w:t>
-      </w:r>
-      <w:r>
-        <w:t xml:space="preserve"> </w:t>
-      </w:r>
-      <w:r>
-        <w:t xml:space="preserve">à</w:t>
-      </w:r>
-      <w:r>
-        <w:t xml:space="preserve"> </w:t>
-      </w:r>
-      <w:r>
-        <w:t xml:space="preserve">densité</w:t>
-      </w:r>
-      <w:r>
-        <w:t xml:space="preserve"> </w:t>
-      </w:r>
-      <w:r>
-        <w:t xml:space="preserve">·</w:t>
-      </w:r>
-      <w:r>
-        <w:t xml:space="preserve"> </w:t>
-      </w:r>
-      <w:r>
-        <w:t xml:space="preserve">Loi</w:t>
-      </w:r>
-      <w:r>
-        <w:t xml:space="preserve"> </w:t>
-      </w:r>
-      <w:r>
-        <w:t xml:space="preserve">normale</w:t>
+        <w:t xml:space="preserve">Statistiques descriptives · Variables aléatoires à densité · Loi normale</w:t>
       </w:r>
     </w:p>
     <w:p>
@@ -129,270 +39,100 @@
         <w:pStyle w:val="Abstract"/>
       </w:pPr>
       <w:r>
-        <w:t xml:space="preserve">Durée</w:t>
-      </w:r>
-      <w:r>
-        <w:t xml:space="preserve"> </w:t>
-      </w:r>
-      <w:r>
-        <w:t xml:space="preserve">:</w:t>
+        <w:t xml:space="preserve">Durée :</w:t>
       </w:r>
       <w:r>
         <w:t xml:space="preserve"> </w:t>
       </w:r>
       <w:r>
         <w:rPr>
+          <w:b/>
           <w:bCs/>
+        </w:rPr>
+        <w:t xml:space="preserve">1 h 30</w:t>
+      </w:r>
+      <w:r>
+        <w:t xml:space="preserve">. Les documents de cours sont</w:t>
+      </w:r>
+      <w:r>
+        <w:t xml:space="preserve"> </w:t>
+      </w:r>
+      <w:r>
+        <w:rPr>
           <w:b/>
-        </w:rPr>
-        <w:t xml:space="preserve">1</w:t>
-      </w:r>
-      <w:r>
-        <w:rPr>
           <w:bCs/>
-          <w:b/>
-        </w:rPr>
-        <w:t xml:space="preserve"> </w:t>
-      </w:r>
-      <w:r>
-        <w:rPr>
-          <w:bCs/>
-          <w:b/>
-        </w:rPr>
-        <w:t xml:space="preserve">h</w:t>
-      </w:r>
-      <w:r>
-        <w:rPr>
-          <w:bCs/>
-          <w:b/>
-        </w:rPr>
-        <w:t xml:space="preserve"> </w:t>
-      </w:r>
-      <w:r>
-        <w:rPr>
-          <w:bCs/>
-          <w:b/>
-        </w:rPr>
-        <w:t xml:space="preserve">30</w:t>
-      </w:r>
-      <w:r>
-        <w:t xml:space="preserve">.</w:t>
-      </w:r>
-      <w:r>
-        <w:t xml:space="preserve"> </w:t>
-      </w:r>
-      <w:r>
-        <w:t xml:space="preserve">Les</w:t>
-      </w:r>
-      <w:r>
-        <w:t xml:space="preserve"> </w:t>
-      </w:r>
-      <w:r>
-        <w:t xml:space="preserve">documents</w:t>
-      </w:r>
-      <w:r>
-        <w:t xml:space="preserve"> </w:t>
-      </w:r>
-      <w:r>
-        <w:t xml:space="preserve">de</w:t>
-      </w:r>
-      <w:r>
-        <w:t xml:space="preserve"> </w:t>
-      </w:r>
-      <w:r>
-        <w:t xml:space="preserve">cours</w:t>
-      </w:r>
-      <w:r>
-        <w:t xml:space="preserve"> </w:t>
-      </w:r>
-      <w:r>
-        <w:t xml:space="preserve">sont</w:t>
-      </w:r>
-      <w:r>
-        <w:t xml:space="preserve"> </w:t>
-      </w:r>
-      <w:r>
-        <w:rPr>
-          <w:bCs/>
-          <w:b/>
         </w:rPr>
         <w:t xml:space="preserve">interdits</w:t>
       </w:r>
       <w:r>
-        <w:t xml:space="preserve">.</w:t>
-      </w:r>
-      <w:r>
-        <w:t xml:space="preserve"> </w:t>
-      </w:r>
-      <w:r>
-        <w:t xml:space="preserve">Une</w:t>
-      </w:r>
-      <w:r>
-        <w:t xml:space="preserve"> </w:t>
-      </w:r>
-      <w:r>
-        <w:t xml:space="preserve">table</w:t>
-      </w:r>
-      <w:r>
-        <w:t xml:space="preserve"> </w:t>
-      </w:r>
-      <w:r>
-        <w:t xml:space="preserve">de</w:t>
-      </w:r>
-      <w:r>
-        <w:t xml:space="preserve"> </w:t>
-      </w:r>
-      <w:r>
-        <w:t xml:space="preserve">la</w:t>
-      </w:r>
-      <w:r>
-        <w:t xml:space="preserve"> </w:t>
-      </w:r>
-      <w:r>
-        <w:t xml:space="preserve">loi</w:t>
-      </w:r>
-      <w:r>
-        <w:t xml:space="preserve"> </w:t>
-      </w:r>
-      <w:r>
-        <w:t xml:space="preserve">normale</w:t>
-      </w:r>
-      <w:r>
-        <w:t xml:space="preserve"> </w:t>
-      </w:r>
-      <m:oMath>
-        <m:r>
-          <m:rPr>
-            <m:sty m:val="p"/>
+        <w:t xml:space="preserve">. Une table de la</w:t>
+      </w:r>
+      <w:r>
+        <w:t xml:space="preserve"> </w:t>
+      </w:r>
+      <w:r>
+        <w:t xml:space="preserve">loi normale</w:t>
+      </w:r>
+      <w:r>
+        <w:t xml:space="preserve"> </w:t>
+      </w:r>
+      <m:oMath>
+        <m:r>
+          <m:rPr>
             <m:scr m:val="script"/>
+            <m:sty m:val="p"/>
           </m:rPr>
           <m:t>N</m:t>
         </m:r>
-        <m:d>
-          <m:dPr>
-            <m:begChr m:val="("/>
-            <m:endChr m:val=")"/>
-            <m:sepChr m:val=""/>
-            <m:grow/>
-          </m:dPr>
-          <m:e>
-            <m:r>
-              <m:t>0</m:t>
-            </m:r>
-            <m:r>
-              <m:rPr>
-                <m:sty m:val="p"/>
-              </m:rPr>
-              <m:t>,</m:t>
-            </m:r>
-            <m:r>
-              <m:t>1</m:t>
-            </m:r>
-          </m:e>
-        </m:d>
-      </m:oMath>
-      <w:r>
-        <w:t xml:space="preserve"> </w:t>
-      </w:r>
-      <w:r>
-        <w:t xml:space="preserve">est</w:t>
-      </w:r>
-      <w:r>
-        <w:t xml:space="preserve"> </w:t>
-      </w:r>
-      <w:r>
-        <w:t xml:space="preserve">fournie.</w:t>
-      </w:r>
-      <w:r>
-        <w:t xml:space="preserve"> </w:t>
-      </w:r>
-      <w:r>
-        <w:t xml:space="preserve">Les</w:t>
-      </w:r>
-      <w:r>
-        <w:t xml:space="preserve"> </w:t>
-      </w:r>
-      <w:r>
-        <w:t xml:space="preserve">calculatrices</w:t>
-      </w:r>
-      <w:r>
-        <w:t xml:space="preserve"> </w:t>
-      </w:r>
-      <w:r>
-        <w:t xml:space="preserve">sont</w:t>
-      </w:r>
-      <w:r>
-        <w:t xml:space="preserve"> </w:t>
-      </w:r>
-      <w:r>
-        <w:t xml:space="preserve">autorisées.</w:t>
-      </w:r>
-      <w:r>
-        <w:t xml:space="preserve"> </w:t>
-      </w:r>
-      <w:r>
-        <w:t xml:space="preserve">Toute</w:t>
-      </w:r>
-      <w:r>
-        <w:t xml:space="preserve"> </w:t>
-      </w:r>
-      <w:r>
-        <w:t xml:space="preserve">réponse</w:t>
-      </w:r>
-      <w:r>
-        <w:t xml:space="preserve"> </w:t>
-      </w:r>
-      <w:r>
-        <w:t xml:space="preserve">doit</w:t>
-      </w:r>
-      <w:r>
-        <w:t xml:space="preserve"> </w:t>
-      </w:r>
-      <w:r>
-        <w:t xml:space="preserve">être</w:t>
+        <m:r>
+          <m:rPr>
+            <m:sty m:val="p"/>
+          </m:rPr>
+          <m:t>(</m:t>
+        </m:r>
+        <m:r>
+          <m:t>0</m:t>
+        </m:r>
+        <m:r>
+          <m:rPr>
+            <m:sty m:val="p"/>
+          </m:rPr>
+          <m:t>,</m:t>
+        </m:r>
+        <m:r>
+          <m:t>1</m:t>
+        </m:r>
+        <m:r>
+          <m:rPr>
+            <m:sty m:val="p"/>
+          </m:rPr>
+          <m:t>)</m:t>
+        </m:r>
+      </m:oMath>
+      <w:r>
+        <w:t xml:space="preserve"> </w:t>
+      </w:r>
+      <w:r>
+        <w:t xml:space="preserve">est fournie. Les calculatrices sont autorisées.</w:t>
+      </w:r>
+      <w:r>
+        <w:t xml:space="preserve"> </w:t>
+      </w:r>
+      <w:r>
+        <w:t xml:space="preserve">Toute réponse doit être</w:t>
       </w:r>
       <w:r>
         <w:t xml:space="preserve"> </w:t>
       </w:r>
       <w:r>
         <w:rPr>
+          <w:b/>
           <w:bCs/>
-          <w:b/>
         </w:rPr>
         <w:t xml:space="preserve">justifiée</w:t>
       </w:r>
       <w:r>
-        <w:t xml:space="preserve">.</w:t>
-      </w:r>
-      <w:r>
-        <w:t xml:space="preserve"> </w:t>
-      </w:r>
-      <w:r>
-        <w:t xml:space="preserve">Les</w:t>
-      </w:r>
-      <w:r>
-        <w:t xml:space="preserve"> </w:t>
-      </w:r>
-      <w:r>
-        <w:t xml:space="preserve">résultats</w:t>
-      </w:r>
-      <w:r>
-        <w:t xml:space="preserve"> </w:t>
-      </w:r>
-      <w:r>
-        <w:t xml:space="preserve">numériques</w:t>
-      </w:r>
-      <w:r>
-        <w:t xml:space="preserve"> </w:t>
-      </w:r>
-      <w:r>
-        <w:t xml:space="preserve">seront</w:t>
-      </w:r>
-      <w:r>
-        <w:t xml:space="preserve"> </w:t>
-      </w:r>
-      <w:r>
-        <w:t xml:space="preserve">arrondis</w:t>
+        <w:t xml:space="preserve">. Les résultats numériques seront arrondis</w:t>
       </w:r>
       <w:r>
         <w:t xml:space="preserve"> </w:t>
@@ -436,8 +176,8 @@
       </w:pPr>
       <w:r>
         <w:rPr>
+          <w:b/>
           <w:bCs/>
-          <w:b/>
         </w:rPr>
         <w:t xml:space="preserve">Barème indicatif :</w:t>
       </w:r>
@@ -455,7 +195,7 @@
         </w:pict>
       </w:r>
     </w:p>
-    <w:bookmarkStart w:id="22" w:name="Xfccd592e24640188c0f115adf4b28d9d75faec0"/>
+    <w:bookmarkStart w:id="11" w:name="Xfccd592e24640188c0f115adf4b28d9d75faec0"/>
     <w:p>
       <w:pPr>
         <w:pStyle w:val="Heading2"/>
@@ -464,7 +204,7 @@
         <w:t xml:space="preserve">Exercice 1 — Statistiques descriptives (30 points)</w:t>
       </w:r>
     </w:p>
-    <w:bookmarkStart w:id="20" w:name="partie-a-série-discrète-18-points"/>
+    <w:bookmarkStart w:id="9" w:name="partie-a-série-discrète-18-points"/>
     <w:p>
       <w:pPr>
         <w:pStyle w:val="Heading3"/>
@@ -492,7 +232,6 @@
         <w:tblStyle w:val="Table"/>
         <w:tblW w:type="auto" w:w="0"/>
         <w:tblLook w:firstRow="1" w:lastRow="0" w:firstColumn="0" w:lastColumn="0" w:noHBand="0" w:noVBand="0" w:val="0020"/>
-        <w:jc w:val="start"/>
       </w:tblPr>
       <w:tblGrid>
         <w:gridCol w:w="1131"/>
@@ -505,7 +244,7 @@
       </w:tblGrid>
       <w:tr>
         <w:trPr>
-          <w:tblHeader w:val="true"/>
+          <w:tblHeader w:val="on"/>
         </w:trPr>
         <w:tc>
           <w:tcPr/>
@@ -605,8 +344,8 @@
             </w:pPr>
             <w:r>
               <w:rPr>
+                <w:b/>
                 <w:bCs/>
-                <w:b/>
               </w:rPr>
               <w:t xml:space="preserve">Total</w:t>
             </w:r>
@@ -712,8 +451,8 @@
             </w:pPr>
             <w:r>
               <w:rPr>
+                <w:b/>
                 <w:bCs/>
-                <w:b/>
               </w:rPr>
               <w:t xml:space="preserve">40</w:t>
             </w:r>
@@ -799,8 +538,8 @@
             </w:pPr>
             <w:r>
               <w:rPr>
+                <w:b/>
                 <w:bCs/>
-                <w:b/>
               </w:rPr>
               <w:t xml:space="preserve">1</w:t>
             </w:r>
@@ -988,8 +727,8 @@
       </w:pPr>
       <w:r>
         <w:rPr>
+          <w:b/>
           <w:bCs/>
-          <w:b/>
         </w:rPr>
         <w:t xml:space="preserve">1.</w:t>
       </w:r>
@@ -998,8 +737,8 @@
       </w:r>
       <w:r>
         <w:rPr>
+          <w:i/>
           <w:iCs/>
-          <w:i/>
         </w:rPr>
         <w:t xml:space="preserve">(3 pts)</w:t>
       </w:r>
@@ -1022,8 +761,8 @@
       </w:pPr>
       <w:r>
         <w:rPr>
+          <w:b/>
           <w:bCs/>
-          <w:b/>
         </w:rPr>
         <w:t xml:space="preserve">2.</w:t>
       </w:r>
@@ -1032,8 +771,8 @@
       </w:r>
       <w:r>
         <w:rPr>
+          <w:i/>
           <w:iCs/>
-          <w:i/>
         </w:rPr>
         <w:t xml:space="preserve">(5 pts)</w:t>
       </w:r>
@@ -1136,8 +875,8 @@
       </w:pPr>
       <w:r>
         <w:rPr>
+          <w:b/>
           <w:bCs/>
-          <w:b/>
         </w:rPr>
         <w:t xml:space="preserve">3.</w:t>
       </w:r>
@@ -1146,8 +885,8 @@
       </w:r>
       <w:r>
         <w:rPr>
+          <w:i/>
           <w:iCs/>
-          <w:i/>
         </w:rPr>
         <w:t xml:space="preserve">(6 pts)</w:t>
       </w:r>
@@ -1224,19 +963,21 @@
           </m:rPr>
           <m:t>r</m:t>
         </m:r>
-        <m:d>
-          <m:dPr>
-            <m:begChr m:val="("/>
-            <m:endChr m:val=")"/>
-            <m:sepChr m:val=""/>
-            <m:grow/>
-          </m:dPr>
-          <m:e>
-            <m:r>
-              <m:t>x</m:t>
-            </m:r>
-          </m:e>
-        </m:d>
+        <m:r>
+          <m:rPr>
+            <m:sty m:val="p"/>
+          </m:rPr>
+          <m:t>(</m:t>
+        </m:r>
+        <m:r>
+          <m:t>x</m:t>
+        </m:r>
+        <m:r>
+          <m:rPr>
+            <m:sty m:val="p"/>
+          </m:rPr>
+          <m:t>)</m:t>
+        </m:r>
       </m:oMath>
       <w:r>
         <w:t xml:space="preserve"> </w:t>
@@ -1249,22 +990,22 @@
       </w:r>
       <w:r>
         <w:rPr>
+          <w:b/>
           <w:bCs/>
-          <w:b/>
         </w:rPr>
         <w:t xml:space="preserve">formule de</w:t>
       </w:r>
       <w:r>
         <w:rPr>
+          <w:b/>
           <w:bCs/>
+        </w:rPr>
+        <w:t xml:space="preserve"> </w:t>
+      </w:r>
+      <w:r>
+        <w:rPr>
           <w:b/>
-        </w:rPr>
-        <w:t xml:space="preserve"> </w:t>
-      </w:r>
-      <w:r>
-        <w:rPr>
           <w:bCs/>
-          <w:b/>
         </w:rPr>
         <w:t xml:space="preserve">König-Huygens</w:t>
       </w:r>
@@ -1281,19 +1022,21 @@
         <m:r>
           <m:t>σ</m:t>
         </m:r>
-        <m:d>
-          <m:dPr>
-            <m:begChr m:val="("/>
-            <m:endChr m:val=")"/>
-            <m:sepChr m:val=""/>
-            <m:grow/>
-          </m:dPr>
-          <m:e>
-            <m:r>
-              <m:t>x</m:t>
-            </m:r>
-          </m:e>
-        </m:d>
+        <m:r>
+          <m:rPr>
+            <m:sty m:val="p"/>
+          </m:rPr>
+          <m:t>(</m:t>
+        </m:r>
+        <m:r>
+          <m:t>x</m:t>
+        </m:r>
+        <m:r>
+          <m:rPr>
+            <m:sty m:val="p"/>
+          </m:rPr>
+          <m:t>)</m:t>
+        </m:r>
       </m:oMath>
       <w:r>
         <w:t xml:space="preserve">.</w:t>
@@ -1305,8 +1048,8 @@
       </w:pPr>
       <w:r>
         <w:rPr>
+          <w:b/>
           <w:bCs/>
-          <w:b/>
         </w:rPr>
         <w:t xml:space="preserve">4.</w:t>
       </w:r>
@@ -1315,8 +1058,8 @@
       </w:r>
       <w:r>
         <w:rPr>
+          <w:i/>
           <w:iCs/>
-          <w:i/>
         </w:rPr>
         <w:t xml:space="preserve">(4 pts)</w:t>
       </w:r>
@@ -1404,19 +1147,21 @@
           </m:rPr>
           <m:t>r</m:t>
         </m:r>
-        <m:d>
-          <m:dPr>
-            <m:begChr m:val="("/>
-            <m:endChr m:val=")"/>
-            <m:sepChr m:val=""/>
-            <m:grow/>
-          </m:dPr>
-          <m:e>
-            <m:r>
-              <m:t>Y</m:t>
-            </m:r>
-          </m:e>
-        </m:d>
+        <m:r>
+          <m:rPr>
+            <m:sty m:val="p"/>
+          </m:rPr>
+          <m:t>(</m:t>
+        </m:r>
+        <m:r>
+          <m:t>Y</m:t>
+        </m:r>
+        <m:r>
+          <m:rPr>
+            <m:sty m:val="p"/>
+          </m:rPr>
+          <m:t>)</m:t>
+        </m:r>
       </m:oMath>
       <w:r>
         <w:t xml:space="preserve"> </w:t>
@@ -1431,19 +1176,21 @@
         <m:r>
           <m:t>σ</m:t>
         </m:r>
-        <m:d>
-          <m:dPr>
-            <m:begChr m:val="("/>
-            <m:endChr m:val=")"/>
-            <m:sepChr m:val=""/>
-            <m:grow/>
-          </m:dPr>
-          <m:e>
-            <m:r>
-              <m:t>Y</m:t>
-            </m:r>
-          </m:e>
-        </m:d>
+        <m:r>
+          <m:rPr>
+            <m:sty m:val="p"/>
+          </m:rPr>
+          <m:t>(</m:t>
+        </m:r>
+        <m:r>
+          <m:t>Y</m:t>
+        </m:r>
+        <m:r>
+          <m:rPr>
+            <m:sty m:val="p"/>
+          </m:rPr>
+          <m:t>)</m:t>
+        </m:r>
       </m:oMath>
       <w:r>
         <w:t xml:space="preserve">.</w:t>
@@ -1456,8 +1203,8 @@
         </w:pict>
       </w:r>
     </w:p>
-    <w:bookmarkEnd w:id="20"/>
-    <w:bookmarkStart w:id="21" w:name="Xc1d90aa52659a89ab1be1e11e265869bad25306"/>
+    <w:bookmarkEnd w:id="9"/>
+    <w:bookmarkStart w:id="10" w:name="Xc1d90aa52659a89ab1be1e11e265869bad25306"/>
     <w:p>
       <w:pPr>
         <w:pStyle w:val="Heading3"/>
@@ -1479,7 +1226,6 @@
         <w:tblStyle w:val="Table"/>
         <w:tblW w:type="auto" w:w="0"/>
         <w:tblLook w:firstRow="1" w:lastRow="0" w:firstColumn="0" w:lastColumn="0" w:noHBand="0" w:noVBand="0" w:val="0020"/>
-        <w:jc w:val="start"/>
       </w:tblPr>
       <w:tblGrid>
         <w:gridCol w:w="1584"/>
@@ -1490,7 +1236,7 @@
       </w:tblGrid>
       <w:tr>
         <w:trPr>
-          <w:tblHeader w:val="true"/>
+          <w:tblHeader w:val="on"/>
         </w:trPr>
         <w:tc>
           <w:tcPr/>
@@ -1755,8 +1501,8 @@
       </w:pPr>
       <w:r>
         <w:rPr>
+          <w:b/>
           <w:bCs/>
-          <w:b/>
         </w:rPr>
         <w:t xml:space="preserve">5.</w:t>
       </w:r>
@@ -1765,8 +1511,8 @@
       </w:r>
       <w:r>
         <w:rPr>
+          <w:i/>
           <w:iCs/>
-          <w:i/>
         </w:rPr>
         <w:t xml:space="preserve">(6 pts)</w:t>
       </w:r>
@@ -1900,8 +1646,8 @@
       </w:pPr>
       <w:r>
         <w:rPr>
+          <w:b/>
           <w:bCs/>
-          <w:b/>
         </w:rPr>
         <w:t xml:space="preserve">6.</w:t>
       </w:r>
@@ -1910,8 +1656,8 @@
       </w:r>
       <w:r>
         <w:rPr>
+          <w:i/>
           <w:iCs/>
-          <w:i/>
         </w:rPr>
         <w:t xml:space="preserve">(6 pts)</w:t>
       </w:r>
@@ -1970,19 +1716,21 @@
           </m:rPr>
           <m:t>r</m:t>
         </m:r>
-        <m:d>
-          <m:dPr>
-            <m:begChr m:val="("/>
-            <m:endChr m:val=")"/>
-            <m:sepChr m:val=""/>
-            <m:grow/>
-          </m:dPr>
-          <m:e>
-            <m:r>
-              <m:t>x</m:t>
-            </m:r>
-          </m:e>
-        </m:d>
+        <m:r>
+          <m:rPr>
+            <m:sty m:val="p"/>
+          </m:rPr>
+          <m:t>(</m:t>
+        </m:r>
+        <m:r>
+          <m:t>x</m:t>
+        </m:r>
+        <m:r>
+          <m:rPr>
+            <m:sty m:val="p"/>
+          </m:rPr>
+          <m:t>)</m:t>
+        </m:r>
       </m:oMath>
       <w:r>
         <w:t xml:space="preserve"> </w:t>
@@ -1995,22 +1743,22 @@
       </w:r>
       <w:r>
         <w:rPr>
+          <w:b/>
           <w:bCs/>
-          <w:b/>
         </w:rPr>
         <w:t xml:space="preserve">centres</w:t>
       </w:r>
       <w:r>
         <w:rPr>
+          <w:b/>
           <w:bCs/>
+        </w:rPr>
+        <w:t xml:space="preserve"> </w:t>
+      </w:r>
+      <w:r>
+        <w:rPr>
           <w:b/>
-        </w:rPr>
-        <w:t xml:space="preserve"> </w:t>
-      </w:r>
-      <w:r>
-        <w:rPr>
           <w:bCs/>
-          <w:b/>
         </w:rPr>
         <w:t xml:space="preserve">de classe</w:t>
       </w:r>
@@ -2025,9 +1773,9 @@
         </w:pict>
       </w:r>
     </w:p>
-    <w:bookmarkEnd w:id="21"/>
-    <w:bookmarkEnd w:id="22"/>
-    <w:bookmarkStart w:id="23" w:name="X4e4a7e683ca1cf4f03592b6949daef2b68d11a3"/>
+    <w:bookmarkEnd w:id="10"/>
+    <w:bookmarkEnd w:id="11"/>
+    <w:bookmarkStart w:id="12" w:name="X4e4a7e683ca1cf4f03592b6949daef2b68d11a3"/>
     <w:p>
       <w:pPr>
         <w:pStyle w:val="Heading2"/>
@@ -2063,8 +1811,8 @@
       <m:oMath>
         <m:r>
           <m:rPr>
-            <m:sty m:val="p"/>
             <m:scr m:val="double-struck"/>
+            <m:sty m:val="p"/>
           </m:rPr>
           <m:t>R</m:t>
         </m:r>
@@ -2088,19 +1836,21 @@
           <m:r>
             <m:t>f</m:t>
           </m:r>
-          <m:d>
-            <m:dPr>
-              <m:begChr m:val="("/>
-              <m:endChr m:val=")"/>
-              <m:sepChr m:val=""/>
-              <m:grow/>
-            </m:dPr>
-            <m:e>
-              <m:r>
-                <m:t>x</m:t>
-              </m:r>
-            </m:e>
-          </m:d>
+          <m:r>
+            <m:rPr>
+              <m:sty m:val="p"/>
+            </m:rPr>
+            <m:t>(</m:t>
+          </m:r>
+          <m:r>
+            <m:t>x</m:t>
+          </m:r>
+          <m:r>
+            <m:rPr>
+              <m:sty m:val="p"/>
+            </m:rPr>
+            <m:t>)</m:t>
+          </m:r>
           <m:r>
             <m:rPr>
               <m:sty m:val="p"/>
@@ -2110,8 +1860,8 @@
           <m:d>
             <m:dPr>
               <m:begChr m:val="{"/>
+              <m:sepChr m:val=""/>
               <m:endChr m:val=""/>
-              <m:sepChr m:val=""/>
               <m:grow/>
             </m:dPr>
             <m:e>
@@ -2148,28 +1898,30 @@
                     <m:r>
                       <m:t> </m:t>
                     </m:r>
-                    <m:d>
-                      <m:dPr>
-                        <m:begChr m:val="("/>
-                        <m:endChr m:val=")"/>
-                        <m:sepChr m:val=""/>
-                        <m:grow/>
-                      </m:dPr>
-                      <m:e>
-                        <m:r>
-                          <m:t>1</m:t>
-                        </m:r>
-                        <m:r>
-                          <m:rPr>
-                            <m:sty m:val="p"/>
-                          </m:rPr>
-                          <m:t>−</m:t>
-                        </m:r>
-                        <m:r>
-                          <m:t>x</m:t>
-                        </m:r>
-                      </m:e>
-                    </m:d>
+                    <m:r>
+                      <m:rPr>
+                        <m:sty m:val="p"/>
+                      </m:rPr>
+                      <m:t>(</m:t>
+                    </m:r>
+                    <m:r>
+                      <m:t>1</m:t>
+                    </m:r>
+                    <m:r>
+                      <m:rPr>
+                        <m:sty m:val="p"/>
+                      </m:rPr>
+                      <m:t>−</m:t>
+                    </m:r>
+                    <m:r>
+                      <m:t>x</m:t>
+                    </m:r>
+                    <m:r>
+                      <m:rPr>
+                        <m:sty m:val="p"/>
+                      </m:rPr>
+                      <m:t>)</m:t>
+                    </m:r>
                   </m:e>
                   <m:e>
                     <m:r>
@@ -2188,34 +1940,36 @@
                       </m:rPr>
                       <m:t>∈</m:t>
                     </m:r>
-                    <m:d>
-                      <m:dPr>
-                        <m:begChr m:val="["/>
-                        <m:endChr m:val="]"/>
-                        <m:sepChr m:val=""/>
-                        <m:grow/>
-                      </m:dPr>
-                      <m:e>
-                        <m:r>
-                          <m:t>0</m:t>
-                        </m:r>
-                        <m:r>
-                          <m:t> </m:t>
-                        </m:r>
-                        <m:r>
-                          <m:rPr>
-                            <m:sty m:val="p"/>
-                          </m:rPr>
-                          <m:t>;</m:t>
-                        </m:r>
-                        <m:r>
-                          <m:t> </m:t>
-                        </m:r>
-                        <m:r>
-                          <m:t>1</m:t>
-                        </m:r>
-                      </m:e>
-                    </m:d>
+                    <m:r>
+                      <m:rPr>
+                        <m:sty m:val="p"/>
+                      </m:rPr>
+                      <m:t>[</m:t>
+                    </m:r>
+                    <m:r>
+                      <m:t>0</m:t>
+                    </m:r>
+                    <m:r>
+                      <m:t> </m:t>
+                    </m:r>
+                    <m:r>
+                      <m:rPr>
+                        <m:sty m:val="p"/>
+                      </m:rPr>
+                      <m:t>;</m:t>
+                    </m:r>
+                    <m:r>
+                      <m:t> </m:t>
+                    </m:r>
+                    <m:r>
+                      <m:t>1</m:t>
+                    </m:r>
+                    <m:r>
+                      <m:rPr>
+                        <m:sty m:val="p"/>
+                      </m:rPr>
+                      <m:t>]</m:t>
+                    </m:r>
                     <m:r>
                       <m:rPr>
                         <m:sty m:val="p"/>
@@ -2252,8 +2006,8 @@
       </w:pPr>
       <w:r>
         <w:rPr>
+          <w:b/>
           <w:bCs/>
-          <w:b/>
         </w:rPr>
         <w:t xml:space="preserve">1.</w:t>
       </w:r>
@@ -2262,8 +2016,8 @@
       </w:r>
       <w:r>
         <w:rPr>
+          <w:i/>
           <w:iCs/>
-          <w:i/>
         </w:rPr>
         <w:t xml:space="preserve">(5 pts)</w:t>
       </w:r>
@@ -2280,19 +2034,21 @@
         <m:r>
           <m:t>f</m:t>
         </m:r>
-        <m:d>
-          <m:dPr>
-            <m:begChr m:val="("/>
-            <m:endChr m:val=")"/>
-            <m:sepChr m:val=""/>
-            <m:grow/>
-          </m:dPr>
-          <m:e>
-            <m:r>
-              <m:t>x</m:t>
-            </m:r>
-          </m:e>
-        </m:d>
+        <m:r>
+          <m:rPr>
+            <m:sty m:val="p"/>
+          </m:rPr>
+          <m:t>(</m:t>
+        </m:r>
+        <m:r>
+          <m:t>x</m:t>
+        </m:r>
+        <m:r>
+          <m:rPr>
+            <m:sty m:val="p"/>
+          </m:rPr>
+          <m:t>)</m:t>
+        </m:r>
         <m:r>
           <m:rPr>
             <m:sty m:val="p"/>
@@ -2322,34 +2078,36 @@
           </m:rPr>
           <m:t>∈</m:t>
         </m:r>
-        <m:d>
-          <m:dPr>
-            <m:begChr m:val="["/>
-            <m:endChr m:val="]"/>
-            <m:sepChr m:val=""/>
-            <m:grow/>
-          </m:dPr>
-          <m:e>
-            <m:r>
-              <m:t>0</m:t>
-            </m:r>
-            <m:r>
-              <m:t> </m:t>
-            </m:r>
-            <m:r>
-              <m:rPr>
-                <m:sty m:val="p"/>
-              </m:rPr>
-              <m:t>;</m:t>
-            </m:r>
-            <m:r>
-              <m:t> </m:t>
-            </m:r>
-            <m:r>
-              <m:t>1</m:t>
-            </m:r>
-          </m:e>
-        </m:d>
+        <m:r>
+          <m:rPr>
+            <m:sty m:val="p"/>
+          </m:rPr>
+          <m:t>[</m:t>
+        </m:r>
+        <m:r>
+          <m:t>0</m:t>
+        </m:r>
+        <m:r>
+          <m:t> </m:t>
+        </m:r>
+        <m:r>
+          <m:rPr>
+            <m:sty m:val="p"/>
+          </m:rPr>
+          <m:t>;</m:t>
+        </m:r>
+        <m:r>
+          <m:t> </m:t>
+        </m:r>
+        <m:r>
+          <m:t>1</m:t>
+        </m:r>
+        <m:r>
+          <m:rPr>
+            <m:sty m:val="p"/>
+          </m:rPr>
+          <m:t>]</m:t>
+        </m:r>
       </m:oMath>
       <w:r>
         <w:t xml:space="preserve">.</w:t>
@@ -2387,28 +2145,30 @@
             </m:r>
           </m:e>
         </m:nary>
-        <m:d>
-          <m:dPr>
-            <m:begChr m:val="("/>
-            <m:endChr m:val=")"/>
-            <m:sepChr m:val=""/>
-            <m:grow/>
-          </m:dPr>
-          <m:e>
-            <m:r>
-              <m:t>1</m:t>
-            </m:r>
-            <m:r>
-              <m:rPr>
-                <m:sty m:val="p"/>
-              </m:rPr>
-              <m:t>−</m:t>
-            </m:r>
-            <m:r>
-              <m:t>x</m:t>
-            </m:r>
-          </m:e>
-        </m:d>
+        <m:r>
+          <m:rPr>
+            <m:sty m:val="p"/>
+          </m:rPr>
+          <m:t>(</m:t>
+        </m:r>
+        <m:r>
+          <m:t>1</m:t>
+        </m:r>
+        <m:r>
+          <m:rPr>
+            <m:sty m:val="p"/>
+          </m:rPr>
+          <m:t>−</m:t>
+        </m:r>
+        <m:r>
+          <m:t>x</m:t>
+        </m:r>
+        <m:r>
+          <m:rPr>
+            <m:sty m:val="p"/>
+          </m:rPr>
+          <m:t>)</m:t>
+        </m:r>
         <m:r>
           <m:t> </m:t>
         </m:r>
@@ -2491,8 +2251,8 @@
       </w:r>
       <w:r>
         <w:rPr>
+          <w:b/>
           <w:bCs/>
-          <w:b/>
         </w:rPr>
         <w:t xml:space="preserve">densité de probabilité</w:t>
       </w:r>
@@ -2508,8 +2268,8 @@
       <m:oMath>
         <m:r>
           <m:rPr>
-            <m:sty m:val="p"/>
             <m:scr m:val="double-struck"/>
+            <m:sty m:val="p"/>
           </m:rPr>
           <m:t>R</m:t>
         </m:r>
@@ -2524,8 +2284,8 @@
       </w:pPr>
       <w:r>
         <w:rPr>
+          <w:b/>
           <w:bCs/>
-          <w:b/>
         </w:rPr>
         <w:t xml:space="preserve">2.</w:t>
       </w:r>
@@ -2534,8 +2294,8 @@
       </w:r>
       <w:r>
         <w:rPr>
+          <w:i/>
           <w:iCs/>
-          <w:i/>
         </w:rPr>
         <w:t xml:space="preserve">(8 pts)</w:t>
       </w:r>
@@ -2575,22 +2335,22 @@
       </w:r>
       <w:r>
         <w:rPr>
+          <w:b/>
           <w:bCs/>
-          <w:b/>
         </w:rPr>
         <w:t xml:space="preserve">fonction de</w:t>
       </w:r>
       <w:r>
         <w:rPr>
+          <w:b/>
           <w:bCs/>
+        </w:rPr>
+        <w:t xml:space="preserve"> </w:t>
+      </w:r>
+      <w:r>
+        <w:rPr>
           <w:b/>
-        </w:rPr>
-        <w:t xml:space="preserve"> </w:t>
-      </w:r>
-      <w:r>
-        <w:rPr>
           <w:bCs/>
-          <w:b/>
         </w:rPr>
         <w:t xml:space="preserve">répartition</w:t>
       </w:r>
@@ -2637,8 +2397,8 @@
       <m:oMath>
         <m:r>
           <m:rPr>
-            <m:sty m:val="p"/>
             <m:scr m:val="double-struck"/>
+            <m:sty m:val="p"/>
           </m:rPr>
           <m:t>R</m:t>
         </m:r>
@@ -2722,8 +2482,8 @@
       </w:pPr>
       <w:r>
         <w:rPr>
+          <w:b/>
           <w:bCs/>
-          <w:b/>
         </w:rPr>
         <w:t xml:space="preserve">3.</w:t>
       </w:r>
@@ -2732,8 +2492,8 @@
       </w:r>
       <w:r>
         <w:rPr>
+          <w:i/>
           <w:iCs/>
-          <w:i/>
         </w:rPr>
         <w:t xml:space="preserve">(4 pts)</w:t>
       </w:r>
@@ -2759,47 +2519,49 @@
             </m:r>
           </m:sub>
         </m:sSub>
+        <m:r>
+          <m:rPr>
+            <m:sty m:val="p"/>
+          </m:rPr>
+          <m:t>(</m:t>
+        </m:r>
+        <m:r>
+          <m:t>1</m:t>
+        </m:r>
+        <m:r>
+          <m:rPr>
+            <m:sty m:val="p"/>
+          </m:rPr>
+          <m:t>)</m:t>
+        </m:r>
+        <m:r>
+          <m:rPr>
+            <m:sty m:val="p"/>
+          </m:rPr>
+          <m:t>=</m:t>
+        </m:r>
+        <m:r>
+          <m:t>1</m:t>
+        </m:r>
+      </m:oMath>
+      <w:r>
+        <w:t xml:space="preserve">, puis calculer</w:t>
+      </w:r>
+      <w:r>
+        <w:t xml:space="preserve"> </w:t>
+      </w:r>
+      <m:oMath>
+        <m:r>
+          <m:t>P</m:t>
+        </m:r>
+        <m:r>
+          <m:t>​</m:t>
+        </m:r>
         <m:d>
           <m:dPr>
             <m:begChr m:val="("/>
+            <m:sepChr m:val=""/>
             <m:endChr m:val=")"/>
-            <m:sepChr m:val=""/>
-            <m:grow/>
-          </m:dPr>
-          <m:e>
-            <m:r>
-              <m:t>1</m:t>
-            </m:r>
-          </m:e>
-        </m:d>
-        <m:r>
-          <m:rPr>
-            <m:sty m:val="p"/>
-          </m:rPr>
-          <m:t>=</m:t>
-        </m:r>
-        <m:r>
-          <m:t>1</m:t>
-        </m:r>
-      </m:oMath>
-      <w:r>
-        <w:t xml:space="preserve">, puis calculer</w:t>
-      </w:r>
-      <w:r>
-        <w:t xml:space="preserve"> </w:t>
-      </w:r>
-      <m:oMath>
-        <m:r>
-          <m:t>P</m:t>
-        </m:r>
-        <m:r>
-          <m:t>​</m:t>
-        </m:r>
-        <m:d>
-          <m:dPr>
-            <m:begChr m:val="("/>
-            <m:endChr m:val=")"/>
-            <m:sepChr m:val=""/>
             <m:grow/>
           </m:dPr>
           <m:e>
@@ -2863,8 +2625,8 @@
       </w:pPr>
       <w:r>
         <w:rPr>
+          <w:b/>
           <w:bCs/>
-          <w:b/>
         </w:rPr>
         <w:t xml:space="preserve">4.</w:t>
       </w:r>
@@ -2873,8 +2635,8 @@
       </w:r>
       <w:r>
         <w:rPr>
+          <w:i/>
           <w:iCs/>
-          <w:i/>
         </w:rPr>
         <w:t xml:space="preserve">(5 pts)</w:t>
       </w:r>
@@ -2903,15 +2665,15 @@
       </w:r>
       <w:r>
         <w:rPr>
+          <w:b/>
           <w:bCs/>
-          <w:b/>
         </w:rPr>
         <w:t xml:space="preserve">symétrique par rapport à</w:t>
       </w:r>
       <w:r>
         <w:rPr>
+          <w:b/>
           <w:bCs/>
-          <w:b/>
         </w:rPr>
         <w:t xml:space="preserve"> </w:t>
       </w:r>
@@ -2957,8 +2719,8 @@
         <m:d>
           <m:dPr>
             <m:begChr m:val="("/>
+            <m:sepChr m:val=""/>
             <m:endChr m:val=")"/>
-            <m:sepChr m:val=""/>
             <m:grow/>
           </m:dPr>
           <m:e>
@@ -3003,8 +2765,8 @@
         <m:d>
           <m:dPr>
             <m:begChr m:val="("/>
+            <m:sepChr m:val=""/>
             <m:endChr m:val=")"/>
-            <m:sepChr m:val=""/>
             <m:grow/>
           </m:dPr>
           <m:e>
@@ -3056,8 +2818,8 @@
         </m:r>
         <m:r>
           <m:rPr>
-            <m:sty m:val="p"/>
             <m:scr m:val="double-struck"/>
+            <m:sty m:val="p"/>
           </m:rPr>
           <m:t>R</m:t>
         </m:r>
@@ -3068,11 +2830,11 @@
     </w:p>
     <w:p>
       <w:pPr>
+        <w:pStyle w:val="Compact"/>
         <w:numPr>
           <w:ilvl w:val="0"/>
           <w:numId w:val="1001"/>
         </w:numPr>
-        <w:pStyle w:val="Compact"/>
       </w:pPr>
       <w:r>
         <w:t xml:space="preserve">Vérifier cette propriété de symétrie.</w:t>
@@ -3080,11 +2842,11 @@
     </w:p>
     <w:p>
       <w:pPr>
+        <w:pStyle w:val="Compact"/>
         <w:numPr>
           <w:ilvl w:val="0"/>
           <w:numId w:val="1001"/>
         </w:numPr>
-        <w:pStyle w:val="Compact"/>
       </w:pPr>
       <w:r>
         <w:t xml:space="preserve">En déduire</w:t>
@@ -3095,24 +2857,26 @@
       <m:oMath>
         <m:r>
           <m:rPr>
-            <m:sty m:val="p"/>
             <m:scr m:val="double-struck"/>
+            <m:sty m:val="p"/>
           </m:rPr>
           <m:t>E</m:t>
         </m:r>
-        <m:d>
-          <m:dPr>
-            <m:begChr m:val="("/>
-            <m:endChr m:val=")"/>
-            <m:sepChr m:val=""/>
-            <m:grow/>
-          </m:dPr>
-          <m:e>
-            <m:r>
-              <m:t>X</m:t>
-            </m:r>
-          </m:e>
-        </m:d>
+        <m:r>
+          <m:rPr>
+            <m:sty m:val="p"/>
+          </m:rPr>
+          <m:t>(</m:t>
+        </m:r>
+        <m:r>
+          <m:t>X</m:t>
+        </m:r>
+        <m:r>
+          <m:rPr>
+            <m:sty m:val="p"/>
+          </m:rPr>
+          <m:t>)</m:t>
+        </m:r>
       </m:oMath>
       <w:r>
         <w:t xml:space="preserve"> </w:t>
@@ -3127,8 +2891,8 @@
       </w:pPr>
       <w:r>
         <w:rPr>
+          <w:b/>
           <w:bCs/>
-          <w:b/>
         </w:rPr>
         <w:t xml:space="preserve">5.</w:t>
       </w:r>
@@ -3137,8 +2901,8 @@
       </w:r>
       <w:r>
         <w:rPr>
+          <w:i/>
           <w:iCs/>
-          <w:i/>
         </w:rPr>
         <w:t xml:space="preserve">(8 pts)</w:t>
       </w:r>
@@ -3154,33 +2918,35 @@
       <m:oMath>
         <m:r>
           <m:rPr>
-            <m:sty m:val="p"/>
             <m:scr m:val="double-struck"/>
+            <m:sty m:val="p"/>
           </m:rPr>
           <m:t>E</m:t>
         </m:r>
-        <m:d>
-          <m:dPr>
-            <m:begChr m:val="("/>
-            <m:endChr m:val=")"/>
-            <m:sepChr m:val=""/>
-            <m:grow/>
-          </m:dPr>
+        <m:r>
+          <m:rPr>
+            <m:sty m:val="p"/>
+          </m:rPr>
+          <m:t>(</m:t>
+        </m:r>
+        <m:sSup>
           <m:e>
-            <m:sSup>
-              <m:e>
-                <m:r>
-                  <m:t>X</m:t>
-                </m:r>
-              </m:e>
-              <m:sup>
-                <m:r>
-                  <m:t>2</m:t>
-                </m:r>
-              </m:sup>
-            </m:sSup>
+            <m:r>
+              <m:t>X</m:t>
+            </m:r>
           </m:e>
-        </m:d>
+          <m:sup>
+            <m:r>
+              <m:t>2</m:t>
+            </m:r>
+          </m:sup>
+        </m:sSup>
+        <m:r>
+          <m:rPr>
+            <m:sty m:val="p"/>
+          </m:rPr>
+          <m:t>)</m:t>
+        </m:r>
       </m:oMath>
       <w:r>
         <w:t xml:space="preserve"> </w:t>
@@ -3193,8 +2959,8 @@
       </w:r>
       <w:r>
         <w:rPr>
+          <w:b/>
           <w:bCs/>
-          <w:b/>
         </w:rPr>
         <w:t xml:space="preserve">théorème de transfert</w:t>
       </w:r>
@@ -3229,19 +2995,21 @@
           </m:rPr>
           <m:t>r</m:t>
         </m:r>
-        <m:d>
-          <m:dPr>
-            <m:begChr m:val="("/>
-            <m:endChr m:val=")"/>
-            <m:sepChr m:val=""/>
-            <m:grow/>
-          </m:dPr>
-          <m:e>
-            <m:r>
-              <m:t>X</m:t>
-            </m:r>
-          </m:e>
-        </m:d>
+        <m:r>
+          <m:rPr>
+            <m:sty m:val="p"/>
+          </m:rPr>
+          <m:t>(</m:t>
+        </m:r>
+        <m:r>
+          <m:t>X</m:t>
+        </m:r>
+        <m:r>
+          <m:rPr>
+            <m:sty m:val="p"/>
+          </m:rPr>
+          <m:t>)</m:t>
+        </m:r>
       </m:oMath>
       <w:r>
         <w:t xml:space="preserve"> </w:t>
@@ -3256,8 +3024,8 @@
       </w:pPr>
       <w:r>
         <w:rPr>
+          <w:b/>
           <w:bCs/>
-          <w:b/>
         </w:rPr>
         <w:t xml:space="preserve">6.</w:t>
       </w:r>
@@ -3266,8 +3034,8 @@
       </w:r>
       <w:r>
         <w:rPr>
+          <w:i/>
           <w:iCs/>
-          <w:i/>
         </w:rPr>
         <w:t xml:space="preserve">(5 pts)</w:t>
       </w:r>
@@ -3292,24 +3060,26 @@
         </m:r>
         <m:r>
           <m:rPr>
-            <m:sty m:val="p"/>
             <m:scr m:val="script"/>
+            <m:sty m:val="p"/>
           </m:rPr>
           <m:t>E</m:t>
         </m:r>
-        <m:d>
-          <m:dPr>
-            <m:begChr m:val="("/>
-            <m:endChr m:val=")"/>
-            <m:sepChr m:val=""/>
-            <m:grow/>
-          </m:dPr>
-          <m:e>
-            <m:r>
-              <m:t>λ</m:t>
-            </m:r>
-          </m:e>
-        </m:d>
+        <m:r>
+          <m:rPr>
+            <m:sty m:val="p"/>
+          </m:rPr>
+          <m:t>(</m:t>
+        </m:r>
+        <m:r>
+          <m:t>λ</m:t>
+        </m:r>
+        <m:r>
+          <m:rPr>
+            <m:sty m:val="p"/>
+          </m:rPr>
+          <m:t>)</m:t>
+        </m:r>
       </m:oMath>
       <w:r>
         <w:t xml:space="preserve"> </w:t>
@@ -3336,28 +3106,30 @@
           <m:r>
             <m:t>P</m:t>
           </m:r>
-          <m:d>
-            <m:dPr>
-              <m:begChr m:val="("/>
-              <m:endChr m:val=")"/>
-              <m:sepChr m:val=""/>
-              <m:grow/>
-            </m:dPr>
-            <m:e>
-              <m:r>
-                <m:t>T</m:t>
-              </m:r>
-              <m:r>
-                <m:rPr>
-                  <m:sty m:val="p"/>
-                </m:rPr>
-                <m:t>&gt;</m:t>
-              </m:r>
-              <m:r>
-                <m:t>3</m:t>
-              </m:r>
-            </m:e>
-          </m:d>
+          <m:r>
+            <m:rPr>
+              <m:sty m:val="p"/>
+            </m:rPr>
+            <m:t>(</m:t>
+          </m:r>
+          <m:r>
+            <m:t>T</m:t>
+          </m:r>
+          <m:r>
+            <m:rPr>
+              <m:sty m:val="p"/>
+            </m:rPr>
+            <m:t>&gt;</m:t>
+          </m:r>
+          <m:r>
+            <m:t>3</m:t>
+          </m:r>
+          <m:r>
+            <m:rPr>
+              <m:sty m:val="p"/>
+            </m:rPr>
+            <m:t>)</m:t>
+          </m:r>
           <m:r>
             <m:rPr>
               <m:sty m:val="p"/>
@@ -3418,24 +3190,26 @@
       <m:oMath>
         <m:r>
           <m:rPr>
-            <m:sty m:val="p"/>
             <m:scr m:val="double-struck"/>
+            <m:sty m:val="p"/>
           </m:rPr>
           <m:t>E</m:t>
         </m:r>
-        <m:d>
-          <m:dPr>
-            <m:begChr m:val="("/>
-            <m:endChr m:val=")"/>
-            <m:sepChr m:val=""/>
-            <m:grow/>
-          </m:dPr>
-          <m:e>
-            <m:r>
-              <m:t>T</m:t>
-            </m:r>
-          </m:e>
-        </m:d>
+        <m:r>
+          <m:rPr>
+            <m:sty m:val="p"/>
+          </m:rPr>
+          <m:t>(</m:t>
+        </m:r>
+        <m:r>
+          <m:t>T</m:t>
+        </m:r>
+        <m:r>
+          <m:rPr>
+            <m:sty m:val="p"/>
+          </m:rPr>
+          <m:t>)</m:t>
+        </m:r>
       </m:oMath>
       <w:r>
         <w:t xml:space="preserve">, puis calculer</w:t>
@@ -3447,28 +3221,30 @@
         <m:r>
           <m:t>P</m:t>
         </m:r>
-        <m:d>
-          <m:dPr>
-            <m:begChr m:val="("/>
-            <m:endChr m:val=")"/>
-            <m:sepChr m:val=""/>
-            <m:grow/>
-          </m:dPr>
-          <m:e>
-            <m:r>
-              <m:t>T</m:t>
-            </m:r>
-            <m:r>
-              <m:rPr>
-                <m:sty m:val="p"/>
-              </m:rPr>
-              <m:t>&gt;</m:t>
-            </m:r>
-            <m:r>
-              <m:t>1</m:t>
-            </m:r>
-          </m:e>
-        </m:d>
+        <m:r>
+          <m:rPr>
+            <m:sty m:val="p"/>
+          </m:rPr>
+          <m:t>(</m:t>
+        </m:r>
+        <m:r>
+          <m:t>T</m:t>
+        </m:r>
+        <m:r>
+          <m:rPr>
+            <m:sty m:val="p"/>
+          </m:rPr>
+          <m:t>&gt;</m:t>
+        </m:r>
+        <m:r>
+          <m:t>1</m:t>
+        </m:r>
+        <m:r>
+          <m:rPr>
+            <m:sty m:val="p"/>
+          </m:rPr>
+          <m:t>)</m:t>
+        </m:r>
       </m:oMath>
       <w:r>
         <w:t xml:space="preserve">.</w:t>
@@ -3481,8 +3257,8 @@
         </w:pict>
       </w:r>
     </w:p>
-    <w:bookmarkEnd w:id="23"/>
-    <w:bookmarkStart w:id="27" w:name="exercice-3-loi-normale-35-points"/>
+    <w:bookmarkEnd w:id="12"/>
+    <w:bookmarkStart w:id="16" w:name="exercice-3-loi-normale-35-points"/>
     <w:p>
       <w:pPr>
         <w:pStyle w:val="Heading2"/>
@@ -3491,7 +3267,7 @@
         <w:t xml:space="preserve">Exercice 3 — Loi normale (35 points)</w:t>
       </w:r>
     </w:p>
-    <w:bookmarkStart w:id="24" w:name="X147d5ab53a3b74abaf5de7a75e890c9e933a797"/>
+    <w:bookmarkStart w:id="13" w:name="X147d5ab53a3b74abaf5de7a75e890c9e933a797"/>
     <w:p>
       <w:pPr>
         <w:pStyle w:val="Heading3"/>
@@ -3522,33 +3298,35 @@
         </m:r>
         <m:r>
           <m:rPr>
-            <m:sty m:val="p"/>
             <m:scr m:val="script"/>
+            <m:sty m:val="p"/>
           </m:rPr>
           <m:t>N</m:t>
         </m:r>
-        <m:d>
-          <m:dPr>
-            <m:begChr m:val="("/>
-            <m:endChr m:val=")"/>
-            <m:sepChr m:val=""/>
-            <m:grow/>
-          </m:dPr>
-          <m:e>
-            <m:r>
-              <m:t>0</m:t>
-            </m:r>
-            <m:r>
-              <m:rPr>
-                <m:sty m:val="p"/>
-              </m:rPr>
-              <m:t>,</m:t>
-            </m:r>
-            <m:r>
-              <m:t>1</m:t>
-            </m:r>
-          </m:e>
-        </m:d>
+        <m:r>
+          <m:rPr>
+            <m:sty m:val="p"/>
+          </m:rPr>
+          <m:t>(</m:t>
+        </m:r>
+        <m:r>
+          <m:t>0</m:t>
+        </m:r>
+        <m:r>
+          <m:rPr>
+            <m:sty m:val="p"/>
+          </m:rPr>
+          <m:t>,</m:t>
+        </m:r>
+        <m:r>
+          <m:t>1</m:t>
+        </m:r>
+        <m:r>
+          <m:rPr>
+            <m:sty m:val="p"/>
+          </m:rPr>
+          <m:t>)</m:t>
+        </m:r>
       </m:oMath>
       <w:r>
         <w:t xml:space="preserve">. On rappelle :</w:t>
@@ -3558,27 +3336,32 @@
       </w:r>
       <m:oMath>
         <m:r>
+          <m:rPr>
+            <m:sty m:val="p"/>
+          </m:rPr>
           <m:t>Φ</m:t>
         </m:r>
-        <m:d>
-          <m:dPr>
-            <m:begChr m:val="("/>
-            <m:endChr m:val=")"/>
-            <m:sepChr m:val=""/>
-            <m:grow/>
-          </m:dPr>
-          <m:e>
-            <m:r>
-              <m:rPr>
-                <m:sty m:val="p"/>
-              </m:rPr>
-              <m:t>−</m:t>
-            </m:r>
-            <m:r>
-              <m:t>x</m:t>
-            </m:r>
-          </m:e>
-        </m:d>
+        <m:r>
+          <m:rPr>
+            <m:sty m:val="p"/>
+          </m:rPr>
+          <m:t>(</m:t>
+        </m:r>
+        <m:r>
+          <m:rPr>
+            <m:sty m:val="p"/>
+          </m:rPr>
+          <m:t>−</m:t>
+        </m:r>
+        <m:r>
+          <m:t>x</m:t>
+        </m:r>
+        <m:r>
+          <m:rPr>
+            <m:sty m:val="p"/>
+          </m:rPr>
+          <m:t>)</m:t>
+        </m:r>
         <m:r>
           <m:rPr>
             <m:sty m:val="p"/>
@@ -3595,21 +3378,26 @@
           <m:t>−</m:t>
         </m:r>
         <m:r>
+          <m:rPr>
+            <m:sty m:val="p"/>
+          </m:rPr>
           <m:t>Φ</m:t>
         </m:r>
-        <m:d>
-          <m:dPr>
-            <m:begChr m:val="("/>
-            <m:endChr m:val=")"/>
-            <m:sepChr m:val=""/>
-            <m:grow/>
-          </m:dPr>
-          <m:e>
-            <m:r>
-              <m:t>x</m:t>
-            </m:r>
-          </m:e>
-        </m:d>
+        <m:r>
+          <m:rPr>
+            <m:sty m:val="p"/>
+          </m:rPr>
+          <m:t>(</m:t>
+        </m:r>
+        <m:r>
+          <m:t>x</m:t>
+        </m:r>
+        <m:r>
+          <m:rPr>
+            <m:sty m:val="p"/>
+          </m:rPr>
+          <m:t>)</m:t>
+        </m:r>
       </m:oMath>
       <w:r>
         <w:t xml:space="preserve"> </w:t>
@@ -3624,43 +3412,45 @@
         <m:r>
           <m:t>P</m:t>
         </m:r>
-        <m:d>
-          <m:dPr>
-            <m:begChr m:val="("/>
-            <m:endChr m:val=")"/>
-            <m:sepChr m:val=""/>
-            <m:grow/>
-          </m:dPr>
-          <m:e>
-            <m:r>
-              <m:rPr>
-                <m:sty m:val="p"/>
-              </m:rPr>
-              <m:t>−</m:t>
-            </m:r>
-            <m:r>
-              <m:t>a</m:t>
-            </m:r>
-            <m:r>
-              <m:rPr>
-                <m:sty m:val="p"/>
-              </m:rPr>
-              <m:t>≤</m:t>
-            </m:r>
-            <m:r>
-              <m:t>Z</m:t>
-            </m:r>
-            <m:r>
-              <m:rPr>
-                <m:sty m:val="p"/>
-              </m:rPr>
-              <m:t>≤</m:t>
-            </m:r>
-            <m:r>
-              <m:t>a</m:t>
-            </m:r>
-          </m:e>
-        </m:d>
+        <m:r>
+          <m:rPr>
+            <m:sty m:val="p"/>
+          </m:rPr>
+          <m:t>(</m:t>
+        </m:r>
+        <m:r>
+          <m:rPr>
+            <m:sty m:val="p"/>
+          </m:rPr>
+          <m:t>−</m:t>
+        </m:r>
+        <m:r>
+          <m:t>a</m:t>
+        </m:r>
+        <m:r>
+          <m:rPr>
+            <m:sty m:val="p"/>
+          </m:rPr>
+          <m:t>≤</m:t>
+        </m:r>
+        <m:r>
+          <m:t>Z</m:t>
+        </m:r>
+        <m:r>
+          <m:rPr>
+            <m:sty m:val="p"/>
+          </m:rPr>
+          <m:t>≤</m:t>
+        </m:r>
+        <m:r>
+          <m:t>a</m:t>
+        </m:r>
+        <m:r>
+          <m:rPr>
+            <m:sty m:val="p"/>
+          </m:rPr>
+          <m:t>)</m:t>
+        </m:r>
         <m:r>
           <m:rPr>
             <m:sty m:val="p"/>
@@ -3671,21 +3461,26 @@
           <m:t>2</m:t>
         </m:r>
         <m:r>
+          <m:rPr>
+            <m:sty m:val="p"/>
+          </m:rPr>
           <m:t>Φ</m:t>
         </m:r>
-        <m:d>
-          <m:dPr>
-            <m:begChr m:val="("/>
-            <m:endChr m:val=")"/>
-            <m:sepChr m:val=""/>
-            <m:grow/>
-          </m:dPr>
-          <m:e>
-            <m:r>
-              <m:t>a</m:t>
-            </m:r>
-          </m:e>
-        </m:d>
+        <m:r>
+          <m:rPr>
+            <m:sty m:val="p"/>
+          </m:rPr>
+          <m:t>(</m:t>
+        </m:r>
+        <m:r>
+          <m:t>a</m:t>
+        </m:r>
+        <m:r>
+          <m:rPr>
+            <m:sty m:val="p"/>
+          </m:rPr>
+          <m:t>)</m:t>
+        </m:r>
         <m:r>
           <m:rPr>
             <m:sty m:val="p"/>
@@ -3706,8 +3501,8 @@
       </w:pPr>
       <w:r>
         <w:rPr>
+          <w:b/>
           <w:bCs/>
-          <w:b/>
         </w:rPr>
         <w:t xml:space="preserve">1.</w:t>
       </w:r>
@@ -3716,8 +3511,8 @@
       </w:r>
       <w:r>
         <w:rPr>
+          <w:i/>
           <w:iCs/>
-          <w:i/>
         </w:rPr>
         <w:t xml:space="preserve">(6 pts)</w:t>
       </w:r>
@@ -3730,47 +3525,49 @@
     </w:p>
     <w:p>
       <w:pPr>
+        <w:pStyle w:val="Compact"/>
         <w:numPr>
           <w:ilvl w:val="0"/>
           <w:numId w:val="1002"/>
         </w:numPr>
-        <w:pStyle w:val="Compact"/>
       </w:pPr>
       <m:oMath>
         <m:r>
           <m:t>P</m:t>
         </m:r>
-        <m:d>
-          <m:dPr>
-            <m:begChr m:val="("/>
-            <m:endChr m:val=")"/>
-            <m:sepChr m:val=""/>
-            <m:grow/>
-          </m:dPr>
-          <m:e>
-            <m:r>
-              <m:t>Z</m:t>
-            </m:r>
-            <m:r>
-              <m:rPr>
-                <m:sty m:val="p"/>
-              </m:rPr>
-              <m:t>≤</m:t>
-            </m:r>
-            <m:r>
-              <m:t>1</m:t>
-            </m:r>
-            <m:r>
-              <m:rPr>
-                <m:sty m:val="p"/>
-              </m:rPr>
-              <m:t>,</m:t>
-            </m:r>
-            <m:r>
-              <m:t>96</m:t>
-            </m:r>
-          </m:e>
-        </m:d>
+        <m:r>
+          <m:rPr>
+            <m:sty m:val="p"/>
+          </m:rPr>
+          <m:t>(</m:t>
+        </m:r>
+        <m:r>
+          <m:t>Z</m:t>
+        </m:r>
+        <m:r>
+          <m:rPr>
+            <m:sty m:val="p"/>
+          </m:rPr>
+          <m:t>≤</m:t>
+        </m:r>
+        <m:r>
+          <m:t>1</m:t>
+        </m:r>
+        <m:r>
+          <m:rPr>
+            <m:sty m:val="p"/>
+          </m:rPr>
+          <m:t>,</m:t>
+        </m:r>
+        <m:r>
+          <m:t>96</m:t>
+        </m:r>
+        <m:r>
+          <m:rPr>
+            <m:sty m:val="p"/>
+          </m:rPr>
+          <m:t>)</m:t>
+        </m:r>
       </m:oMath>
       <w:r>
         <w:t xml:space="preserve">,</w:t>
@@ -3778,53 +3575,55 @@
     </w:p>
     <w:p>
       <w:pPr>
+        <w:pStyle w:val="Compact"/>
         <w:numPr>
           <w:ilvl w:val="0"/>
           <w:numId w:val="1002"/>
         </w:numPr>
-        <w:pStyle w:val="Compact"/>
       </w:pPr>
       <m:oMath>
         <m:r>
           <m:t>P</m:t>
         </m:r>
-        <m:d>
-          <m:dPr>
-            <m:begChr m:val="("/>
-            <m:endChr m:val=")"/>
-            <m:sepChr m:val=""/>
-            <m:grow/>
-          </m:dPr>
-          <m:e>
-            <m:r>
-              <m:t>Z</m:t>
-            </m:r>
-            <m:r>
-              <m:rPr>
-                <m:sty m:val="p"/>
-              </m:rPr>
-              <m:t>&gt;</m:t>
-            </m:r>
-            <m:r>
-              <m:rPr>
-                <m:sty m:val="p"/>
-              </m:rPr>
-              <m:t>−</m:t>
-            </m:r>
-            <m:r>
-              <m:t>0</m:t>
-            </m:r>
-            <m:r>
-              <m:rPr>
-                <m:sty m:val="p"/>
-              </m:rPr>
-              <m:t>,</m:t>
-            </m:r>
-            <m:r>
-              <m:t>67</m:t>
-            </m:r>
-          </m:e>
-        </m:d>
+        <m:r>
+          <m:rPr>
+            <m:sty m:val="p"/>
+          </m:rPr>
+          <m:t>(</m:t>
+        </m:r>
+        <m:r>
+          <m:t>Z</m:t>
+        </m:r>
+        <m:r>
+          <m:rPr>
+            <m:sty m:val="p"/>
+          </m:rPr>
+          <m:t>&gt;</m:t>
+        </m:r>
+        <m:r>
+          <m:rPr>
+            <m:sty m:val="p"/>
+          </m:rPr>
+          <m:t>−</m:t>
+        </m:r>
+        <m:r>
+          <m:t>0</m:t>
+        </m:r>
+        <m:r>
+          <m:rPr>
+            <m:sty m:val="p"/>
+          </m:rPr>
+          <m:t>,</m:t>
+        </m:r>
+        <m:r>
+          <m:t>67</m:t>
+        </m:r>
+        <m:r>
+          <m:rPr>
+            <m:sty m:val="p"/>
+          </m:rPr>
+          <m:t>)</m:t>
+        </m:r>
       </m:oMath>
       <w:r>
         <w:t xml:space="preserve">,</w:t>
@@ -3832,71 +3631,73 @@
     </w:p>
     <w:p>
       <w:pPr>
+        <w:pStyle w:val="Compact"/>
         <w:numPr>
           <w:ilvl w:val="0"/>
           <w:numId w:val="1002"/>
         </w:numPr>
-        <w:pStyle w:val="Compact"/>
       </w:pPr>
       <m:oMath>
         <m:r>
           <m:t>P</m:t>
         </m:r>
-        <m:d>
-          <m:dPr>
-            <m:begChr m:val="("/>
-            <m:endChr m:val=")"/>
-            <m:sepChr m:val=""/>
-            <m:grow/>
-          </m:dPr>
-          <m:e>
-            <m:r>
-              <m:rPr>
-                <m:sty m:val="p"/>
-              </m:rPr>
-              <m:t>−</m:t>
-            </m:r>
-            <m:r>
-              <m:t>1</m:t>
-            </m:r>
-            <m:r>
-              <m:rPr>
-                <m:sty m:val="p"/>
-              </m:rPr>
-              <m:t>,</m:t>
-            </m:r>
-            <m:r>
-              <m:t>50</m:t>
-            </m:r>
-            <m:r>
-              <m:rPr>
-                <m:sty m:val="p"/>
-              </m:rPr>
-              <m:t>≤</m:t>
-            </m:r>
-            <m:r>
-              <m:t>Z</m:t>
-            </m:r>
-            <m:r>
-              <m:rPr>
-                <m:sty m:val="p"/>
-              </m:rPr>
-              <m:t>≤</m:t>
-            </m:r>
-            <m:r>
-              <m:t>2</m:t>
-            </m:r>
-            <m:r>
-              <m:rPr>
-                <m:sty m:val="p"/>
-              </m:rPr>
-              <m:t>,</m:t>
-            </m:r>
-            <m:r>
-              <m:t>33</m:t>
-            </m:r>
-          </m:e>
-        </m:d>
+        <m:r>
+          <m:rPr>
+            <m:sty m:val="p"/>
+          </m:rPr>
+          <m:t>(</m:t>
+        </m:r>
+        <m:r>
+          <m:rPr>
+            <m:sty m:val="p"/>
+          </m:rPr>
+          <m:t>−</m:t>
+        </m:r>
+        <m:r>
+          <m:t>1</m:t>
+        </m:r>
+        <m:r>
+          <m:rPr>
+            <m:sty m:val="p"/>
+          </m:rPr>
+          <m:t>,</m:t>
+        </m:r>
+        <m:r>
+          <m:t>50</m:t>
+        </m:r>
+        <m:r>
+          <m:rPr>
+            <m:sty m:val="p"/>
+          </m:rPr>
+          <m:t>≤</m:t>
+        </m:r>
+        <m:r>
+          <m:t>Z</m:t>
+        </m:r>
+        <m:r>
+          <m:rPr>
+            <m:sty m:val="p"/>
+          </m:rPr>
+          <m:t>≤</m:t>
+        </m:r>
+        <m:r>
+          <m:t>2</m:t>
+        </m:r>
+        <m:r>
+          <m:rPr>
+            <m:sty m:val="p"/>
+          </m:rPr>
+          <m:t>,</m:t>
+        </m:r>
+        <m:r>
+          <m:t>33</m:t>
+        </m:r>
+        <m:r>
+          <m:rPr>
+            <m:sty m:val="p"/>
+          </m:rPr>
+          <m:t>)</m:t>
+        </m:r>
       </m:oMath>
       <w:r>
         <w:t xml:space="preserve">.</w:t>
@@ -3908,8 +3709,8 @@
       </w:pPr>
       <w:r>
         <w:rPr>
+          <w:b/>
           <w:bCs/>
-          <w:b/>
         </w:rPr>
         <w:t xml:space="preserve">2.</w:t>
       </w:r>
@@ -3918,8 +3719,8 @@
       </w:r>
       <w:r>
         <w:rPr>
+          <w:i/>
           <w:iCs/>
-          <w:i/>
         </w:rPr>
         <w:t xml:space="preserve">(4 pts)</w:t>
       </w:r>
@@ -3932,11 +3733,11 @@
     </w:p>
     <w:p>
       <w:pPr>
+        <w:pStyle w:val="Compact"/>
         <w:numPr>
           <w:ilvl w:val="0"/>
           <w:numId w:val="1003"/>
         </w:numPr>
-        <w:pStyle w:val="Compact"/>
       </w:pPr>
       <m:oMath>
         <m:sSub>
@@ -3965,37 +3766,39 @@
         <m:r>
           <m:t>P</m:t>
         </m:r>
-        <m:d>
-          <m:dPr>
-            <m:begChr m:val="("/>
-            <m:endChr m:val=")"/>
-            <m:sepChr m:val=""/>
-            <m:grow/>
-          </m:dPr>
+        <m:r>
+          <m:rPr>
+            <m:sty m:val="p"/>
+          </m:rPr>
+          <m:t>(</m:t>
+        </m:r>
+        <m:r>
+          <m:t>Z</m:t>
+        </m:r>
+        <m:r>
+          <m:rPr>
+            <m:sty m:val="p"/>
+          </m:rPr>
+          <m:t>≤</m:t>
+        </m:r>
+        <m:sSub>
           <m:e>
             <m:r>
-              <m:t>Z</m:t>
-            </m:r>
-            <m:r>
-              <m:rPr>
-                <m:sty m:val="p"/>
-              </m:rPr>
-              <m:t>≤</m:t>
-            </m:r>
-            <m:sSub>
-              <m:e>
-                <m:r>
-                  <m:t>z</m:t>
-                </m:r>
-              </m:e>
-              <m:sub>
-                <m:r>
-                  <m:t>0</m:t>
-                </m:r>
-              </m:sub>
-            </m:sSub>
+              <m:t>z</m:t>
+            </m:r>
           </m:e>
-        </m:d>
+          <m:sub>
+            <m:r>
+              <m:t>0</m:t>
+            </m:r>
+          </m:sub>
+        </m:sSub>
+        <m:r>
+          <m:rPr>
+            <m:sty m:val="p"/>
+          </m:rPr>
+          <m:t>)</m:t>
+        </m:r>
         <m:r>
           <m:rPr>
             <m:sty m:val="p"/>
@@ -4021,11 +3824,11 @@
     </w:p>
     <w:p>
       <w:pPr>
+        <w:pStyle w:val="Compact"/>
         <w:numPr>
           <w:ilvl w:val="0"/>
           <w:numId w:val="1003"/>
         </w:numPr>
-        <w:pStyle w:val="Compact"/>
       </w:pPr>
       <m:oMath>
         <m:r>
@@ -4054,38 +3857,42 @@
         <m:r>
           <m:t>P</m:t>
         </m:r>
-        <m:d>
-          <m:dPr>
-            <m:begChr m:val="("/>
-            <m:endChr m:val=")"/>
-            <m:sepChr m:val=""/>
-            <m:grow/>
-          </m:dPr>
-          <m:e>
-            <m:d>
-              <m:dPr>
-                <m:begChr m:val="|"/>
-                <m:endChr m:val="|"/>
-                <m:sepChr m:val=""/>
-                <m:grow/>
-              </m:dPr>
-              <m:e>
-                <m:r>
-                  <m:t>Z</m:t>
-                </m:r>
-              </m:e>
-            </m:d>
-            <m:r>
-              <m:rPr>
-                <m:sty m:val="p"/>
-              </m:rPr>
-              <m:t>≤</m:t>
-            </m:r>
-            <m:r>
-              <m:t>d</m:t>
-            </m:r>
-          </m:e>
-        </m:d>
+        <m:r>
+          <m:rPr>
+            <m:sty m:val="p"/>
+          </m:rPr>
+          <m:t>(</m:t>
+        </m:r>
+        <m:r>
+          <m:rPr>
+            <m:sty m:val="p"/>
+          </m:rPr>
+          <m:t>|</m:t>
+        </m:r>
+        <m:r>
+          <m:t>Z</m:t>
+        </m:r>
+        <m:r>
+          <m:rPr>
+            <m:sty m:val="p"/>
+          </m:rPr>
+          <m:t>|</m:t>
+        </m:r>
+        <m:r>
+          <m:rPr>
+            <m:sty m:val="p"/>
+          </m:rPr>
+          <m:t>≤</m:t>
+        </m:r>
+        <m:r>
+          <m:t>d</m:t>
+        </m:r>
+        <m:r>
+          <m:rPr>
+            <m:sty m:val="p"/>
+          </m:rPr>
+          <m:t>)</m:t>
+        </m:r>
         <m:r>
           <m:rPr>
             <m:sty m:val="p"/>
@@ -4116,8 +3923,8 @@
         </w:pict>
       </w:r>
     </w:p>
-    <w:bookmarkEnd w:id="24"/>
-    <w:bookmarkStart w:id="25" w:name="partie-b-loi-normale-générale-17-points"/>
+    <w:bookmarkEnd w:id="13"/>
+    <w:bookmarkStart w:id="14" w:name="partie-b-loi-normale-générale-17-points"/>
     <w:p>
       <w:pPr>
         <w:pStyle w:val="Heading3"/>
@@ -4139,36 +3946,38 @@
       <m:oMath>
         <m:r>
           <m:rPr>
-            <m:sty m:val="p"/>
             <m:scr m:val="script"/>
+            <m:sty m:val="p"/>
           </m:rPr>
           <m:t>N</m:t>
         </m:r>
-        <m:d>
-          <m:dPr>
-            <m:begChr m:val="("/>
-            <m:endChr m:val=")"/>
-            <m:sepChr m:val=""/>
-            <m:grow/>
-          </m:dPr>
-          <m:e>
-            <m:r>
-              <m:t>250</m:t>
-            </m:r>
-            <m:r>
-              <m:rPr>
-                <m:sty m:val="p"/>
-              </m:rPr>
-              <m:t>,</m:t>
-            </m:r>
-            <m:r>
-              <m:t> </m:t>
-            </m:r>
-            <m:r>
-              <m:t>100</m:t>
-            </m:r>
-          </m:e>
-        </m:d>
+        <m:r>
+          <m:rPr>
+            <m:sty m:val="p"/>
+          </m:rPr>
+          <m:t>(</m:t>
+        </m:r>
+        <m:r>
+          <m:t>250</m:t>
+        </m:r>
+        <m:r>
+          <m:rPr>
+            <m:sty m:val="p"/>
+          </m:rPr>
+          <m:t>,</m:t>
+        </m:r>
+        <m:r>
+          <m:t> </m:t>
+        </m:r>
+        <m:r>
+          <m:t>100</m:t>
+        </m:r>
+        <m:r>
+          <m:rPr>
+            <m:sty m:val="p"/>
+          </m:rPr>
+          <m:t>)</m:t>
+        </m:r>
       </m:oMath>
       <w:r>
         <w:t xml:space="preserve">.</w:t>
@@ -4180,8 +3989,8 @@
       </w:pPr>
       <w:r>
         <w:rPr>
+          <w:b/>
           <w:bCs/>
-          <w:b/>
         </w:rPr>
         <w:t xml:space="preserve">3.</w:t>
       </w:r>
@@ -4190,8 +3999,8 @@
       </w:r>
       <w:r>
         <w:rPr>
+          <w:i/>
           <w:iCs/>
-          <w:i/>
         </w:rPr>
         <w:t xml:space="preserve">(1 pt)</w:t>
       </w:r>
@@ -4207,24 +4016,26 @@
       <m:oMath>
         <m:r>
           <m:rPr>
-            <m:sty m:val="p"/>
             <m:scr m:val="double-struck"/>
+            <m:sty m:val="p"/>
           </m:rPr>
           <m:t>E</m:t>
         </m:r>
-        <m:d>
-          <m:dPr>
-            <m:begChr m:val="("/>
-            <m:endChr m:val=")"/>
-            <m:sepChr m:val=""/>
-            <m:grow/>
-          </m:dPr>
-          <m:e>
-            <m:r>
-              <m:t>X</m:t>
-            </m:r>
-          </m:e>
-        </m:d>
+        <m:r>
+          <m:rPr>
+            <m:sty m:val="p"/>
+          </m:rPr>
+          <m:t>(</m:t>
+        </m:r>
+        <m:r>
+          <m:t>X</m:t>
+        </m:r>
+        <m:r>
+          <m:rPr>
+            <m:sty m:val="p"/>
+          </m:rPr>
+          <m:t>)</m:t>
+        </m:r>
       </m:oMath>
       <w:r>
         <w:t xml:space="preserve"> </w:t>
@@ -4259,8 +4070,8 @@
       </w:pPr>
       <w:r>
         <w:rPr>
+          <w:b/>
           <w:bCs/>
-          <w:b/>
         </w:rPr>
         <w:t xml:space="preserve">4.</w:t>
       </w:r>
@@ -4269,8 +4080,8 @@
       </w:r>
       <w:r>
         <w:rPr>
+          <w:i/>
           <w:iCs/>
-          <w:i/>
         </w:rPr>
         <w:t xml:space="preserve">(8 pts)</w:t>
       </w:r>
@@ -4283,38 +4094,40 @@
     </w:p>
     <w:p>
       <w:pPr>
+        <w:pStyle w:val="Compact"/>
         <w:numPr>
           <w:ilvl w:val="0"/>
           <w:numId w:val="1004"/>
         </w:numPr>
-        <w:pStyle w:val="Compact"/>
       </w:pPr>
       <m:oMath>
         <m:r>
           <m:t>P</m:t>
         </m:r>
-        <m:d>
-          <m:dPr>
-            <m:begChr m:val="("/>
-            <m:endChr m:val=")"/>
-            <m:sepChr m:val=""/>
-            <m:grow/>
-          </m:dPr>
-          <m:e>
-            <m:r>
-              <m:t>X</m:t>
-            </m:r>
-            <m:r>
-              <m:rPr>
-                <m:sty m:val="p"/>
-              </m:rPr>
-              <m:t>≤</m:t>
-            </m:r>
-            <m:r>
-              <m:t>265</m:t>
-            </m:r>
-          </m:e>
-        </m:d>
+        <m:r>
+          <m:rPr>
+            <m:sty m:val="p"/>
+          </m:rPr>
+          <m:t>(</m:t>
+        </m:r>
+        <m:r>
+          <m:t>X</m:t>
+        </m:r>
+        <m:r>
+          <m:rPr>
+            <m:sty m:val="p"/>
+          </m:rPr>
+          <m:t>≤</m:t>
+        </m:r>
+        <m:r>
+          <m:t>265</m:t>
+        </m:r>
+        <m:r>
+          <m:rPr>
+            <m:sty m:val="p"/>
+          </m:rPr>
+          <m:t>)</m:t>
+        </m:r>
       </m:oMath>
       <w:r>
         <w:t xml:space="preserve">,</w:t>
@@ -4322,47 +4135,49 @@
     </w:p>
     <w:p>
       <w:pPr>
+        <w:pStyle w:val="Compact"/>
         <w:numPr>
           <w:ilvl w:val="0"/>
           <w:numId w:val="1004"/>
         </w:numPr>
-        <w:pStyle w:val="Compact"/>
       </w:pPr>
       <m:oMath>
         <m:r>
           <m:t>P</m:t>
         </m:r>
-        <m:d>
-          <m:dPr>
-            <m:begChr m:val="("/>
-            <m:endChr m:val=")"/>
-            <m:sepChr m:val=""/>
-            <m:grow/>
-          </m:dPr>
-          <m:e>
-            <m:r>
-              <m:t>235</m:t>
-            </m:r>
-            <m:r>
-              <m:rPr>
-                <m:sty m:val="p"/>
-              </m:rPr>
-              <m:t>≤</m:t>
-            </m:r>
-            <m:r>
-              <m:t>X</m:t>
-            </m:r>
-            <m:r>
-              <m:rPr>
-                <m:sty m:val="p"/>
-              </m:rPr>
-              <m:t>≤</m:t>
-            </m:r>
-            <m:r>
-              <m:t>260</m:t>
-            </m:r>
-          </m:e>
-        </m:d>
+        <m:r>
+          <m:rPr>
+            <m:sty m:val="p"/>
+          </m:rPr>
+          <m:t>(</m:t>
+        </m:r>
+        <m:r>
+          <m:t>235</m:t>
+        </m:r>
+        <m:r>
+          <m:rPr>
+            <m:sty m:val="p"/>
+          </m:rPr>
+          <m:t>≤</m:t>
+        </m:r>
+        <m:r>
+          <m:t>X</m:t>
+        </m:r>
+        <m:r>
+          <m:rPr>
+            <m:sty m:val="p"/>
+          </m:rPr>
+          <m:t>≤</m:t>
+        </m:r>
+        <m:r>
+          <m:t>260</m:t>
+        </m:r>
+        <m:r>
+          <m:rPr>
+            <m:sty m:val="p"/>
+          </m:rPr>
+          <m:t>)</m:t>
+        </m:r>
       </m:oMath>
       <w:r>
         <w:t xml:space="preserve">.</w:t>
@@ -4396,28 +4211,30 @@
         <m:r>
           <m:t>P</m:t>
         </m:r>
-        <m:d>
-          <m:dPr>
-            <m:begChr m:val="("/>
-            <m:endChr m:val=")"/>
-            <m:sepChr m:val=""/>
-            <m:grow/>
-          </m:dPr>
-          <m:e>
-            <m:r>
-              <m:t>X</m:t>
-            </m:r>
-            <m:r>
-              <m:rPr>
-                <m:sty m:val="p"/>
-              </m:rPr>
-              <m:t>&gt;</m:t>
-            </m:r>
-            <m:r>
-              <m:t>s</m:t>
-            </m:r>
-          </m:e>
-        </m:d>
+        <m:r>
+          <m:rPr>
+            <m:sty m:val="p"/>
+          </m:rPr>
+          <m:t>(</m:t>
+        </m:r>
+        <m:r>
+          <m:t>X</m:t>
+        </m:r>
+        <m:r>
+          <m:rPr>
+            <m:sty m:val="p"/>
+          </m:rPr>
+          <m:t>&gt;</m:t>
+        </m:r>
+        <m:r>
+          <m:t>s</m:t>
+        </m:r>
+        <m:r>
+          <m:rPr>
+            <m:sty m:val="p"/>
+          </m:rPr>
+          <m:t>)</m:t>
+        </m:r>
         <m:r>
           <m:rPr>
             <m:sty m:val="p"/>
@@ -4447,8 +4264,8 @@
       </w:pPr>
       <w:r>
         <w:rPr>
+          <w:b/>
           <w:bCs/>
-          <w:b/>
         </w:rPr>
         <w:t xml:space="preserve">5.</w:t>
       </w:r>
@@ -4457,8 +4274,8 @@
       </w:r>
       <w:r>
         <w:rPr>
+          <w:i/>
           <w:iCs/>
-          <w:i/>
         </w:rPr>
         <w:t xml:space="preserve">(8 pts)</w:t>
       </w:r>
@@ -4580,36 +4397,38 @@
       <m:oMath>
         <m:r>
           <m:rPr>
-            <m:sty m:val="p"/>
             <m:scr m:val="script"/>
+            <m:sty m:val="p"/>
           </m:rPr>
           <m:t>N</m:t>
         </m:r>
-        <m:d>
-          <m:dPr>
-            <m:begChr m:val="("/>
-            <m:endChr m:val=")"/>
-            <m:sepChr m:val=""/>
-            <m:grow/>
-          </m:dPr>
-          <m:e>
-            <m:r>
-              <m:t>250</m:t>
-            </m:r>
-            <m:r>
-              <m:rPr>
-                <m:sty m:val="p"/>
-              </m:rPr>
-              <m:t>,</m:t>
-            </m:r>
-            <m:r>
-              <m:t> </m:t>
-            </m:r>
-            <m:r>
-              <m:t>100</m:t>
-            </m:r>
-          </m:e>
-        </m:d>
+        <m:r>
+          <m:rPr>
+            <m:sty m:val="p"/>
+          </m:rPr>
+          <m:t>(</m:t>
+        </m:r>
+        <m:r>
+          <m:t>250</m:t>
+        </m:r>
+        <m:r>
+          <m:rPr>
+            <m:sty m:val="p"/>
+          </m:rPr>
+          <m:t>,</m:t>
+        </m:r>
+        <m:r>
+          <m:t> </m:t>
+        </m:r>
+        <m:r>
+          <m:t>100</m:t>
+        </m:r>
+        <m:r>
+          <m:rPr>
+            <m:sty m:val="p"/>
+          </m:rPr>
+          <m:t>)</m:t>
+        </m:r>
       </m:oMath>
       <w:r>
         <w:t xml:space="preserve">. On note</w:t>
@@ -4709,11 +4528,11 @@
     </w:p>
     <w:p>
       <w:pPr>
+        <w:pStyle w:val="Compact"/>
         <w:numPr>
           <w:ilvl w:val="0"/>
           <w:numId w:val="1005"/>
         </w:numPr>
-        <w:pStyle w:val="Compact"/>
       </w:pPr>
       <w:r>
         <w:t xml:space="preserve">Donner la loi de</w:t>
@@ -4735,11 +4554,11 @@
     </w:p>
     <w:p>
       <w:pPr>
+        <w:pStyle w:val="Compact"/>
         <w:numPr>
           <w:ilvl w:val="0"/>
           <w:numId w:val="1005"/>
         </w:numPr>
-        <w:pStyle w:val="Compact"/>
       </w:pPr>
       <w:r>
         <w:t xml:space="preserve">Calculer</w:t>
@@ -4751,28 +4570,30 @@
         <m:r>
           <m:t>P</m:t>
         </m:r>
-        <m:d>
-          <m:dPr>
-            <m:begChr m:val="("/>
-            <m:endChr m:val=")"/>
-            <m:sepChr m:val=""/>
-            <m:grow/>
-          </m:dPr>
-          <m:e>
-            <m:r>
-              <m:t>S</m:t>
-            </m:r>
-            <m:r>
-              <m:rPr>
-                <m:sty m:val="p"/>
-              </m:rPr>
-              <m:t>&gt;</m:t>
-            </m:r>
-            <m:r>
-              <m:t>1030</m:t>
-            </m:r>
-          </m:e>
-        </m:d>
+        <m:r>
+          <m:rPr>
+            <m:sty m:val="p"/>
+          </m:rPr>
+          <m:t>(</m:t>
+        </m:r>
+        <m:r>
+          <m:t>S</m:t>
+        </m:r>
+        <m:r>
+          <m:rPr>
+            <m:sty m:val="p"/>
+          </m:rPr>
+          <m:t>&gt;</m:t>
+        </m:r>
+        <m:r>
+          <m:t>1030</m:t>
+        </m:r>
+        <m:r>
+          <m:rPr>
+            <m:sty m:val="p"/>
+          </m:rPr>
+          <m:t>)</m:t>
+        </m:r>
       </m:oMath>
       <w:r>
         <w:t xml:space="preserve">.</w:t>
@@ -4785,8 +4606,8 @@
         </w:pict>
       </w:r>
     </w:p>
-    <w:bookmarkEnd w:id="25"/>
-    <w:bookmarkStart w:id="26" w:name="Xf0ce554300671a44940235467ca45c162c81504"/>
+    <w:bookmarkEnd w:id="14"/>
+    <w:bookmarkStart w:id="15" w:name="Xf0ce554300671a44940235467ca45c162c81504"/>
     <w:p>
       <w:pPr>
         <w:pStyle w:val="Heading3"/>
@@ -4808,42 +4629,44 @@
       <m:oMath>
         <m:r>
           <m:rPr>
-            <m:sty m:val="p"/>
             <m:scr m:val="script"/>
+            <m:sty m:val="p"/>
           </m:rPr>
           <m:t>N</m:t>
         </m:r>
-        <m:d>
-          <m:dPr>
-            <m:begChr m:val="("/>
-            <m:endChr m:val=")"/>
-            <m:sepChr m:val=""/>
-            <m:grow/>
-          </m:dPr>
+        <m:r>
+          <m:rPr>
+            <m:sty m:val="p"/>
+          </m:rPr>
+          <m:t>(</m:t>
+        </m:r>
+        <m:r>
+          <m:t>m</m:t>
+        </m:r>
+        <m:r>
+          <m:rPr>
+            <m:sty m:val="p"/>
+          </m:rPr>
+          <m:t>,</m:t>
+        </m:r>
+        <m:sSup>
           <m:e>
             <m:r>
-              <m:t>m</m:t>
-            </m:r>
-            <m:r>
-              <m:rPr>
-                <m:sty m:val="p"/>
-              </m:rPr>
-              <m:t>,</m:t>
-            </m:r>
-            <m:sSup>
-              <m:e>
-                <m:r>
-                  <m:t>σ</m:t>
-                </m:r>
-              </m:e>
-              <m:sup>
-                <m:r>
-                  <m:t>2</m:t>
-                </m:r>
-              </m:sup>
-            </m:sSup>
+              <m:t>σ</m:t>
+            </m:r>
           </m:e>
-        </m:d>
+          <m:sup>
+            <m:r>
+              <m:t>2</m:t>
+            </m:r>
+          </m:sup>
+        </m:sSup>
+        <m:r>
+          <m:rPr>
+            <m:sty m:val="p"/>
+          </m:rPr>
+          <m:t>)</m:t>
+        </m:r>
       </m:oMath>
       <w:r>
         <w:t xml:space="preserve">. On sait que :</w:t>
@@ -4851,11 +4674,11 @@
     </w:p>
     <w:p>
       <w:pPr>
+        <w:pStyle w:val="Compact"/>
         <w:numPr>
           <w:ilvl w:val="0"/>
           <w:numId w:val="1006"/>
         </w:numPr>
-        <w:pStyle w:val="Compact"/>
       </w:pPr>
       <w:r>
         <w:t xml:space="preserve">84,13 % des composants ont une durée de vie inférieure à</w:t>
@@ -4865,8 +4688,8 @@
       </w:r>
       <w:r>
         <w:rPr>
+          <w:b/>
           <w:bCs/>
-          <w:b/>
         </w:rPr>
         <w:t xml:space="preserve">540 heures</w:t>
       </w:r>
@@ -4876,11 +4699,11 @@
     </w:p>
     <w:p>
       <w:pPr>
+        <w:pStyle w:val="Compact"/>
         <w:numPr>
           <w:ilvl w:val="0"/>
           <w:numId w:val="1006"/>
         </w:numPr>
-        <w:pStyle w:val="Compact"/>
       </w:pPr>
       <w:r>
         <w:t xml:space="preserve">97,72 % des composants ont une durée de vie inférieure à</w:t>
@@ -4890,8 +4713,8 @@
       </w:r>
       <w:r>
         <w:rPr>
+          <w:b/>
           <w:bCs/>
-          <w:b/>
         </w:rPr>
         <w:t xml:space="preserve">560 heures</w:t>
       </w:r>
@@ -4905,8 +4728,8 @@
       </w:pPr>
       <w:r>
         <w:rPr>
+          <w:b/>
           <w:bCs/>
-          <w:b/>
         </w:rPr>
         <w:t xml:space="preserve">6.</w:t>
       </w:r>
@@ -4915,8 +4738,8 @@
       </w:r>
       <w:r>
         <w:rPr>
+          <w:i/>
           <w:iCs/>
-          <w:i/>
         </w:rPr>
         <w:t xml:space="preserve">(8 pts)</w:t>
       </w:r>
@@ -4931,6 +4754,9 @@
       </w:r>
       <m:oMath>
         <m:r>
+          <m:rPr>
+            <m:sty m:val="p"/>
+          </m:rPr>
           <m:t>Φ</m:t>
         </m:r>
       </m:oMath>
@@ -4994,9 +4820,13 @@
         <w:t xml:space="preserve">.</w:t>
       </w:r>
     </w:p>
-    <w:bookmarkEnd w:id="26"/>
-    <w:bookmarkEnd w:id="27"/>
-    <w:sectPr/>
+    <w:bookmarkEnd w:id="15"/>
+    <w:bookmarkEnd w:id="16"/>
+    <w:sectPr>
+      <w:footnotePr>
+        <w:numRestart w:val="eachSect"/>
+      </w:footnotePr>
+    </w:sectPr>
   </w:body>
 </w:document>
 </file>
@@ -5027,14 +4857,14 @@
 <file path=word/numbering.xml><?xml version="1.0" encoding="utf-8"?>
 <w:numbering xmlns:w="http://schemas.openxmlformats.org/wordprocessingml/2006/main">
   <w:abstractNum w:abstractNumId="990">
-    <w:nsid w:val="A990"/>
+    <w:nsid w:val="0000A990"/>
     <w:multiLevelType w:val="multilevel"/>
     <w:lvl w:ilvl="0">
       <w:numFmt w:val="bullet"/>
       <w:lvlText w:val=" "/>
       <w:lvlJc w:val="left"/>
       <w:pPr>
-        <w:ind w:left="720" w:hanging="480"/>
+        <w:ind w:left="720" w:hanging="360"/>
       </w:pPr>
     </w:lvl>
     <w:lvl w:ilvl="1">
@@ -5042,7 +4872,7 @@
       <w:lvlText w:val=" "/>
       <w:lvlJc w:val="left"/>
       <w:pPr>
-        <w:ind w:left="1440" w:hanging="480"/>
+        <w:ind w:left="1440" w:hanging="360"/>
       </w:pPr>
     </w:lvl>
     <w:lvl w:ilvl="2">
@@ -5050,7 +4880,7 @@
       <w:lvlText w:val=" "/>
       <w:lvlJc w:val="left"/>
       <w:pPr>
-        <w:ind w:left="2160" w:hanging="480"/>
+        <w:ind w:left="2160" w:hanging="360"/>
       </w:pPr>
     </w:lvl>
     <w:lvl w:ilvl="3">
@@ -5058,7 +4888,7 @@
       <w:lvlText w:val=" "/>
       <w:lvlJc w:val="left"/>
       <w:pPr>
-        <w:ind w:left="2880" w:hanging="480"/>
+        <w:ind w:left="2880" w:hanging="360"/>
       </w:pPr>
     </w:lvl>
     <w:lvl w:ilvl="4">
@@ -5066,7 +4896,7 @@
       <w:lvlText w:val=" "/>
       <w:lvlJc w:val="left"/>
       <w:pPr>
-        <w:ind w:left="3600" w:hanging="480"/>
+        <w:ind w:left="3600" w:hanging="360"/>
       </w:pPr>
     </w:lvl>
     <w:lvl w:ilvl="5">
@@ -5074,7 +4904,7 @@
       <w:lvlText w:val=" "/>
       <w:lvlJc w:val="left"/>
       <w:pPr>
-        <w:ind w:left="4320" w:hanging="480"/>
+        <w:ind w:left="4320" w:hanging="360"/>
       </w:pPr>
     </w:lvl>
     <w:lvl w:ilvl="6">
@@ -5082,7 +4912,7 @@
       <w:lvlText w:val=" "/>
       <w:lvlJc w:val="left"/>
       <w:pPr>
-        <w:ind w:left="5040" w:hanging="480"/>
+        <w:ind w:left="5040" w:hanging="360"/>
       </w:pPr>
     </w:lvl>
     <w:lvl w:ilvl="7">
@@ -5090,7 +4920,7 @@
       <w:lvlText w:val=" "/>
       <w:lvlJc w:val="left"/>
       <w:pPr>
-        <w:ind w:left="5760" w:hanging="480"/>
+        <w:ind w:left="5760" w:hanging="360"/>
       </w:pPr>
     </w:lvl>
     <w:lvl w:ilvl="8">
@@ -5098,84 +4928,111 @@
       <w:lvlText w:val=" "/>
       <w:lvlJc w:val="left"/>
       <w:pPr>
-        <w:ind w:left="6480" w:hanging="480"/>
+        <w:ind w:left="6480" w:hanging="360"/>
       </w:pPr>
     </w:lvl>
   </w:abstractNum>
   <w:abstractNum w:abstractNumId="991">
-    <w:nsid w:val="A991"/>
+    <w:nsid w:val="0000A991"/>
     <w:multiLevelType w:val="multilevel"/>
     <w:lvl w:ilvl="0">
       <w:numFmt w:val="bullet"/>
-      <w:lvlText w:val="•"/>
+      <w:lvlText w:val=""/>
       <w:lvlJc w:val="left"/>
       <w:pPr>
-        <w:ind w:left="720" w:hanging="480"/>
-      </w:pPr>
+        <w:ind w:left="720" w:hanging="360"/>
+      </w:pPr>
+      <w:rPr>
+        <w:rFonts w:ascii="Symbol" w:hAnsi="Symbol" w:cs="Symbol" w:hint="default"/>
+      </w:rPr>
     </w:lvl>
     <w:lvl w:ilvl="1">
       <w:numFmt w:val="bullet"/>
-      <w:lvlText w:val="–"/>
+      <w:lvlText w:val="o"/>
       <w:lvlJc w:val="left"/>
       <w:pPr>
-        <w:ind w:left="1440" w:hanging="480"/>
-      </w:pPr>
+        <w:ind w:left="1440" w:hanging="360"/>
+      </w:pPr>
+      <w:rPr>
+        <w:rFonts w:ascii="Courier New" w:hAnsi="Courier New" w:cs="Courier New" w:hint="default"/>
+      </w:rPr>
     </w:lvl>
     <w:lvl w:ilvl="2">
       <w:numFmt w:val="bullet"/>
-      <w:lvlText w:val="•"/>
+      <w:lvlText w:val=""/>
       <w:lvlJc w:val="left"/>
       <w:pPr>
-        <w:ind w:left="2160" w:hanging="480"/>
-      </w:pPr>
+        <w:ind w:left="2160" w:hanging="360"/>
+      </w:pPr>
+      <w:rPr>
+        <w:rFonts w:ascii="Wingdings" w:hAnsi="Wingdings" w:cs="Wingdings" w:hint="default"/>
+      </w:rPr>
     </w:lvl>
     <w:lvl w:ilvl="3">
       <w:numFmt w:val="bullet"/>
-      <w:lvlText w:val="–"/>
+      <w:lvlText w:val=""/>
       <w:lvlJc w:val="left"/>
       <w:pPr>
-        <w:ind w:left="2880" w:hanging="480"/>
-      </w:pPr>
+        <w:ind w:left="2880" w:hanging="360"/>
+      </w:pPr>
+      <w:rPr>
+        <w:rFonts w:ascii="Symbol" w:hAnsi="Symbol" w:cs="Symbol" w:hint="default"/>
+      </w:rPr>
     </w:lvl>
     <w:lvl w:ilvl="4">
       <w:numFmt w:val="bullet"/>
-      <w:lvlText w:val="•"/>
+      <w:lvlText w:val="o"/>
       <w:lvlJc w:val="left"/>
       <w:pPr>
-        <w:ind w:left="3600" w:hanging="480"/>
-      </w:pPr>
+        <w:ind w:left="3600" w:hanging="360"/>
+      </w:pPr>
+      <w:rPr>
+        <w:rFonts w:ascii="Courier New" w:hAnsi="Courier New" w:cs="Courier New" w:hint="default"/>
+      </w:rPr>
     </w:lvl>
     <w:lvl w:ilvl="5">
       <w:numFmt w:val="bullet"/>
-      <w:lvlText w:val="–"/>
+      <w:lvlText w:val=""/>
       <w:lvlJc w:val="left"/>
       <w:pPr>
-        <w:ind w:left="4320" w:hanging="480"/>
-      </w:pPr>
+        <w:ind w:left="4320" w:hanging="360"/>
+      </w:pPr>
+      <w:rPr>
+        <w:rFonts w:ascii="Wingdings" w:hAnsi="Wingdings" w:cs="Wingdings" w:hint="default"/>
+      </w:rPr>
     </w:lvl>
     <w:lvl w:ilvl="6">
       <w:numFmt w:val="bullet"/>
-      <w:lvlText w:val="•"/>
+      <w:lvlText w:val=""/>
       <w:lvlJc w:val="left"/>
       <w:pPr>
-        <w:ind w:left="5040" w:hanging="480"/>
-      </w:pPr>
+        <w:ind w:left="5040" w:hanging="360"/>
+      </w:pPr>
+      <w:rPr>
+        <w:rFonts w:ascii="Symbol" w:hAnsi="Symbol" w:cs="Symbol" w:hint="default"/>
+      </w:rPr>
     </w:lvl>
     <w:lvl w:ilvl="7">
       <w:numFmt w:val="bullet"/>
-      <w:lvlText w:val="–"/>
+      <w:lvlText w:val="o"/>
       <w:lvlJc w:val="left"/>
       <w:pPr>
-        <w:ind w:left="5760" w:hanging="480"/>
-      </w:pPr>
+        <w:ind w:left="5760" w:hanging="360"/>
+      </w:pPr>
+      <w:rPr>
+        <w:rFonts w:ascii="Courier New" w:hAnsi="Courier New" w:cs="Courier New" w:hint="default"/>
+      </w:rPr>
     </w:lvl>
     <w:lvl w:ilvl="8">
       <w:numFmt w:val="bullet"/>
-      <w:lvlText w:val="•"/>
+      <w:lvlText w:val=""/>
       <w:lvlJc w:val="left"/>
       <w:pPr>
-        <w:ind w:left="6480" w:hanging="480"/>
-      </w:pPr>
+        <w:ind w:left="6480" w:hanging="360"/>
+      </w:pPr>
+      <w:rPr>
+        <w:rFonts w:ascii="Wingdings" w:hAnsi="Wingdings" w:cs="Wingdings" w:hint="default"/>
+      </w:rPr>
     </w:lvl>
   </w:abstractNum>
   <w:num w:numId="1000">
@@ -5207,10 +5064,10 @@
   <w:docDefaults>
     <w:rPrDefault>
       <w:rPr>
-        <w:rFonts w:asciiTheme="minorHAnsi" w:cstheme="minorBidi" w:eastAsiaTheme="minorHAnsi" w:hAnsiTheme="minorHAnsi"/>
+        <w:rFonts w:asciiTheme="minorHAnsi" w:cstheme="minorBidi" w:eastAsiaTheme="minorEastAsia" w:hAnsiTheme="minorHAnsi"/>
         <w:sz w:val="24"/>
         <w:szCs w:val="24"/>
-        <w:lang w:bidi="ar-SA" w:eastAsia="en-US" w:val="fr"/>
+        <w:lang w:bidi="ar-SA" w:eastAsia="zh-CN" w:val="fr"/>
       </w:rPr>
     </w:rPrDefault>
     <w:pPrDefault>
@@ -5228,10 +5085,10 @@
     <w:name w:val="Body Text"/>
     <w:basedOn w:val="Normal"/>
     <w:link w:val="BodyTextChar"/>
+    <w:qFormat/>
     <w:pPr>
       <w:spacing w:after="180" w:before="180"/>
     </w:pPr>
-    <w:qFormat/>
   </w:style>
   <w:style w:customStyle="1" w:styleId="FirstParagraph" w:type="paragraph">
     <w:name w:val="First Paragraph"/>
@@ -5251,57 +5108,94 @@
     <w:name w:val="Title"/>
     <w:basedOn w:val="Normal"/>
     <w:next w:val="BodyText"/>
+    <w:link w:val="TitleChar"/>
+    <w:uiPriority w:val="10"/>
     <w:qFormat/>
+    <w:rsid w:val="00A10FD9"/>
     <w:pPr>
-      <w:keepNext/>
-      <w:keepLines/>
-      <w:spacing w:after="240" w:before="480"/>
+      <w:spacing w:after="80" w:line="240" w:lineRule="auto"/>
+      <w:contextualSpacing/>
       <w:jc w:val="center"/>
     </w:pPr>
     <w:rPr>
       <w:rFonts w:asciiTheme="majorHAnsi" w:cstheme="majorBidi" w:eastAsiaTheme="majorEastAsia" w:hAnsiTheme="majorHAnsi"/>
-      <w:b/>
-      <w:bCs/>
-      <w:color w:themeColor="accent1" w:themeShade="B5" w:val="345A8A"/>
-      <w:sz w:val="36"/>
-      <w:szCs w:val="36"/>
+      <w:sz w:val="56"/>
+      <w:szCs w:val="56"/>
+    </w:rPr>
+  </w:style>
+  <w:style w:customStyle="1" w:styleId="TitleChar" w:type="character">
+    <w:name w:val="Title Char"/>
+    <w:basedOn w:val="DefaultParagraphFont"/>
+    <w:link w:val="Title"/>
+    <w:uiPriority w:val="10"/>
+    <w:rsid w:val="00A10FD9"/>
+    <w:rPr>
+      <w:rFonts w:asciiTheme="majorHAnsi" w:cstheme="majorBidi" w:eastAsiaTheme="majorEastAsia" w:hAnsiTheme="majorHAnsi"/>
+      <w:sz w:val="56"/>
+      <w:szCs w:val="56"/>
     </w:rPr>
   </w:style>
   <w:style w:styleId="Subtitle" w:type="paragraph">
     <w:name w:val="Subtitle"/>
+    <w:basedOn w:val="Title"/>
+    <w:next w:val="BodyText"/>
+    <w:link w:val="SubtitleChar"/>
+    <w:uiPriority w:val="11"/>
+    <w:qFormat/>
+    <w:rsid w:val="00A10FD9"/>
+    <w:pPr>
+      <w:numPr>
+        <w:ilvl w:val="1"/>
+      </w:numPr>
+    </w:pPr>
+    <w:rPr>
+      <w:rFonts w:cstheme="majorBidi" w:eastAsiaTheme="majorEastAsia"/>
+      <w:spacing w:val="15"/>
+      <w:sz w:val="28"/>
+      <w:szCs w:val="28"/>
+    </w:rPr>
+  </w:style>
+  <w:style w:customStyle="1" w:styleId="SubtitleChar" w:type="character">
+    <w:name w:val="Subtitle Char"/>
+    <w:basedOn w:val="DefaultParagraphFont"/>
+    <w:link w:val="Subtitle"/>
+    <w:uiPriority w:val="11"/>
+    <w:rsid w:val="00A10FD9"/>
+    <w:rPr>
+      <w:rFonts w:cstheme="majorBidi" w:eastAsiaTheme="majorEastAsia"/>
+      <w:color w:themeColor="text1" w:themeTint="A6" w:val="595959"/>
+      <w:spacing w:val="15"/>
+      <w:sz w:val="28"/>
+      <w:szCs w:val="28"/>
+    </w:rPr>
+  </w:style>
+  <w:style w:customStyle="1" w:styleId="Author" w:type="paragraph">
+    <w:name w:val="Author"/>
     <w:basedOn w:val="Title"/>
     <w:next w:val="BodyText"/>
     <w:qFormat/>
     <w:pPr>
       <w:keepNext/>
       <w:keepLines/>
-      <w:spacing w:after="240" w:before="240"/>
-      <w:jc w:val="center"/>
     </w:pPr>
     <w:rPr>
-      <w:sz w:val="30"/>
-      <w:szCs w:val="30"/>
+      <w:sz w:val="24"/>
+      <w:szCs w:val="24"/>
     </w:rPr>
   </w:style>
-  <w:style w:customStyle="1" w:styleId="Author" w:type="paragraph">
-    <w:name w:val="Author"/>
+  <w:style w:styleId="Date" w:type="paragraph">
+    <w:name w:val="Date"/>
+    <w:basedOn w:val="Title"/>
     <w:next w:val="BodyText"/>
     <w:qFormat/>
     <w:pPr>
       <w:keepNext/>
       <w:keepLines/>
-      <w:jc w:val="center"/>
     </w:pPr>
-  </w:style>
-  <w:style w:styleId="Date" w:type="paragraph">
-    <w:name w:val="Date"/>
-    <w:next w:val="BodyText"/>
-    <w:qFormat/>
-    <w:pPr>
-      <w:keepNext/>
-      <w:keepLines/>
-      <w:jc w:val="center"/>
-    </w:pPr>
+    <w:rPr>
+      <w:sz w:val="24"/>
+      <w:szCs w:val="24"/>
+    </w:rPr>
   </w:style>
   <w:style w:customStyle="1" w:styleId="AbstractTitle" w:type="paragraph">
     <w:name w:val="Abstract Title"/>
@@ -5311,15 +5205,13 @@
     <w:pPr>
       <w:keepNext/>
       <w:keepLines/>
+      <w:spacing w:after="0" w:before="300"/>
       <w:jc w:val="center"/>
-      <w:spacing w:after="0" w:before="300"/>
     </w:pPr>
     <w:rPr>
+      <w:b/>
       <w:sz w:val="20"/>
       <w:szCs w:val="20"/>
-      <w:b/>
-      <w:color w:val="345A8A"/>
-      &gt;
     </w:rPr>
   </w:style>
   <w:style w:customStyle="1" w:styleId="Abstract" w:type="paragraph">
@@ -5346,191 +5238,321 @@
     <w:rPr/>
   </w:style>
   <w:style w:styleId="Heading1" w:type="paragraph">
-    <w:name w:val="Heading 1"/>
+    <w:name w:val="heading 1"/>
     <w:basedOn w:val="Normal"/>
     <w:next w:val="BodyText"/>
+    <w:link w:val="Heading1Char"/>
     <w:uiPriority w:val="9"/>
     <w:qFormat/>
+    <w:rsid w:val="00A10FD9"/>
     <w:pPr>
       <w:keepNext/>
       <w:keepLines/>
-      <w:spacing w:after="0" w:before="480"/>
+      <w:spacing w:after="80" w:before="360"/>
       <w:outlineLvl w:val="0"/>
     </w:pPr>
     <w:rPr>
       <w:rFonts w:asciiTheme="majorHAnsi" w:cstheme="majorBidi" w:eastAsiaTheme="majorEastAsia" w:hAnsiTheme="majorHAnsi"/>
-      <w:b/>
-      <w:bCs/>
-      <w:color w:themeColor="accent1" w:val="4F81BD"/>
-      <w:sz w:val="32"/>
-      <w:szCs w:val="32"/>
+      <w:color w:themeColor="accent1" w:themeShade="BF" w:val="0F4761"/>
+      <w:sz w:val="40"/>
+      <w:szCs w:val="40"/>
     </w:rPr>
   </w:style>
   <w:style w:styleId="Heading2" w:type="paragraph">
-    <w:name w:val="Heading 2"/>
+    <w:name w:val="heading 2"/>
     <w:basedOn w:val="Normal"/>
     <w:next w:val="BodyText"/>
+    <w:link w:val="Heading2Char"/>
     <w:uiPriority w:val="9"/>
+    <w:semiHidden/>
     <w:unhideWhenUsed/>
     <w:qFormat/>
+    <w:rsid w:val="00A10FD9"/>
     <w:pPr>
       <w:keepNext/>
       <w:keepLines/>
-      <w:spacing w:after="0" w:before="200"/>
+      <w:spacing w:after="80" w:before="160"/>
       <w:outlineLvl w:val="1"/>
     </w:pPr>
     <w:rPr>
       <w:rFonts w:asciiTheme="majorHAnsi" w:cstheme="majorBidi" w:eastAsiaTheme="majorEastAsia" w:hAnsiTheme="majorHAnsi"/>
-      <w:b/>
-      <w:bCs/>
-      <w:color w:themeColor="accent1" w:val="4F81BD"/>
+      <w:color w:themeColor="accent1" w:themeShade="BF" w:val="0F4761"/>
+      <w:sz w:val="32"/>
+      <w:szCs w:val="32"/>
+    </w:rPr>
+  </w:style>
+  <w:style w:styleId="Heading3" w:type="paragraph">
+    <w:name w:val="heading 3"/>
+    <w:basedOn w:val="Normal"/>
+    <w:next w:val="BodyText"/>
+    <w:link w:val="Heading3Char"/>
+    <w:uiPriority w:val="9"/>
+    <w:semiHidden/>
+    <w:unhideWhenUsed/>
+    <w:qFormat/>
+    <w:rsid w:val="00A10FD9"/>
+    <w:pPr>
+      <w:keepNext/>
+      <w:keepLines/>
+      <w:spacing w:after="80" w:before="160"/>
+      <w:outlineLvl w:val="2"/>
+    </w:pPr>
+    <w:rPr>
+      <w:rFonts w:cstheme="majorBidi" w:eastAsiaTheme="majorEastAsia"/>
+      <w:color w:themeColor="accent1" w:themeShade="BF" w:val="0F4761"/>
       <w:sz w:val="28"/>
       <w:szCs w:val="28"/>
     </w:rPr>
   </w:style>
-  <w:style w:styleId="Heading3" w:type="paragraph">
-    <w:name w:val="Heading 3"/>
+  <w:style w:styleId="Heading4" w:type="paragraph">
+    <w:name w:val="heading 4"/>
     <w:basedOn w:val="Normal"/>
     <w:next w:val="BodyText"/>
+    <w:link w:val="Heading4Char"/>
     <w:uiPriority w:val="9"/>
+    <w:semiHidden/>
     <w:unhideWhenUsed/>
     <w:qFormat/>
+    <w:rsid w:val="00A10FD9"/>
     <w:pPr>
       <w:keepNext/>
       <w:keepLines/>
-      <w:spacing w:after="0" w:before="200"/>
-      <w:outlineLvl w:val="2"/>
+      <w:spacing w:after="40" w:before="80"/>
+      <w:outlineLvl w:val="3"/>
     </w:pPr>
     <w:rPr>
-      <w:rFonts w:asciiTheme="majorHAnsi" w:cstheme="majorBidi" w:eastAsiaTheme="majorEastAsia" w:hAnsiTheme="majorHAnsi"/>
-      <w:b/>
-      <w:bCs/>
-      <w:color w:themeColor="accent1" w:val="4F81BD"/>
-      <w:sz w:val="24"/>
-      <w:szCs w:val="24"/>
+      <w:rFonts w:cstheme="majorBidi" w:eastAsiaTheme="majorEastAsia"/>
+      <w:i/>
+      <w:iCs/>
+      <w:color w:themeColor="accent1" w:themeShade="BF" w:val="0F4761"/>
     </w:rPr>
   </w:style>
-  <w:style w:styleId="Heading4" w:type="paragraph">
-    <w:name w:val="Heading 4"/>
+  <w:style w:styleId="Heading5" w:type="paragraph">
+    <w:name w:val="heading 5"/>
     <w:basedOn w:val="Normal"/>
     <w:next w:val="BodyText"/>
+    <w:link w:val="Heading5Char"/>
     <w:uiPriority w:val="9"/>
+    <w:semiHidden/>
     <w:unhideWhenUsed/>
     <w:qFormat/>
+    <w:rsid w:val="00A10FD9"/>
     <w:pPr>
       <w:keepNext/>
       <w:keepLines/>
-      <w:spacing w:after="0" w:before="200"/>
-      <w:outlineLvl w:val="3"/>
+      <w:spacing w:after="40" w:before="80"/>
+      <w:outlineLvl w:val="4"/>
     </w:pPr>
     <w:rPr>
-      <w:rFonts w:asciiTheme="majorHAnsi" w:cstheme="majorBidi" w:eastAsiaTheme="majorEastAsia" w:hAnsiTheme="majorHAnsi"/>
-      <w:i/>
-      <w:bCs/>
-      <w:color w:themeColor="accent1" w:val="4F81BD"/>
-      <w:sz w:val="24"/>
-      <w:szCs w:val="24"/>
+      <w:rFonts w:cstheme="majorBidi" w:eastAsiaTheme="majorEastAsia"/>
+      <w:color w:themeColor="accent1" w:themeShade="BF" w:val="0F4761"/>
     </w:rPr>
   </w:style>
-  <w:style w:styleId="Heading5" w:type="paragraph">
-    <w:name w:val="Heading 5"/>
+  <w:style w:styleId="Heading6" w:type="paragraph">
+    <w:name w:val="heading 6"/>
     <w:basedOn w:val="Normal"/>
     <w:next w:val="BodyText"/>
+    <w:link w:val="Heading6Char"/>
     <w:uiPriority w:val="9"/>
+    <w:semiHidden/>
     <w:unhideWhenUsed/>
     <w:qFormat/>
+    <w:rsid w:val="00A10FD9"/>
     <w:pPr>
       <w:keepNext/>
       <w:keepLines/>
-      <w:spacing w:after="0" w:before="200"/>
-      <w:outlineLvl w:val="4"/>
+      <w:spacing w:after="0" w:before="40"/>
+      <w:outlineLvl w:val="5"/>
     </w:pPr>
     <w:rPr>
-      <w:rFonts w:asciiTheme="majorHAnsi" w:cstheme="majorBidi" w:eastAsiaTheme="majorEastAsia" w:hAnsiTheme="majorHAnsi"/>
+      <w:rFonts w:cstheme="majorBidi" w:eastAsiaTheme="majorEastAsia"/>
+      <w:i/>
       <w:iCs/>
-      <w:color w:themeColor="accent1" w:val="4F81BD"/>
-      <w:sz w:val="24"/>
-      <w:szCs w:val="24"/>
+      <w:color w:themeColor="text1" w:themeTint="A6" w:val="595959"/>
     </w:rPr>
   </w:style>
-  <w:style w:styleId="Heading6" w:type="paragraph">
-    <w:name w:val="Heading 6"/>
+  <w:style w:styleId="Heading7" w:type="paragraph">
+    <w:name w:val="heading 7"/>
     <w:basedOn w:val="Normal"/>
     <w:next w:val="BodyText"/>
+    <w:link w:val="Heading7Char"/>
     <w:uiPriority w:val="9"/>
+    <w:semiHidden/>
     <w:unhideWhenUsed/>
     <w:qFormat/>
+    <w:rsid w:val="00A10FD9"/>
     <w:pPr>
       <w:keepNext/>
       <w:keepLines/>
-      <w:spacing w:after="0" w:before="200"/>
-      <w:outlineLvl w:val="5"/>
+      <w:spacing w:after="0" w:before="40"/>
+      <w:outlineLvl w:val="6"/>
     </w:pPr>
     <w:rPr>
-      <w:rFonts w:asciiTheme="majorHAnsi" w:cstheme="majorBidi" w:eastAsiaTheme="majorEastAsia" w:hAnsiTheme="majorHAnsi"/>
-      <w:color w:themeColor="accent1" w:val="4F81BD"/>
-      <w:sz w:val="24"/>
-      <w:szCs w:val="24"/>
+      <w:rFonts w:cstheme="majorBidi" w:eastAsiaTheme="majorEastAsia"/>
+      <w:color w:themeColor="text1" w:themeTint="A6" w:val="595959"/>
     </w:rPr>
   </w:style>
-  <w:style w:styleId="Heading7" w:type="paragraph">
-    <w:name w:val="Heading 7"/>
+  <w:style w:styleId="Heading8" w:type="paragraph">
+    <w:name w:val="heading 8"/>
     <w:basedOn w:val="Normal"/>
     <w:next w:val="BodyText"/>
+    <w:link w:val="Heading8Char"/>
     <w:uiPriority w:val="9"/>
+    <w:semiHidden/>
     <w:unhideWhenUsed/>
     <w:qFormat/>
+    <w:rsid w:val="00A10FD9"/>
     <w:pPr>
       <w:keepNext/>
       <w:keepLines/>
-      <w:spacing w:after="0" w:before="200"/>
-      <w:outlineLvl w:val="6"/>
+      <w:spacing w:after="0"/>
+      <w:outlineLvl w:val="7"/>
     </w:pPr>
     <w:rPr>
-      <w:rFonts w:asciiTheme="majorHAnsi" w:cstheme="majorBidi" w:eastAsiaTheme="majorEastAsia" w:hAnsiTheme="majorHAnsi"/>
-      <w:color w:themeColor="accent1" w:val="4F81BD"/>
-      <w:sz w:val="24"/>
-      <w:szCs w:val="24"/>
+      <w:rFonts w:cstheme="majorBidi" w:eastAsiaTheme="majorEastAsia"/>
+      <w:i/>
+      <w:iCs/>
+      <w:color w:themeColor="text1" w:themeTint="D8" w:val="272727"/>
     </w:rPr>
   </w:style>
-  <w:style w:styleId="Heading8" w:type="paragraph">
-    <w:name w:val="Heading 8"/>
+  <w:style w:styleId="Heading9" w:type="paragraph">
+    <w:name w:val="heading 9"/>
     <w:basedOn w:val="Normal"/>
     <w:next w:val="BodyText"/>
+    <w:link w:val="Heading9Char"/>
     <w:uiPriority w:val="9"/>
+    <w:semiHidden/>
     <w:unhideWhenUsed/>
     <w:qFormat/>
+    <w:rsid w:val="00A10FD9"/>
     <w:pPr>
       <w:keepNext/>
       <w:keepLines/>
-      <w:spacing w:after="0" w:before="200"/>
-      <w:outlineLvl w:val="7"/>
-    </w:pPr>
-    <w:rPr>
-      <w:rFonts w:asciiTheme="majorHAnsi" w:cstheme="majorBidi" w:eastAsiaTheme="majorEastAsia" w:hAnsiTheme="majorHAnsi"/>
-      <w:color w:themeColor="accent1" w:val="4F81BD"/>
-      <w:sz w:val="24"/>
-      <w:szCs w:val="24"/>
-    </w:rPr>
-  </w:style>
-  <w:style w:styleId="Heading9" w:type="paragraph">
-    <w:name w:val="Heading 9"/>
-    <w:basedOn w:val="Normal"/>
-    <w:next w:val="BodyText"/>
-    <w:uiPriority w:val="9"/>
-    <w:unhideWhenUsed/>
-    <w:qFormat/>
-    <w:pPr>
-      <w:keepNext/>
-      <w:keepLines/>
-      <w:spacing w:after="0" w:before="200"/>
+      <w:spacing w:after="0"/>
       <w:outlineLvl w:val="8"/>
     </w:pPr>
     <w:rPr>
+      <w:rFonts w:cstheme="majorBidi" w:eastAsiaTheme="majorEastAsia"/>
+      <w:color w:themeColor="text1" w:themeTint="D8" w:val="272727"/>
+    </w:rPr>
+  </w:style>
+  <w:style w:customStyle="1" w:styleId="Heading1Char" w:type="character">
+    <w:name w:val="Heading 1 Char"/>
+    <w:basedOn w:val="DefaultParagraphFont"/>
+    <w:link w:val="Heading1"/>
+    <w:uiPriority w:val="9"/>
+    <w:rsid w:val="00A10FD9"/>
+    <w:rPr>
       <w:rFonts w:asciiTheme="majorHAnsi" w:cstheme="majorBidi" w:eastAsiaTheme="majorEastAsia" w:hAnsiTheme="majorHAnsi"/>
-      <w:color w:themeColor="accent1" w:val="4F81BD"/>
-      <w:sz w:val="24"/>
-      <w:szCs w:val="24"/>
+      <w:color w:themeColor="accent1" w:themeShade="BF" w:val="0F4761"/>
+      <w:sz w:val="40"/>
+      <w:szCs w:val="40"/>
+    </w:rPr>
+  </w:style>
+  <w:style w:customStyle="1" w:styleId="Heading2Char" w:type="character">
+    <w:name w:val="Heading 2 Char"/>
+    <w:basedOn w:val="DefaultParagraphFont"/>
+    <w:link w:val="Heading2"/>
+    <w:uiPriority w:val="9"/>
+    <w:semiHidden/>
+    <w:rsid w:val="00A10FD9"/>
+    <w:rPr>
+      <w:rFonts w:asciiTheme="majorHAnsi" w:cstheme="majorBidi" w:eastAsiaTheme="majorEastAsia" w:hAnsiTheme="majorHAnsi"/>
+      <w:color w:themeColor="accent1" w:themeShade="BF" w:val="0F4761"/>
+      <w:sz w:val="32"/>
+      <w:szCs w:val="32"/>
+    </w:rPr>
+  </w:style>
+  <w:style w:customStyle="1" w:styleId="Heading3Char" w:type="character">
+    <w:name w:val="Heading 3 Char"/>
+    <w:basedOn w:val="DefaultParagraphFont"/>
+    <w:link w:val="Heading3"/>
+    <w:uiPriority w:val="9"/>
+    <w:semiHidden/>
+    <w:rsid w:val="00A10FD9"/>
+    <w:rPr>
+      <w:rFonts w:cstheme="majorBidi" w:eastAsiaTheme="majorEastAsia"/>
+      <w:color w:themeColor="accent1" w:themeShade="BF" w:val="0F4761"/>
+      <w:sz w:val="28"/>
+      <w:szCs w:val="28"/>
+    </w:rPr>
+  </w:style>
+  <w:style w:customStyle="1" w:styleId="Heading4Char" w:type="character">
+    <w:name w:val="Heading 4 Char"/>
+    <w:basedOn w:val="DefaultParagraphFont"/>
+    <w:link w:val="Heading4"/>
+    <w:uiPriority w:val="9"/>
+    <w:semiHidden/>
+    <w:rsid w:val="00A10FD9"/>
+    <w:rPr>
+      <w:rFonts w:cstheme="majorBidi" w:eastAsiaTheme="majorEastAsia"/>
+      <w:i/>
+      <w:iCs/>
+      <w:color w:themeColor="accent1" w:themeShade="BF" w:val="0F4761"/>
+    </w:rPr>
+  </w:style>
+  <w:style w:customStyle="1" w:styleId="Heading5Char" w:type="character">
+    <w:name w:val="Heading 5 Char"/>
+    <w:basedOn w:val="DefaultParagraphFont"/>
+    <w:link w:val="Heading5"/>
+    <w:uiPriority w:val="9"/>
+    <w:semiHidden/>
+    <w:rsid w:val="00A10FD9"/>
+    <w:rPr>
+      <w:rFonts w:cstheme="majorBidi" w:eastAsiaTheme="majorEastAsia"/>
+      <w:color w:themeColor="accent1" w:themeShade="BF" w:val="0F4761"/>
+    </w:rPr>
+  </w:style>
+  <w:style w:customStyle="1" w:styleId="Heading6Char" w:type="character">
+    <w:name w:val="Heading 6 Char"/>
+    <w:basedOn w:val="DefaultParagraphFont"/>
+    <w:link w:val="Heading6"/>
+    <w:uiPriority w:val="9"/>
+    <w:semiHidden/>
+    <w:rsid w:val="00A10FD9"/>
+    <w:rPr>
+      <w:rFonts w:cstheme="majorBidi" w:eastAsiaTheme="majorEastAsia"/>
+      <w:i/>
+      <w:iCs/>
+      <w:color w:themeColor="text1" w:themeTint="A6" w:val="595959"/>
+    </w:rPr>
+  </w:style>
+  <w:style w:customStyle="1" w:styleId="Heading7Char" w:type="character">
+    <w:name w:val="Heading 7 Char"/>
+    <w:basedOn w:val="DefaultParagraphFont"/>
+    <w:link w:val="Heading7"/>
+    <w:uiPriority w:val="9"/>
+    <w:semiHidden/>
+    <w:rsid w:val="00A10FD9"/>
+    <w:rPr>
+      <w:rFonts w:cstheme="majorBidi" w:eastAsiaTheme="majorEastAsia"/>
+      <w:color w:themeColor="text1" w:themeTint="A6" w:val="595959"/>
+    </w:rPr>
+  </w:style>
+  <w:style w:customStyle="1" w:styleId="Heading8Char" w:type="character">
+    <w:name w:val="Heading 8 Char"/>
+    <w:basedOn w:val="DefaultParagraphFont"/>
+    <w:link w:val="Heading8"/>
+    <w:uiPriority w:val="9"/>
+    <w:semiHidden/>
+    <w:rsid w:val="00A10FD9"/>
+    <w:rPr>
+      <w:rFonts w:cstheme="majorBidi" w:eastAsiaTheme="majorEastAsia"/>
+      <w:i/>
+      <w:iCs/>
+      <w:color w:themeColor="text1" w:themeTint="D8" w:val="272727"/>
+    </w:rPr>
+  </w:style>
+  <w:style w:customStyle="1" w:styleId="Heading9Char" w:type="character">
+    <w:name w:val="Heading 9 Char"/>
+    <w:basedOn w:val="DefaultParagraphFont"/>
+    <w:link w:val="Heading9"/>
+    <w:uiPriority w:val="9"/>
+    <w:semiHidden/>
+    <w:rsid w:val="00A10FD9"/>
+    <w:rPr>
+      <w:rFonts w:cstheme="majorBidi" w:eastAsiaTheme="majorEastAsia"/>
+      <w:color w:themeColor="text1" w:themeTint="D8" w:val="272727"/>
     </w:rPr>
   </w:style>
   <w:style w:styleId="BlockText" w:type="paragraph">
@@ -5555,8 +5577,8 @@
   </w:style>
   <w:style w:styleId="FootnoteBlockText" w:type="paragraph">
     <w:name w:val="Footnote Block Text"/>
-    <w:basedOn w:val="Footnote Text"/>
-    <w:next w:val="Footnote Text"/>
+    <w:basedOn w:val="FootnoteText"/>
+    <w:next w:val="FootnoteText"/>
     <w:uiPriority w:val="9"/>
     <w:unhideWhenUsed/>
     <w:qFormat/>
@@ -5586,18 +5608,11 @@
       </w:tblCellMar>
     </w:tblPr>
     <w:tblStylePr w:type="firstRow">
-      <w:tblPr>
-        <w:jc w:val="left"/>
-        <w:tblInd w:type="dxa" w:w="0"/>
-      </w:tblPr>
-      <w:trPr>
-        <w:jc w:val="left"/>
-      </w:trPr>
       <w:tcPr>
-        <w:vAlign w:val="bottom"/>
         <w:tcBorders>
           <w:bottom w:val="single"/>
         </w:tcBorders>
+        <w:vAlign w:val="bottom"/>
       </w:tcPr>
     </w:tblStylePr>
   </w:style>
@@ -5713,6 +5728,7 @@
     <w:name w:val="KeywordTok"/>
     <w:basedOn w:val="VerbatimChar"/>
     <w:rPr>
+      <w:b/>
       <w:color w:val="003b4f"/>
       <w:shd w:val="clear" w:fill="f1f3f5"/>
     </w:rPr>
@@ -5817,9 +5833,9 @@
     <w:name w:val="DocumentationTok"/>
     <w:basedOn w:val="VerbatimChar"/>
     <w:rPr>
+      <w:i/>
       <w:color w:val="5e5e5e"/>
       <w:shd w:val="clear" w:fill="f1f3f5"/>
-      <w:i/>
     </w:rPr>
   </w:style>
   <w:style w:type="character" w:customStyle="1" w:styleId="AnnotationTok">
@@ -5834,9 +5850,9 @@
     <w:name w:val="CommentVarTok"/>
     <w:basedOn w:val="VerbatimChar"/>
     <w:rPr>
+      <w:i/>
       <w:color w:val="5e5e5e"/>
       <w:shd w:val="clear" w:fill="f1f3f5"/>
-      <w:i/>
     </w:rPr>
   </w:style>
   <w:style w:type="character" w:customStyle="1" w:styleId="OtherTok">
@@ -5867,6 +5883,7 @@
     <w:name w:val="ControlFlowTok"/>
     <w:basedOn w:val="VerbatimChar"/>
     <w:rPr>
+      <w:b/>
       <w:color w:val="003b4f"/>
       <w:shd w:val="clear" w:fill="f1f3f5"/>
     </w:rPr>
@@ -5931,9 +5948,9 @@
     <w:name w:val="WarningTok"/>
     <w:basedOn w:val="VerbatimChar"/>
     <w:rPr>
+      <w:i/>
       <w:color w:val="5e5e5e"/>
       <w:shd w:val="clear" w:fill="f1f3f5"/>
-      <w:i/>
     </w:rPr>
   </w:style>
   <w:style w:type="character" w:customStyle="1" w:styleId="AlertTok">
@@ -5974,44 +5991,44 @@
         <a:sysClr val="window" lastClr="FFFFFF"/>
       </a:lt1>
       <a:dk2>
-        <a:srgbClr val="1F497D"/>
+        <a:srgbClr val="0E2841"/>
       </a:dk2>
       <a:lt2>
-        <a:srgbClr val="EEECE1"/>
+        <a:srgbClr val="E8E8E8"/>
       </a:lt2>
       <a:accent1>
-        <a:srgbClr val="4F81BD"/>
+        <a:srgbClr val="156082"/>
       </a:accent1>
       <a:accent2>
-        <a:srgbClr val="C0504D"/>
+        <a:srgbClr val="E97132"/>
       </a:accent2>
       <a:accent3>
-        <a:srgbClr val="9BBB59"/>
+        <a:srgbClr val="196B24"/>
       </a:accent3>
       <a:accent4>
-        <a:srgbClr val="8064A2"/>
+        <a:srgbClr val="0F9ED5"/>
       </a:accent4>
       <a:accent5>
-        <a:srgbClr val="4BACC6"/>
+        <a:srgbClr val="A02B93"/>
       </a:accent5>
       <a:accent6>
-        <a:srgbClr val="F79646"/>
+        <a:srgbClr val="4EA72E"/>
       </a:accent6>
       <a:hlink>
-        <a:srgbClr val="0000FF"/>
+        <a:srgbClr val="467886"/>
       </a:hlink>
       <a:folHlink>
-        <a:srgbClr val="800080"/>
+        <a:srgbClr val="96607D"/>
       </a:folHlink>
     </a:clrScheme>
     <a:fontScheme name="Office">
       <a:majorFont>
-        <a:latin typeface="Calibri"/>
+        <a:latin typeface="Aptos Display" panose="02110004020202020204"/>
         <a:ea typeface=""/>
         <a:cs typeface=""/>
-        <a:font script="Jpan" typeface="ＭＳ ゴシック"/>
+        <a:font script="Jpan" typeface="游ゴシック Light"/>
         <a:font script="Hang" typeface="맑은 고딕"/>
-        <a:font script="Hans" typeface="宋体"/>
+        <a:font script="Hans" typeface="等线 Light"/>
         <a:font script="Hant" typeface="新細明體"/>
         <a:font script="Arab" typeface="Times New Roman"/>
         <a:font script="Hebr" typeface="Times New Roman"/>
@@ -6038,14 +6055,32 @@
         <a:font script="Mong" typeface="Mongolian Baiti"/>
         <a:font script="Viet" typeface="Times New Roman"/>
         <a:font script="Uigh" typeface="Microsoft Uighur"/>
+        <a:font script="Geor" typeface="Sylfaen"/>
+        <a:font script="Armn" typeface="Arial"/>
+        <a:font script="Bugi" typeface="Leelawadee UI"/>
+        <a:font script="Bopo" typeface="Microsoft JhengHei"/>
+        <a:font script="Java" typeface="Javanese Text"/>
+        <a:font script="Lisu" typeface="Segoe UI"/>
+        <a:font script="Mymr" typeface="Myanmar Text"/>
+        <a:font script="Nkoo" typeface="Ebrima"/>
+        <a:font script="Olck" typeface="Nirmala UI"/>
+        <a:font script="Osma" typeface="Ebrima"/>
+        <a:font script="Phag" typeface="Phagspa"/>
+        <a:font script="Syrn" typeface="Estrangelo Edessa"/>
+        <a:font script="Syrj" typeface="Estrangelo Edessa"/>
+        <a:font script="Syre" typeface="Estrangelo Edessa"/>
+        <a:font script="Sora" typeface="Nirmala UI"/>
+        <a:font script="Tale" typeface="Microsoft Tai Le"/>
+        <a:font script="Talu" typeface="Microsoft New Tai Lue"/>
+        <a:font script="Tfng" typeface="Ebrima"/>
       </a:majorFont>
       <a:minorFont>
-        <a:latin typeface="Cambria"/>
+        <a:latin typeface="Aptos" panose="02110004020202020204"/>
         <a:ea typeface=""/>
         <a:cs typeface=""/>
-        <a:font script="Jpan" typeface="ＭＳ 明朝"/>
+        <a:font script="Jpan" typeface="游明朝"/>
         <a:font script="Hang" typeface="맑은 고딕"/>
-        <a:font script="Hans" typeface="宋体"/>
+        <a:font script="Hans" typeface="等线"/>
         <a:font script="Hant" typeface="新細明體"/>
         <a:font script="Arab" typeface="Arial"/>
         <a:font script="Hebr" typeface="Arial"/>
@@ -6072,6 +6107,24 @@
         <a:font script="Mong" typeface="Mongolian Baiti"/>
         <a:font script="Viet" typeface="Arial"/>
         <a:font script="Uigh" typeface="Microsoft Uighur"/>
+        <a:font script="Geor" typeface="Sylfaen"/>
+        <a:font script="Armn" typeface="Arial"/>
+        <a:font script="Bugi" typeface="Leelawadee UI"/>
+        <a:font script="Bopo" typeface="Microsoft JhengHei"/>
+        <a:font script="Java" typeface="Javanese Text"/>
+        <a:font script="Lisu" typeface="Segoe UI"/>
+        <a:font script="Mymr" typeface="Myanmar Text"/>
+        <a:font script="Nkoo" typeface="Ebrima"/>
+        <a:font script="Olck" typeface="Nirmala UI"/>
+        <a:font script="Osma" typeface="Ebrima"/>
+        <a:font script="Phag" typeface="Phagspa"/>
+        <a:font script="Syrn" typeface="Estrangelo Edessa"/>
+        <a:font script="Syrj" typeface="Estrangelo Edessa"/>
+        <a:font script="Syre" typeface="Estrangelo Edessa"/>
+        <a:font script="Sora" typeface="Nirmala UI"/>
+        <a:font script="Tale" typeface="Microsoft Tai Le"/>
+        <a:font script="Talu" typeface="Microsoft New Tai Lue"/>
+        <a:font script="Tfng" typeface="Ebrima"/>
       </a:minorFont>
     </a:fontScheme>
     <a:fmtScheme name="Office">
@@ -6083,200 +6136,141 @@
           <a:gsLst>
             <a:gs pos="0">
               <a:schemeClr val="phClr">
-                <a:tint val="50000"/>
-                <a:satMod val="300000"/>
+                <a:lumMod val="110000"/>
+                <a:satMod val="105000"/>
+                <a:tint val="67000"/>
               </a:schemeClr>
             </a:gs>
-            <a:gs pos="35000">
+            <a:gs pos="50000">
               <a:schemeClr val="phClr">
-                <a:tint val="37000"/>
-                <a:satMod val="300000"/>
+                <a:lumMod val="105000"/>
+                <a:satMod val="103000"/>
+                <a:tint val="73000"/>
               </a:schemeClr>
             </a:gs>
             <a:gs pos="100000">
               <a:schemeClr val="phClr">
-                <a:tint val="15000"/>
-                <a:satMod val="350000"/>
+                <a:lumMod val="105000"/>
+                <a:satMod val="109000"/>
+                <a:tint val="81000"/>
               </a:schemeClr>
             </a:gs>
           </a:gsLst>
-          <a:lin ang="16200000" scaled="1"/>
+          <a:lin ang="5400000" scaled="0"/>
         </a:gradFill>
         <a:gradFill rotWithShape="1">
           <a:gsLst>
             <a:gs pos="0">
               <a:schemeClr val="phClr">
-                <a:tint val="100000"/>
+                <a:satMod val="103000"/>
+                <a:lumMod val="102000"/>
+                <a:tint val="94000"/>
+              </a:schemeClr>
+            </a:gs>
+            <a:gs pos="50000">
+              <a:schemeClr val="phClr">
+                <a:satMod val="110000"/>
+                <a:lumMod val="100000"/>
                 <a:shade val="100000"/>
-                <a:satMod val="130000"/>
               </a:schemeClr>
             </a:gs>
             <a:gs pos="100000">
               <a:schemeClr val="phClr">
-                <a:tint val="50000"/>
-                <a:shade val="100000"/>
-                <a:satMod val="350000"/>
+                <a:lumMod val="99000"/>
+                <a:satMod val="120000"/>
+                <a:shade val="78000"/>
               </a:schemeClr>
             </a:gs>
           </a:gsLst>
-          <a:lin ang="16200000" scaled="0"/>
+          <a:lin ang="5400000" scaled="0"/>
         </a:gradFill>
       </a:fillStyleLst>
       <a:lnStyleLst>
-        <a:ln w="9525" cap="flat" cmpd="sng" algn="ctr">
-          <a:solidFill>
-            <a:schemeClr val="phClr">
-              <a:shade val="95000"/>
-              <a:satMod val="105000"/>
-            </a:schemeClr>
-          </a:solidFill>
-          <a:prstDash val="solid"/>
-        </a:ln>
-        <a:ln w="25400" cap="flat" cmpd="sng" algn="ctr">
+        <a:ln w="6350" cap="flat" cmpd="sng" algn="ctr">
           <a:solidFill>
             <a:schemeClr val="phClr"/>
           </a:solidFill>
           <a:prstDash val="solid"/>
+          <a:miter lim="800000"/>
         </a:ln>
-        <a:ln w="38100" cap="flat" cmpd="sng" algn="ctr">
+        <a:ln w="12700" cap="flat" cmpd="sng" algn="ctr">
           <a:solidFill>
             <a:schemeClr val="phClr"/>
           </a:solidFill>
           <a:prstDash val="solid"/>
+          <a:miter lim="800000"/>
+        </a:ln>
+        <a:ln w="19050" cap="flat" cmpd="sng" algn="ctr">
+          <a:solidFill>
+            <a:schemeClr val="phClr"/>
+          </a:solidFill>
+          <a:prstDash val="solid"/>
+          <a:miter lim="800000"/>
         </a:ln>
       </a:lnStyleLst>
       <a:effectStyleLst>
         <a:effectStyle>
+          <a:effectLst/>
+        </a:effectStyle>
+        <a:effectStyle>
+          <a:effectLst/>
+        </a:effectStyle>
+        <a:effectStyle>
           <a:effectLst>
-            <a:outerShdw blurRad="40000" dist="20000" dir="5400000" rotWithShape="0">
+            <a:outerShdw blurRad="57150" dist="19050" dir="5400000" algn="ctr" rotWithShape="0">
               <a:srgbClr val="000000">
-                <a:alpha val="38000"/>
+                <a:alpha val="63000"/>
               </a:srgbClr>
             </a:outerShdw>
           </a:effectLst>
-        </a:effectStyle>
-        <a:effectStyle>
-          <a:effectLst>
-            <a:outerShdw blurRad="40000" dist="23000" dir="5400000" rotWithShape="0">
-              <a:srgbClr val="000000">
-                <a:alpha val="35000"/>
-              </a:srgbClr>
-            </a:outerShdw>
-          </a:effectLst>
-        </a:effectStyle>
-        <a:effectStyle>
-          <a:effectLst>
-            <a:outerShdw blurRad="40000" dist="23000" dir="5400000" rotWithShape="0">
-              <a:srgbClr val="000000">
-                <a:alpha val="35000"/>
-              </a:srgbClr>
-            </a:outerShdw>
-          </a:effectLst>
-          <a:scene3d>
-            <a:camera prst="orthographicFront">
-              <a:rot lat="0" lon="0" rev="0"/>
-            </a:camera>
-            <a:lightRig rig="threePt" dir="t">
-              <a:rot lat="0" lon="0" rev="1200000"/>
-            </a:lightRig>
-          </a:scene3d>
-          <a:sp3d>
-            <a:bevelT w="63500" h="25400"/>
-          </a:sp3d>
         </a:effectStyle>
       </a:effectStyleLst>
       <a:bgFillStyleLst>
         <a:solidFill>
           <a:schemeClr val="phClr"/>
         </a:solidFill>
+        <a:solidFill>
+          <a:schemeClr val="phClr">
+            <a:tint val="95000"/>
+            <a:satMod val="170000"/>
+          </a:schemeClr>
+        </a:solidFill>
         <a:gradFill rotWithShape="1">
           <a:gsLst>
             <a:gs pos="0">
               <a:schemeClr val="phClr">
-                <a:tint val="40000"/>
-                <a:satMod val="350000"/>
+                <a:tint val="93000"/>
+                <a:satMod val="150000"/>
+                <a:shade val="98000"/>
+                <a:lumMod val="102000"/>
               </a:schemeClr>
             </a:gs>
-            <a:gs pos="40000">
+            <a:gs pos="50000">
               <a:schemeClr val="phClr">
-                <a:tint val="45000"/>
-                <a:shade val="99000"/>
-                <a:satMod val="350000"/>
+                <a:tint val="98000"/>
+                <a:satMod val="130000"/>
+                <a:shade val="90000"/>
+                <a:lumMod val="103000"/>
               </a:schemeClr>
             </a:gs>
             <a:gs pos="100000">
               <a:schemeClr val="phClr">
-                <a:shade val="20000"/>
-                <a:satMod val="255000"/>
+                <a:shade val="63000"/>
+                <a:satMod val="120000"/>
               </a:schemeClr>
             </a:gs>
           </a:gsLst>
-          <a:path path="circle">
-            <a:fillToRect l="50000" t="-80000" r="50000" b="180000"/>
-          </a:path>
-        </a:gradFill>
-        <a:gradFill rotWithShape="1">
-          <a:gsLst>
-            <a:gs pos="0">
-              <a:schemeClr val="phClr">
-                <a:tint val="80000"/>
-                <a:satMod val="300000"/>
-              </a:schemeClr>
-            </a:gs>
-            <a:gs pos="100000">
-              <a:schemeClr val="phClr">
-                <a:shade val="30000"/>
-                <a:satMod val="200000"/>
-              </a:schemeClr>
-            </a:gs>
-          </a:gsLst>
-          <a:path path="circle">
-            <a:fillToRect l="50000" t="50000" r="50000" b="50000"/>
-          </a:path>
+          <a:lin ang="5400000" scaled="0"/>
         </a:gradFill>
       </a:bgFillStyleLst>
     </a:fmtScheme>
   </a:themeElements>
-  <a:objectDefaults>
-    <a:spDef>
-      <a:spPr/>
-      <a:bodyPr/>
-      <a:lstStyle/>
-      <a:style>
-        <a:lnRef idx="1">
-          <a:schemeClr val="accent1"/>
-        </a:lnRef>
-        <a:fillRef idx="3">
-          <a:schemeClr val="accent1"/>
-        </a:fillRef>
-        <a:effectRef idx="2">
-          <a:schemeClr val="accent1"/>
-        </a:effectRef>
-        <a:fontRef idx="minor">
-          <a:schemeClr val="lt1"/>
-        </a:fontRef>
-      </a:style>
-    </a:spDef>
-    <a:lnDef>
-      <a:spPr/>
-      <a:bodyPr/>
-      <a:lstStyle/>
-      <a:style>
-        <a:lnRef idx="2">
-          <a:schemeClr val="accent1"/>
-        </a:lnRef>
-        <a:fillRef idx="0">
-          <a:schemeClr val="accent1"/>
-        </a:fillRef>
-        <a:effectRef idx="1">
-          <a:schemeClr val="accent1"/>
-        </a:effectRef>
-        <a:fontRef idx="minor">
-          <a:schemeClr val="tx1"/>
-        </a:fontRef>
-      </a:style>
-    </a:lnDef>
-  </a:objectDefaults>
+  <a:objectDefaults/>
   <a:extraClrSchemeLst/>
+  <a:extLst>
+    <a:ext uri="{05A4C25C-085E-4340-85A3-A5531E510DB2}">
+      <thm15:themeFamily xmlns:thm15="http://schemas.microsoft.com/office/thememl/2012/main" name="Office Theme" id="{2E142A2C-CD16-42D6-873A-C26D2A0506FA}" vid="{1BDDFF52-6CD6-40A5-AB3C-68EB2F1E4D0A}"/>
+    </a:ext>
+  </a:extLst>
 </a:theme>
 </file>
</xml_diff>

<commit_message>
Add content for convergence random variable chapter
</commit_message>
<xml_diff>
--- a/docs/teaching/statistics-probability/exam-3.docx
+++ b/docs/teaching/statistics-probability/exam-3.docx
@@ -7,7 +7,43 @@
         <w:pStyle w:val="Title"/>
       </w:pPr>
       <w:r>
-        <w:t xml:space="preserve">Examen (Sujet 3) — Statistiques et Probabilités</w:t>
+        <w:t xml:space="preserve">Examen</w:t>
+      </w:r>
+      <w:r>
+        <w:t xml:space="preserve"> </w:t>
+      </w:r>
+      <w:r>
+        <w:t xml:space="preserve">(Sujet</w:t>
+      </w:r>
+      <w:r>
+        <w:t xml:space="preserve"> </w:t>
+      </w:r>
+      <w:r>
+        <w:t xml:space="preserve">3)</w:t>
+      </w:r>
+      <w:r>
+        <w:t xml:space="preserve"> </w:t>
+      </w:r>
+      <w:r>
+        <w:t xml:space="preserve">—</w:t>
+      </w:r>
+      <w:r>
+        <w:t xml:space="preserve"> </w:t>
+      </w:r>
+      <w:r>
+        <w:t xml:space="preserve">Statistiques</w:t>
+      </w:r>
+      <w:r>
+        <w:t xml:space="preserve"> </w:t>
+      </w:r>
+      <w:r>
+        <w:t xml:space="preserve">et</w:t>
+      </w:r>
+      <w:r>
+        <w:t xml:space="preserve"> </w:t>
+      </w:r>
+      <w:r>
+        <w:t xml:space="preserve">Probabilités</w:t>
       </w:r>
     </w:p>
     <w:p>
@@ -15,7 +51,61 @@
         <w:pStyle w:val="Subtitle"/>
       </w:pPr>
       <w:r>
-        <w:t xml:space="preserve">Statistiques descriptives · Variables aléatoires à densité · Loi normale</w:t>
+        <w:t xml:space="preserve">Statistiques</w:t>
+      </w:r>
+      <w:r>
+        <w:t xml:space="preserve"> </w:t>
+      </w:r>
+      <w:r>
+        <w:t xml:space="preserve">descriptives</w:t>
+      </w:r>
+      <w:r>
+        <w:t xml:space="preserve"> </w:t>
+      </w:r>
+      <w:r>
+        <w:t xml:space="preserve">·</w:t>
+      </w:r>
+      <w:r>
+        <w:t xml:space="preserve"> </w:t>
+      </w:r>
+      <w:r>
+        <w:t xml:space="preserve">Variables</w:t>
+      </w:r>
+      <w:r>
+        <w:t xml:space="preserve"> </w:t>
+      </w:r>
+      <w:r>
+        <w:t xml:space="preserve">aléatoires</w:t>
+      </w:r>
+      <w:r>
+        <w:t xml:space="preserve"> </w:t>
+      </w:r>
+      <w:r>
+        <w:t xml:space="preserve">à</w:t>
+      </w:r>
+      <w:r>
+        <w:t xml:space="preserve"> </w:t>
+      </w:r>
+      <w:r>
+        <w:t xml:space="preserve">densité</w:t>
+      </w:r>
+      <w:r>
+        <w:t xml:space="preserve"> </w:t>
+      </w:r>
+      <w:r>
+        <w:t xml:space="preserve">·</w:t>
+      </w:r>
+      <w:r>
+        <w:t xml:space="preserve"> </w:t>
+      </w:r>
+      <w:r>
+        <w:t xml:space="preserve">Loi</w:t>
+      </w:r>
+      <w:r>
+        <w:t xml:space="preserve"> </w:t>
+      </w:r>
+      <w:r>
+        <w:t xml:space="preserve">normale</w:t>
       </w:r>
     </w:p>
     <w:p>
@@ -39,100 +129,270 @@
         <w:pStyle w:val="Abstract"/>
       </w:pPr>
       <w:r>
-        <w:t xml:space="preserve">Durée :</w:t>
+        <w:t xml:space="preserve">Durée</w:t>
+      </w:r>
+      <w:r>
+        <w:t xml:space="preserve"> </w:t>
+      </w:r>
+      <w:r>
+        <w:t xml:space="preserve">:</w:t>
       </w:r>
       <w:r>
         <w:t xml:space="preserve"> </w:t>
       </w:r>
       <w:r>
         <w:rPr>
+          <w:bCs/>
           <w:b/>
+        </w:rPr>
+        <w:t xml:space="preserve">1</w:t>
+      </w:r>
+      <w:r>
+        <w:rPr>
           <w:bCs/>
+          <w:b/>
         </w:rPr>
-        <w:t xml:space="preserve">1 h 30</w:t>
-      </w:r>
-      <w:r>
-        <w:t xml:space="preserve">. Les documents de cours sont</w:t>
-      </w:r>
-      <w:r>
         <w:t xml:space="preserve"> </w:t>
       </w:r>
       <w:r>
         <w:rPr>
+          <w:bCs/>
           <w:b/>
+        </w:rPr>
+        <w:t xml:space="preserve">h</w:t>
+      </w:r>
+      <w:r>
+        <w:rPr>
           <w:bCs/>
+          <w:b/>
+        </w:rPr>
+        <w:t xml:space="preserve"> </w:t>
+      </w:r>
+      <w:r>
+        <w:rPr>
+          <w:bCs/>
+          <w:b/>
+        </w:rPr>
+        <w:t xml:space="preserve">30</w:t>
+      </w:r>
+      <w:r>
+        <w:t xml:space="preserve">.</w:t>
+      </w:r>
+      <w:r>
+        <w:t xml:space="preserve"> </w:t>
+      </w:r>
+      <w:r>
+        <w:t xml:space="preserve">Les</w:t>
+      </w:r>
+      <w:r>
+        <w:t xml:space="preserve"> </w:t>
+      </w:r>
+      <w:r>
+        <w:t xml:space="preserve">documents</w:t>
+      </w:r>
+      <w:r>
+        <w:t xml:space="preserve"> </w:t>
+      </w:r>
+      <w:r>
+        <w:t xml:space="preserve">de</w:t>
+      </w:r>
+      <w:r>
+        <w:t xml:space="preserve"> </w:t>
+      </w:r>
+      <w:r>
+        <w:t xml:space="preserve">cours</w:t>
+      </w:r>
+      <w:r>
+        <w:t xml:space="preserve"> </w:t>
+      </w:r>
+      <w:r>
+        <w:t xml:space="preserve">sont</w:t>
+      </w:r>
+      <w:r>
+        <w:t xml:space="preserve"> </w:t>
+      </w:r>
+      <w:r>
+        <w:rPr>
+          <w:bCs/>
+          <w:b/>
         </w:rPr>
         <w:t xml:space="preserve">interdits</w:t>
       </w:r>
       <w:r>
-        <w:t xml:space="preserve">. Une table de la</w:t>
-      </w:r>
-      <w:r>
-        <w:t xml:space="preserve"> </w:t>
-      </w:r>
-      <w:r>
-        <w:t xml:space="preserve">loi normale</w:t>
-      </w:r>
-      <w:r>
-        <w:t xml:space="preserve"> </w:t>
-      </w:r>
-      <m:oMath>
-        <m:r>
-          <m:rPr>
+        <w:t xml:space="preserve">.</w:t>
+      </w:r>
+      <w:r>
+        <w:t xml:space="preserve"> </w:t>
+      </w:r>
+      <w:r>
+        <w:t xml:space="preserve">Une</w:t>
+      </w:r>
+      <w:r>
+        <w:t xml:space="preserve"> </w:t>
+      </w:r>
+      <w:r>
+        <w:t xml:space="preserve">table</w:t>
+      </w:r>
+      <w:r>
+        <w:t xml:space="preserve"> </w:t>
+      </w:r>
+      <w:r>
+        <w:t xml:space="preserve">de</w:t>
+      </w:r>
+      <w:r>
+        <w:t xml:space="preserve"> </w:t>
+      </w:r>
+      <w:r>
+        <w:t xml:space="preserve">la</w:t>
+      </w:r>
+      <w:r>
+        <w:t xml:space="preserve"> </w:t>
+      </w:r>
+      <w:r>
+        <w:t xml:space="preserve">loi</w:t>
+      </w:r>
+      <w:r>
+        <w:t xml:space="preserve"> </w:t>
+      </w:r>
+      <w:r>
+        <w:t xml:space="preserve">normale</w:t>
+      </w:r>
+      <w:r>
+        <w:t xml:space="preserve"> </w:t>
+      </w:r>
+      <m:oMath>
+        <m:r>
+          <m:rPr>
+            <m:sty m:val="p"/>
             <m:scr m:val="script"/>
-            <m:sty m:val="p"/>
           </m:rPr>
           <m:t>N</m:t>
         </m:r>
-        <m:r>
-          <m:rPr>
-            <m:sty m:val="p"/>
-          </m:rPr>
-          <m:t>(</m:t>
-        </m:r>
-        <m:r>
-          <m:t>0</m:t>
-        </m:r>
-        <m:r>
-          <m:rPr>
-            <m:sty m:val="p"/>
-          </m:rPr>
-          <m:t>,</m:t>
-        </m:r>
-        <m:r>
-          <m:t>1</m:t>
-        </m:r>
-        <m:r>
-          <m:rPr>
-            <m:sty m:val="p"/>
-          </m:rPr>
-          <m:t>)</m:t>
-        </m:r>
-      </m:oMath>
-      <w:r>
-        <w:t xml:space="preserve"> </w:t>
-      </w:r>
-      <w:r>
-        <w:t xml:space="preserve">est fournie. Les calculatrices sont autorisées.</w:t>
-      </w:r>
-      <w:r>
-        <w:t xml:space="preserve"> </w:t>
-      </w:r>
-      <w:r>
-        <w:t xml:space="preserve">Toute réponse doit être</w:t>
+        <m:d>
+          <m:dPr>
+            <m:begChr m:val="("/>
+            <m:endChr m:val=")"/>
+            <m:sepChr m:val=""/>
+            <m:grow/>
+          </m:dPr>
+          <m:e>
+            <m:r>
+              <m:t>0</m:t>
+            </m:r>
+            <m:r>
+              <m:rPr>
+                <m:sty m:val="p"/>
+              </m:rPr>
+              <m:t>,</m:t>
+            </m:r>
+            <m:r>
+              <m:t>1</m:t>
+            </m:r>
+          </m:e>
+        </m:d>
+      </m:oMath>
+      <w:r>
+        <w:t xml:space="preserve"> </w:t>
+      </w:r>
+      <w:r>
+        <w:t xml:space="preserve">est</w:t>
+      </w:r>
+      <w:r>
+        <w:t xml:space="preserve"> </w:t>
+      </w:r>
+      <w:r>
+        <w:t xml:space="preserve">fournie.</w:t>
+      </w:r>
+      <w:r>
+        <w:t xml:space="preserve"> </w:t>
+      </w:r>
+      <w:r>
+        <w:t xml:space="preserve">Les</w:t>
+      </w:r>
+      <w:r>
+        <w:t xml:space="preserve"> </w:t>
+      </w:r>
+      <w:r>
+        <w:t xml:space="preserve">calculatrices</w:t>
+      </w:r>
+      <w:r>
+        <w:t xml:space="preserve"> </w:t>
+      </w:r>
+      <w:r>
+        <w:t xml:space="preserve">sont</w:t>
+      </w:r>
+      <w:r>
+        <w:t xml:space="preserve"> </w:t>
+      </w:r>
+      <w:r>
+        <w:t xml:space="preserve">autorisées.</w:t>
+      </w:r>
+      <w:r>
+        <w:t xml:space="preserve"> </w:t>
+      </w:r>
+      <w:r>
+        <w:t xml:space="preserve">Toute</w:t>
+      </w:r>
+      <w:r>
+        <w:t xml:space="preserve"> </w:t>
+      </w:r>
+      <w:r>
+        <w:t xml:space="preserve">réponse</w:t>
+      </w:r>
+      <w:r>
+        <w:t xml:space="preserve"> </w:t>
+      </w:r>
+      <w:r>
+        <w:t xml:space="preserve">doit</w:t>
+      </w:r>
+      <w:r>
+        <w:t xml:space="preserve"> </w:t>
+      </w:r>
+      <w:r>
+        <w:t xml:space="preserve">être</w:t>
       </w:r>
       <w:r>
         <w:t xml:space="preserve"> </w:t>
       </w:r>
       <w:r>
         <w:rPr>
+          <w:bCs/>
           <w:b/>
-          <w:bCs/>
         </w:rPr>
         <w:t xml:space="preserve">justifiée</w:t>
       </w:r>
       <w:r>
-        <w:t xml:space="preserve">. Les résultats numériques seront arrondis</w:t>
+        <w:t xml:space="preserve">.</w:t>
+      </w:r>
+      <w:r>
+        <w:t xml:space="preserve"> </w:t>
+      </w:r>
+      <w:r>
+        <w:t xml:space="preserve">Les</w:t>
+      </w:r>
+      <w:r>
+        <w:t xml:space="preserve"> </w:t>
+      </w:r>
+      <w:r>
+        <w:t xml:space="preserve">résultats</w:t>
+      </w:r>
+      <w:r>
+        <w:t xml:space="preserve"> </w:t>
+      </w:r>
+      <w:r>
+        <w:t xml:space="preserve">numériques</w:t>
+      </w:r>
+      <w:r>
+        <w:t xml:space="preserve"> </w:t>
+      </w:r>
+      <w:r>
+        <w:t xml:space="preserve">seront</w:t>
+      </w:r>
+      <w:r>
+        <w:t xml:space="preserve"> </w:t>
+      </w:r>
+      <w:r>
+        <w:t xml:space="preserve">arrondis</w:t>
       </w:r>
       <w:r>
         <w:t xml:space="preserve"> </w:t>
@@ -176,8 +436,8 @@
       </w:pPr>
       <w:r>
         <w:rPr>
+          <w:bCs/>
           <w:b/>
-          <w:bCs/>
         </w:rPr>
         <w:t xml:space="preserve">Barème indicatif :</w:t>
       </w:r>
@@ -195,7 +455,7 @@
         </w:pict>
       </w:r>
     </w:p>
-    <w:bookmarkStart w:id="11" w:name="Xfccd592e24640188c0f115adf4b28d9d75faec0"/>
+    <w:bookmarkStart w:id="22" w:name="Xfccd592e24640188c0f115adf4b28d9d75faec0"/>
     <w:p>
       <w:pPr>
         <w:pStyle w:val="Heading2"/>
@@ -204,7 +464,7 @@
         <w:t xml:space="preserve">Exercice 1 — Statistiques descriptives (30 points)</w:t>
       </w:r>
     </w:p>
-    <w:bookmarkStart w:id="9" w:name="partie-a-série-discrète-18-points"/>
+    <w:bookmarkStart w:id="20" w:name="partie-a-série-discrète-18-points"/>
     <w:p>
       <w:pPr>
         <w:pStyle w:val="Heading3"/>
@@ -232,6 +492,7 @@
         <w:tblStyle w:val="Table"/>
         <w:tblW w:type="auto" w:w="0"/>
         <w:tblLook w:firstRow="1" w:lastRow="0" w:firstColumn="0" w:lastColumn="0" w:noHBand="0" w:noVBand="0" w:val="0020"/>
+        <w:jc w:val="start"/>
       </w:tblPr>
       <w:tblGrid>
         <w:gridCol w:w="1131"/>
@@ -244,7 +505,7 @@
       </w:tblGrid>
       <w:tr>
         <w:trPr>
-          <w:tblHeader w:val="on"/>
+          <w:tblHeader w:val="true"/>
         </w:trPr>
         <w:tc>
           <w:tcPr/>
@@ -344,8 +605,8 @@
             </w:pPr>
             <w:r>
               <w:rPr>
+                <w:bCs/>
                 <w:b/>
-                <w:bCs/>
               </w:rPr>
               <w:t xml:space="preserve">Total</w:t>
             </w:r>
@@ -451,8 +712,8 @@
             </w:pPr>
             <w:r>
               <w:rPr>
+                <w:bCs/>
                 <w:b/>
-                <w:bCs/>
               </w:rPr>
               <w:t xml:space="preserve">40</w:t>
             </w:r>
@@ -538,8 +799,8 @@
             </w:pPr>
             <w:r>
               <w:rPr>
+                <w:bCs/>
                 <w:b/>
-                <w:bCs/>
               </w:rPr>
               <w:t xml:space="preserve">1</w:t>
             </w:r>
@@ -727,8 +988,8 @@
       </w:pPr>
       <w:r>
         <w:rPr>
+          <w:bCs/>
           <w:b/>
-          <w:bCs/>
         </w:rPr>
         <w:t xml:space="preserve">1.</w:t>
       </w:r>
@@ -737,8 +998,8 @@
       </w:r>
       <w:r>
         <w:rPr>
+          <w:iCs/>
           <w:i/>
-          <w:iCs/>
         </w:rPr>
         <w:t xml:space="preserve">(3 pts)</w:t>
       </w:r>
@@ -761,8 +1022,8 @@
       </w:pPr>
       <w:r>
         <w:rPr>
+          <w:bCs/>
           <w:b/>
-          <w:bCs/>
         </w:rPr>
         <w:t xml:space="preserve">2.</w:t>
       </w:r>
@@ -771,8 +1032,8 @@
       </w:r>
       <w:r>
         <w:rPr>
+          <w:iCs/>
           <w:i/>
-          <w:iCs/>
         </w:rPr>
         <w:t xml:space="preserve">(5 pts)</w:t>
       </w:r>
@@ -875,8 +1136,8 @@
       </w:pPr>
       <w:r>
         <w:rPr>
+          <w:bCs/>
           <w:b/>
-          <w:bCs/>
         </w:rPr>
         <w:t xml:space="preserve">3.</w:t>
       </w:r>
@@ -885,8 +1146,8 @@
       </w:r>
       <w:r>
         <w:rPr>
+          <w:iCs/>
           <w:i/>
-          <w:iCs/>
         </w:rPr>
         <w:t xml:space="preserve">(6 pts)</w:t>
       </w:r>
@@ -963,21 +1224,19 @@
           </m:rPr>
           <m:t>r</m:t>
         </m:r>
-        <m:r>
-          <m:rPr>
-            <m:sty m:val="p"/>
-          </m:rPr>
-          <m:t>(</m:t>
-        </m:r>
-        <m:r>
-          <m:t>x</m:t>
-        </m:r>
-        <m:r>
-          <m:rPr>
-            <m:sty m:val="p"/>
-          </m:rPr>
-          <m:t>)</m:t>
-        </m:r>
+        <m:d>
+          <m:dPr>
+            <m:begChr m:val="("/>
+            <m:endChr m:val=")"/>
+            <m:sepChr m:val=""/>
+            <m:grow/>
+          </m:dPr>
+          <m:e>
+            <m:r>
+              <m:t>x</m:t>
+            </m:r>
+          </m:e>
+        </m:d>
       </m:oMath>
       <w:r>
         <w:t xml:space="preserve"> </w:t>
@@ -990,22 +1249,22 @@
       </w:r>
       <w:r>
         <w:rPr>
+          <w:bCs/>
           <w:b/>
-          <w:bCs/>
         </w:rPr>
         <w:t xml:space="preserve">formule de</w:t>
       </w:r>
       <w:r>
         <w:rPr>
+          <w:bCs/>
           <w:b/>
+        </w:rPr>
+        <w:t xml:space="preserve"> </w:t>
+      </w:r>
+      <w:r>
+        <w:rPr>
           <w:bCs/>
-        </w:rPr>
-        <w:t xml:space="preserve"> </w:t>
-      </w:r>
-      <w:r>
-        <w:rPr>
           <w:b/>
-          <w:bCs/>
         </w:rPr>
         <w:t xml:space="preserve">König-Huygens</w:t>
       </w:r>
@@ -1022,21 +1281,19 @@
         <m:r>
           <m:t>σ</m:t>
         </m:r>
-        <m:r>
-          <m:rPr>
-            <m:sty m:val="p"/>
-          </m:rPr>
-          <m:t>(</m:t>
-        </m:r>
-        <m:r>
-          <m:t>x</m:t>
-        </m:r>
-        <m:r>
-          <m:rPr>
-            <m:sty m:val="p"/>
-          </m:rPr>
-          <m:t>)</m:t>
-        </m:r>
+        <m:d>
+          <m:dPr>
+            <m:begChr m:val="("/>
+            <m:endChr m:val=")"/>
+            <m:sepChr m:val=""/>
+            <m:grow/>
+          </m:dPr>
+          <m:e>
+            <m:r>
+              <m:t>x</m:t>
+            </m:r>
+          </m:e>
+        </m:d>
       </m:oMath>
       <w:r>
         <w:t xml:space="preserve">.</w:t>
@@ -1048,8 +1305,8 @@
       </w:pPr>
       <w:r>
         <w:rPr>
+          <w:bCs/>
           <w:b/>
-          <w:bCs/>
         </w:rPr>
         <w:t xml:space="preserve">4.</w:t>
       </w:r>
@@ -1058,8 +1315,8 @@
       </w:r>
       <w:r>
         <w:rPr>
+          <w:iCs/>
           <w:i/>
-          <w:iCs/>
         </w:rPr>
         <w:t xml:space="preserve">(4 pts)</w:t>
       </w:r>
@@ -1147,21 +1404,19 @@
           </m:rPr>
           <m:t>r</m:t>
         </m:r>
-        <m:r>
-          <m:rPr>
-            <m:sty m:val="p"/>
-          </m:rPr>
-          <m:t>(</m:t>
-        </m:r>
-        <m:r>
-          <m:t>Y</m:t>
-        </m:r>
-        <m:r>
-          <m:rPr>
-            <m:sty m:val="p"/>
-          </m:rPr>
-          <m:t>)</m:t>
-        </m:r>
+        <m:d>
+          <m:dPr>
+            <m:begChr m:val="("/>
+            <m:endChr m:val=")"/>
+            <m:sepChr m:val=""/>
+            <m:grow/>
+          </m:dPr>
+          <m:e>
+            <m:r>
+              <m:t>Y</m:t>
+            </m:r>
+          </m:e>
+        </m:d>
       </m:oMath>
       <w:r>
         <w:t xml:space="preserve"> </w:t>
@@ -1176,21 +1431,19 @@
         <m:r>
           <m:t>σ</m:t>
         </m:r>
-        <m:r>
-          <m:rPr>
-            <m:sty m:val="p"/>
-          </m:rPr>
-          <m:t>(</m:t>
-        </m:r>
-        <m:r>
-          <m:t>Y</m:t>
-        </m:r>
-        <m:r>
-          <m:rPr>
-            <m:sty m:val="p"/>
-          </m:rPr>
-          <m:t>)</m:t>
-        </m:r>
+        <m:d>
+          <m:dPr>
+            <m:begChr m:val="("/>
+            <m:endChr m:val=")"/>
+            <m:sepChr m:val=""/>
+            <m:grow/>
+          </m:dPr>
+          <m:e>
+            <m:r>
+              <m:t>Y</m:t>
+            </m:r>
+          </m:e>
+        </m:d>
       </m:oMath>
       <w:r>
         <w:t xml:space="preserve">.</w:t>
@@ -1203,8 +1456,8 @@
         </w:pict>
       </w:r>
     </w:p>
-    <w:bookmarkEnd w:id="9"/>
-    <w:bookmarkStart w:id="10" w:name="Xc1d90aa52659a89ab1be1e11e265869bad25306"/>
+    <w:bookmarkEnd w:id="20"/>
+    <w:bookmarkStart w:id="21" w:name="Xc1d90aa52659a89ab1be1e11e265869bad25306"/>
     <w:p>
       <w:pPr>
         <w:pStyle w:val="Heading3"/>
@@ -1226,6 +1479,7 @@
         <w:tblStyle w:val="Table"/>
         <w:tblW w:type="auto" w:w="0"/>
         <w:tblLook w:firstRow="1" w:lastRow="0" w:firstColumn="0" w:lastColumn="0" w:noHBand="0" w:noVBand="0" w:val="0020"/>
+        <w:jc w:val="start"/>
       </w:tblPr>
       <w:tblGrid>
         <w:gridCol w:w="1584"/>
@@ -1236,7 +1490,7 @@
       </w:tblGrid>
       <w:tr>
         <w:trPr>
-          <w:tblHeader w:val="on"/>
+          <w:tblHeader w:val="true"/>
         </w:trPr>
         <w:tc>
           <w:tcPr/>
@@ -1501,8 +1755,8 @@
       </w:pPr>
       <w:r>
         <w:rPr>
+          <w:bCs/>
           <w:b/>
-          <w:bCs/>
         </w:rPr>
         <w:t xml:space="preserve">5.</w:t>
       </w:r>
@@ -1511,8 +1765,8 @@
       </w:r>
       <w:r>
         <w:rPr>
+          <w:iCs/>
           <w:i/>
-          <w:iCs/>
         </w:rPr>
         <w:t xml:space="preserve">(6 pts)</w:t>
       </w:r>
@@ -1646,8 +1900,8 @@
       </w:pPr>
       <w:r>
         <w:rPr>
+          <w:bCs/>
           <w:b/>
-          <w:bCs/>
         </w:rPr>
         <w:t xml:space="preserve">6.</w:t>
       </w:r>
@@ -1656,8 +1910,8 @@
       </w:r>
       <w:r>
         <w:rPr>
+          <w:iCs/>
           <w:i/>
-          <w:iCs/>
         </w:rPr>
         <w:t xml:space="preserve">(6 pts)</w:t>
       </w:r>
@@ -1716,21 +1970,19 @@
           </m:rPr>
           <m:t>r</m:t>
         </m:r>
-        <m:r>
-          <m:rPr>
-            <m:sty m:val="p"/>
-          </m:rPr>
-          <m:t>(</m:t>
-        </m:r>
-        <m:r>
-          <m:t>x</m:t>
-        </m:r>
-        <m:r>
-          <m:rPr>
-            <m:sty m:val="p"/>
-          </m:rPr>
-          <m:t>)</m:t>
-        </m:r>
+        <m:d>
+          <m:dPr>
+            <m:begChr m:val="("/>
+            <m:endChr m:val=")"/>
+            <m:sepChr m:val=""/>
+            <m:grow/>
+          </m:dPr>
+          <m:e>
+            <m:r>
+              <m:t>x</m:t>
+            </m:r>
+          </m:e>
+        </m:d>
       </m:oMath>
       <w:r>
         <w:t xml:space="preserve"> </w:t>
@@ -1743,22 +1995,22 @@
       </w:r>
       <w:r>
         <w:rPr>
+          <w:bCs/>
           <w:b/>
-          <w:bCs/>
         </w:rPr>
         <w:t xml:space="preserve">centres</w:t>
       </w:r>
       <w:r>
         <w:rPr>
+          <w:bCs/>
           <w:b/>
+        </w:rPr>
+        <w:t xml:space="preserve"> </w:t>
+      </w:r>
+      <w:r>
+        <w:rPr>
           <w:bCs/>
-        </w:rPr>
-        <w:t xml:space="preserve"> </w:t>
-      </w:r>
-      <w:r>
-        <w:rPr>
           <w:b/>
-          <w:bCs/>
         </w:rPr>
         <w:t xml:space="preserve">de classe</w:t>
       </w:r>
@@ -1773,9 +2025,9 @@
         </w:pict>
       </w:r>
     </w:p>
-    <w:bookmarkEnd w:id="10"/>
-    <w:bookmarkEnd w:id="11"/>
-    <w:bookmarkStart w:id="12" w:name="X4e4a7e683ca1cf4f03592b6949daef2b68d11a3"/>
+    <w:bookmarkEnd w:id="21"/>
+    <w:bookmarkEnd w:id="22"/>
+    <w:bookmarkStart w:id="23" w:name="X4e4a7e683ca1cf4f03592b6949daef2b68d11a3"/>
     <w:p>
       <w:pPr>
         <w:pStyle w:val="Heading2"/>
@@ -1811,8 +2063,8 @@
       <m:oMath>
         <m:r>
           <m:rPr>
+            <m:sty m:val="p"/>
             <m:scr m:val="double-struck"/>
-            <m:sty m:val="p"/>
           </m:rPr>
           <m:t>R</m:t>
         </m:r>
@@ -1836,21 +2088,19 @@
           <m:r>
             <m:t>f</m:t>
           </m:r>
-          <m:r>
-            <m:rPr>
-              <m:sty m:val="p"/>
-            </m:rPr>
-            <m:t>(</m:t>
-          </m:r>
-          <m:r>
-            <m:t>x</m:t>
-          </m:r>
-          <m:r>
-            <m:rPr>
-              <m:sty m:val="p"/>
-            </m:rPr>
-            <m:t>)</m:t>
-          </m:r>
+          <m:d>
+            <m:dPr>
+              <m:begChr m:val="("/>
+              <m:endChr m:val=")"/>
+              <m:sepChr m:val=""/>
+              <m:grow/>
+            </m:dPr>
+            <m:e>
+              <m:r>
+                <m:t>x</m:t>
+              </m:r>
+            </m:e>
+          </m:d>
           <m:r>
             <m:rPr>
               <m:sty m:val="p"/>
@@ -1860,8 +2110,8 @@
           <m:d>
             <m:dPr>
               <m:begChr m:val="{"/>
+              <m:endChr m:val=""/>
               <m:sepChr m:val=""/>
-              <m:endChr m:val=""/>
               <m:grow/>
             </m:dPr>
             <m:e>
@@ -1898,30 +2148,28 @@
                     <m:r>
                       <m:t> </m:t>
                     </m:r>
-                    <m:r>
-                      <m:rPr>
-                        <m:sty m:val="p"/>
-                      </m:rPr>
-                      <m:t>(</m:t>
-                    </m:r>
-                    <m:r>
-                      <m:t>1</m:t>
-                    </m:r>
-                    <m:r>
-                      <m:rPr>
-                        <m:sty m:val="p"/>
-                      </m:rPr>
-                      <m:t>−</m:t>
-                    </m:r>
-                    <m:r>
-                      <m:t>x</m:t>
-                    </m:r>
-                    <m:r>
-                      <m:rPr>
-                        <m:sty m:val="p"/>
-                      </m:rPr>
-                      <m:t>)</m:t>
-                    </m:r>
+                    <m:d>
+                      <m:dPr>
+                        <m:begChr m:val="("/>
+                        <m:endChr m:val=")"/>
+                        <m:sepChr m:val=""/>
+                        <m:grow/>
+                      </m:dPr>
+                      <m:e>
+                        <m:r>
+                          <m:t>1</m:t>
+                        </m:r>
+                        <m:r>
+                          <m:rPr>
+                            <m:sty m:val="p"/>
+                          </m:rPr>
+                          <m:t>−</m:t>
+                        </m:r>
+                        <m:r>
+                          <m:t>x</m:t>
+                        </m:r>
+                      </m:e>
+                    </m:d>
                   </m:e>
                   <m:e>
                     <m:r>
@@ -1940,36 +2188,34 @@
                       </m:rPr>
                       <m:t>∈</m:t>
                     </m:r>
-                    <m:r>
-                      <m:rPr>
-                        <m:sty m:val="p"/>
-                      </m:rPr>
-                      <m:t>[</m:t>
-                    </m:r>
-                    <m:r>
-                      <m:t>0</m:t>
-                    </m:r>
-                    <m:r>
-                      <m:t> </m:t>
-                    </m:r>
-                    <m:r>
-                      <m:rPr>
-                        <m:sty m:val="p"/>
-                      </m:rPr>
-                      <m:t>;</m:t>
-                    </m:r>
-                    <m:r>
-                      <m:t> </m:t>
-                    </m:r>
-                    <m:r>
-                      <m:t>1</m:t>
-                    </m:r>
-                    <m:r>
-                      <m:rPr>
-                        <m:sty m:val="p"/>
-                      </m:rPr>
-                      <m:t>]</m:t>
-                    </m:r>
+                    <m:d>
+                      <m:dPr>
+                        <m:begChr m:val="["/>
+                        <m:endChr m:val="]"/>
+                        <m:sepChr m:val=""/>
+                        <m:grow/>
+                      </m:dPr>
+                      <m:e>
+                        <m:r>
+                          <m:t>0</m:t>
+                        </m:r>
+                        <m:r>
+                          <m:t> </m:t>
+                        </m:r>
+                        <m:r>
+                          <m:rPr>
+                            <m:sty m:val="p"/>
+                          </m:rPr>
+                          <m:t>;</m:t>
+                        </m:r>
+                        <m:r>
+                          <m:t> </m:t>
+                        </m:r>
+                        <m:r>
+                          <m:t>1</m:t>
+                        </m:r>
+                      </m:e>
+                    </m:d>
                     <m:r>
                       <m:rPr>
                         <m:sty m:val="p"/>
@@ -2006,8 +2252,8 @@
       </w:pPr>
       <w:r>
         <w:rPr>
+          <w:bCs/>
           <w:b/>
-          <w:bCs/>
         </w:rPr>
         <w:t xml:space="preserve">1.</w:t>
       </w:r>
@@ -2016,8 +2262,8 @@
       </w:r>
       <w:r>
         <w:rPr>
+          <w:iCs/>
           <w:i/>
-          <w:iCs/>
         </w:rPr>
         <w:t xml:space="preserve">(5 pts)</w:t>
       </w:r>
@@ -2034,12 +2280,39 @@
         <m:r>
           <m:t>f</m:t>
         </m:r>
-        <m:r>
-          <m:rPr>
-            <m:sty m:val="p"/>
-          </m:rPr>
-          <m:t>(</m:t>
-        </m:r>
+        <m:d>
+          <m:dPr>
+            <m:begChr m:val="("/>
+            <m:endChr m:val=")"/>
+            <m:sepChr m:val=""/>
+            <m:grow/>
+          </m:dPr>
+          <m:e>
+            <m:r>
+              <m:t>x</m:t>
+            </m:r>
+          </m:e>
+        </m:d>
+        <m:r>
+          <m:rPr>
+            <m:sty m:val="p"/>
+          </m:rPr>
+          <m:t>≥</m:t>
+        </m:r>
+        <m:r>
+          <m:t>0</m:t>
+        </m:r>
+      </m:oMath>
+      <w:r>
+        <w:t xml:space="preserve"> </w:t>
+      </w:r>
+      <w:r>
+        <w:t xml:space="preserve">pour tout</w:t>
+      </w:r>
+      <w:r>
+        <w:t xml:space="preserve"> </w:t>
+      </w:r>
+      <m:oMath>
         <m:r>
           <m:t>x</m:t>
         </m:r>
@@ -2047,67 +2320,36 @@
           <m:rPr>
             <m:sty m:val="p"/>
           </m:rPr>
-          <m:t>)</m:t>
-        </m:r>
-        <m:r>
-          <m:rPr>
-            <m:sty m:val="p"/>
-          </m:rPr>
-          <m:t>≥</m:t>
-        </m:r>
-        <m:r>
-          <m:t>0</m:t>
-        </m:r>
-      </m:oMath>
-      <w:r>
-        <w:t xml:space="preserve"> </w:t>
-      </w:r>
-      <w:r>
-        <w:t xml:space="preserve">pour tout</w:t>
-      </w:r>
-      <w:r>
-        <w:t xml:space="preserve"> </w:t>
-      </w:r>
-      <m:oMath>
-        <m:r>
-          <m:t>x</m:t>
-        </m:r>
-        <m:r>
-          <m:rPr>
-            <m:sty m:val="p"/>
-          </m:rPr>
           <m:t>∈</m:t>
         </m:r>
-        <m:r>
-          <m:rPr>
-            <m:sty m:val="p"/>
-          </m:rPr>
-          <m:t>[</m:t>
-        </m:r>
-        <m:r>
-          <m:t>0</m:t>
-        </m:r>
-        <m:r>
-          <m:t> </m:t>
-        </m:r>
-        <m:r>
-          <m:rPr>
-            <m:sty m:val="p"/>
-          </m:rPr>
-          <m:t>;</m:t>
-        </m:r>
-        <m:r>
-          <m:t> </m:t>
-        </m:r>
-        <m:r>
-          <m:t>1</m:t>
-        </m:r>
-        <m:r>
-          <m:rPr>
-            <m:sty m:val="p"/>
-          </m:rPr>
-          <m:t>]</m:t>
-        </m:r>
+        <m:d>
+          <m:dPr>
+            <m:begChr m:val="["/>
+            <m:endChr m:val="]"/>
+            <m:sepChr m:val=""/>
+            <m:grow/>
+          </m:dPr>
+          <m:e>
+            <m:r>
+              <m:t>0</m:t>
+            </m:r>
+            <m:r>
+              <m:t> </m:t>
+            </m:r>
+            <m:r>
+              <m:rPr>
+                <m:sty m:val="p"/>
+              </m:rPr>
+              <m:t>;</m:t>
+            </m:r>
+            <m:r>
+              <m:t> </m:t>
+            </m:r>
+            <m:r>
+              <m:t>1</m:t>
+            </m:r>
+          </m:e>
+        </m:d>
       </m:oMath>
       <w:r>
         <w:t xml:space="preserve">.</w:t>
@@ -2145,30 +2387,28 @@
             </m:r>
           </m:e>
         </m:nary>
-        <m:r>
-          <m:rPr>
-            <m:sty m:val="p"/>
-          </m:rPr>
-          <m:t>(</m:t>
-        </m:r>
-        <m:r>
-          <m:t>1</m:t>
-        </m:r>
-        <m:r>
-          <m:rPr>
-            <m:sty m:val="p"/>
-          </m:rPr>
-          <m:t>−</m:t>
-        </m:r>
-        <m:r>
-          <m:t>x</m:t>
-        </m:r>
-        <m:r>
-          <m:rPr>
-            <m:sty m:val="p"/>
-          </m:rPr>
-          <m:t>)</m:t>
-        </m:r>
+        <m:d>
+          <m:dPr>
+            <m:begChr m:val="("/>
+            <m:endChr m:val=")"/>
+            <m:sepChr m:val=""/>
+            <m:grow/>
+          </m:dPr>
+          <m:e>
+            <m:r>
+              <m:t>1</m:t>
+            </m:r>
+            <m:r>
+              <m:rPr>
+                <m:sty m:val="p"/>
+              </m:rPr>
+              <m:t>−</m:t>
+            </m:r>
+            <m:r>
+              <m:t>x</m:t>
+            </m:r>
+          </m:e>
+        </m:d>
         <m:r>
           <m:t> </m:t>
         </m:r>
@@ -2251,8 +2491,8 @@
       </w:r>
       <w:r>
         <w:rPr>
+          <w:bCs/>
           <w:b/>
-          <w:bCs/>
         </w:rPr>
         <w:t xml:space="preserve">densité de probabilité</w:t>
       </w:r>
@@ -2268,8 +2508,8 @@
       <m:oMath>
         <m:r>
           <m:rPr>
+            <m:sty m:val="p"/>
             <m:scr m:val="double-struck"/>
-            <m:sty m:val="p"/>
           </m:rPr>
           <m:t>R</m:t>
         </m:r>
@@ -2284,8 +2524,8 @@
       </w:pPr>
       <w:r>
         <w:rPr>
+          <w:bCs/>
           <w:b/>
-          <w:bCs/>
         </w:rPr>
         <w:t xml:space="preserve">2.</w:t>
       </w:r>
@@ -2294,8 +2534,8 @@
       </w:r>
       <w:r>
         <w:rPr>
+          <w:iCs/>
           <w:i/>
-          <w:iCs/>
         </w:rPr>
         <w:t xml:space="preserve">(8 pts)</w:t>
       </w:r>
@@ -2335,22 +2575,22 @@
       </w:r>
       <w:r>
         <w:rPr>
+          <w:bCs/>
           <w:b/>
-          <w:bCs/>
         </w:rPr>
         <w:t xml:space="preserve">fonction de</w:t>
       </w:r>
       <w:r>
         <w:rPr>
+          <w:bCs/>
           <w:b/>
+        </w:rPr>
+        <w:t xml:space="preserve"> </w:t>
+      </w:r>
+      <w:r>
+        <w:rPr>
           <w:bCs/>
-        </w:rPr>
-        <w:t xml:space="preserve"> </w:t>
-      </w:r>
-      <w:r>
-        <w:rPr>
           <w:b/>
-          <w:bCs/>
         </w:rPr>
         <w:t xml:space="preserve">répartition</w:t>
       </w:r>
@@ -2397,8 +2637,8 @@
       <m:oMath>
         <m:r>
           <m:rPr>
+            <m:sty m:val="p"/>
             <m:scr m:val="double-struck"/>
-            <m:sty m:val="p"/>
           </m:rPr>
           <m:t>R</m:t>
         </m:r>
@@ -2482,8 +2722,8 @@
       </w:pPr>
       <w:r>
         <w:rPr>
+          <w:bCs/>
           <w:b/>
-          <w:bCs/>
         </w:rPr>
         <w:t xml:space="preserve">3.</w:t>
       </w:r>
@@ -2492,8 +2732,8 @@
       </w:r>
       <w:r>
         <w:rPr>
+          <w:iCs/>
           <w:i/>
-          <w:iCs/>
         </w:rPr>
         <w:t xml:space="preserve">(4 pts)</w:t>
       </w:r>
@@ -2519,49 +2759,47 @@
             </m:r>
           </m:sub>
         </m:sSub>
-        <m:r>
-          <m:rPr>
-            <m:sty m:val="p"/>
-          </m:rPr>
-          <m:t>(</m:t>
-        </m:r>
-        <m:r>
-          <m:t>1</m:t>
-        </m:r>
-        <m:r>
-          <m:rPr>
-            <m:sty m:val="p"/>
-          </m:rPr>
-          <m:t>)</m:t>
-        </m:r>
-        <m:r>
-          <m:rPr>
-            <m:sty m:val="p"/>
-          </m:rPr>
-          <m:t>=</m:t>
-        </m:r>
-        <m:r>
-          <m:t>1</m:t>
-        </m:r>
-      </m:oMath>
-      <w:r>
-        <w:t xml:space="preserve">, puis calculer</w:t>
-      </w:r>
-      <w:r>
-        <w:t xml:space="preserve"> </w:t>
-      </w:r>
-      <m:oMath>
-        <m:r>
-          <m:t>P</m:t>
-        </m:r>
-        <m:r>
-          <m:t>​</m:t>
-        </m:r>
         <m:d>
           <m:dPr>
             <m:begChr m:val="("/>
+            <m:endChr m:val=")"/>
             <m:sepChr m:val=""/>
+            <m:grow/>
+          </m:dPr>
+          <m:e>
+            <m:r>
+              <m:t>1</m:t>
+            </m:r>
+          </m:e>
+        </m:d>
+        <m:r>
+          <m:rPr>
+            <m:sty m:val="p"/>
+          </m:rPr>
+          <m:t>=</m:t>
+        </m:r>
+        <m:r>
+          <m:t>1</m:t>
+        </m:r>
+      </m:oMath>
+      <w:r>
+        <w:t xml:space="preserve">, puis calculer</w:t>
+      </w:r>
+      <w:r>
+        <w:t xml:space="preserve"> </w:t>
+      </w:r>
+      <m:oMath>
+        <m:r>
+          <m:t>P</m:t>
+        </m:r>
+        <m:r>
+          <m:t>​</m:t>
+        </m:r>
+        <m:d>
+          <m:dPr>
+            <m:begChr m:val="("/>
             <m:endChr m:val=")"/>
+            <m:sepChr m:val=""/>
             <m:grow/>
           </m:dPr>
           <m:e>
@@ -2625,8 +2863,8 @@
       </w:pPr>
       <w:r>
         <w:rPr>
+          <w:bCs/>
           <w:b/>
-          <w:bCs/>
         </w:rPr>
         <w:t xml:space="preserve">4.</w:t>
       </w:r>
@@ -2635,8 +2873,8 @@
       </w:r>
       <w:r>
         <w:rPr>
+          <w:iCs/>
           <w:i/>
-          <w:iCs/>
         </w:rPr>
         <w:t xml:space="preserve">(5 pts)</w:t>
       </w:r>
@@ -2665,15 +2903,15 @@
       </w:r>
       <w:r>
         <w:rPr>
+          <w:bCs/>
           <w:b/>
-          <w:bCs/>
         </w:rPr>
         <w:t xml:space="preserve">symétrique par rapport à</w:t>
       </w:r>
       <w:r>
         <w:rPr>
+          <w:bCs/>
           <w:b/>
-          <w:bCs/>
         </w:rPr>
         <w:t xml:space="preserve"> </w:t>
       </w:r>
@@ -2719,8 +2957,8 @@
         <m:d>
           <m:dPr>
             <m:begChr m:val="("/>
+            <m:endChr m:val=")"/>
             <m:sepChr m:val=""/>
-            <m:endChr m:val=")"/>
             <m:grow/>
           </m:dPr>
           <m:e>
@@ -2765,8 +3003,8 @@
         <m:d>
           <m:dPr>
             <m:begChr m:val="("/>
+            <m:endChr m:val=")"/>
             <m:sepChr m:val=""/>
-            <m:endChr m:val=")"/>
             <m:grow/>
           </m:dPr>
           <m:e>
@@ -2818,8 +3056,8 @@
         </m:r>
         <m:r>
           <m:rPr>
+            <m:sty m:val="p"/>
             <m:scr m:val="double-struck"/>
-            <m:sty m:val="p"/>
           </m:rPr>
           <m:t>R</m:t>
         </m:r>
@@ -2830,11 +3068,11 @@
     </w:p>
     <w:p>
       <w:pPr>
-        <w:pStyle w:val="Compact"/>
         <w:numPr>
           <w:ilvl w:val="0"/>
           <w:numId w:val="1001"/>
         </w:numPr>
+        <w:pStyle w:val="Compact"/>
       </w:pPr>
       <w:r>
         <w:t xml:space="preserve">Vérifier cette propriété de symétrie.</w:t>
@@ -2842,11 +3080,11 @@
     </w:p>
     <w:p>
       <w:pPr>
-        <w:pStyle w:val="Compact"/>
         <w:numPr>
           <w:ilvl w:val="0"/>
           <w:numId w:val="1001"/>
         </w:numPr>
+        <w:pStyle w:val="Compact"/>
       </w:pPr>
       <w:r>
         <w:t xml:space="preserve">En déduire</w:t>
@@ -2857,26 +3095,24 @@
       <m:oMath>
         <m:r>
           <m:rPr>
+            <m:sty m:val="p"/>
             <m:scr m:val="double-struck"/>
-            <m:sty m:val="p"/>
           </m:rPr>
           <m:t>E</m:t>
         </m:r>
-        <m:r>
-          <m:rPr>
-            <m:sty m:val="p"/>
-          </m:rPr>
-          <m:t>(</m:t>
-        </m:r>
-        <m:r>
-          <m:t>X</m:t>
-        </m:r>
-        <m:r>
-          <m:rPr>
-            <m:sty m:val="p"/>
-          </m:rPr>
-          <m:t>)</m:t>
-        </m:r>
+        <m:d>
+          <m:dPr>
+            <m:begChr m:val="("/>
+            <m:endChr m:val=")"/>
+            <m:sepChr m:val=""/>
+            <m:grow/>
+          </m:dPr>
+          <m:e>
+            <m:r>
+              <m:t>X</m:t>
+            </m:r>
+          </m:e>
+        </m:d>
       </m:oMath>
       <w:r>
         <w:t xml:space="preserve"> </w:t>
@@ -2891,8 +3127,8 @@
       </w:pPr>
       <w:r>
         <w:rPr>
+          <w:bCs/>
           <w:b/>
-          <w:bCs/>
         </w:rPr>
         <w:t xml:space="preserve">5.</w:t>
       </w:r>
@@ -2901,8 +3137,8 @@
       </w:r>
       <w:r>
         <w:rPr>
+          <w:iCs/>
           <w:i/>
-          <w:iCs/>
         </w:rPr>
         <w:t xml:space="preserve">(8 pts)</w:t>
       </w:r>
@@ -2918,35 +3154,33 @@
       <m:oMath>
         <m:r>
           <m:rPr>
+            <m:sty m:val="p"/>
             <m:scr m:val="double-struck"/>
-            <m:sty m:val="p"/>
           </m:rPr>
           <m:t>E</m:t>
         </m:r>
-        <m:r>
-          <m:rPr>
-            <m:sty m:val="p"/>
-          </m:rPr>
-          <m:t>(</m:t>
-        </m:r>
-        <m:sSup>
+        <m:d>
+          <m:dPr>
+            <m:begChr m:val="("/>
+            <m:endChr m:val=")"/>
+            <m:sepChr m:val=""/>
+            <m:grow/>
+          </m:dPr>
           <m:e>
-            <m:r>
-              <m:t>X</m:t>
-            </m:r>
+            <m:sSup>
+              <m:e>
+                <m:r>
+                  <m:t>X</m:t>
+                </m:r>
+              </m:e>
+              <m:sup>
+                <m:r>
+                  <m:t>2</m:t>
+                </m:r>
+              </m:sup>
+            </m:sSup>
           </m:e>
-          <m:sup>
-            <m:r>
-              <m:t>2</m:t>
-            </m:r>
-          </m:sup>
-        </m:sSup>
-        <m:r>
-          <m:rPr>
-            <m:sty m:val="p"/>
-          </m:rPr>
-          <m:t>)</m:t>
-        </m:r>
+        </m:d>
       </m:oMath>
       <w:r>
         <w:t xml:space="preserve"> </w:t>
@@ -2959,8 +3193,8 @@
       </w:r>
       <w:r>
         <w:rPr>
+          <w:bCs/>
           <w:b/>
-          <w:bCs/>
         </w:rPr>
         <w:t xml:space="preserve">théorème de transfert</w:t>
       </w:r>
@@ -2995,21 +3229,19 @@
           </m:rPr>
           <m:t>r</m:t>
         </m:r>
-        <m:r>
-          <m:rPr>
-            <m:sty m:val="p"/>
-          </m:rPr>
-          <m:t>(</m:t>
-        </m:r>
-        <m:r>
-          <m:t>X</m:t>
-        </m:r>
-        <m:r>
-          <m:rPr>
-            <m:sty m:val="p"/>
-          </m:rPr>
-          <m:t>)</m:t>
-        </m:r>
+        <m:d>
+          <m:dPr>
+            <m:begChr m:val="("/>
+            <m:endChr m:val=")"/>
+            <m:sepChr m:val=""/>
+            <m:grow/>
+          </m:dPr>
+          <m:e>
+            <m:r>
+              <m:t>X</m:t>
+            </m:r>
+          </m:e>
+        </m:d>
       </m:oMath>
       <w:r>
         <w:t xml:space="preserve"> </w:t>
@@ -3024,8 +3256,8 @@
       </w:pPr>
       <w:r>
         <w:rPr>
+          <w:bCs/>
           <w:b/>
-          <w:bCs/>
         </w:rPr>
         <w:t xml:space="preserve">6.</w:t>
       </w:r>
@@ -3034,8 +3266,8 @@
       </w:r>
       <w:r>
         <w:rPr>
+          <w:iCs/>
           <w:i/>
-          <w:iCs/>
         </w:rPr>
         <w:t xml:space="preserve">(5 pts)</w:t>
       </w:r>
@@ -3060,26 +3292,24 @@
         </m:r>
         <m:r>
           <m:rPr>
+            <m:sty m:val="p"/>
             <m:scr m:val="script"/>
-            <m:sty m:val="p"/>
           </m:rPr>
           <m:t>E</m:t>
         </m:r>
-        <m:r>
-          <m:rPr>
-            <m:sty m:val="p"/>
-          </m:rPr>
-          <m:t>(</m:t>
-        </m:r>
-        <m:r>
-          <m:t>λ</m:t>
-        </m:r>
-        <m:r>
-          <m:rPr>
-            <m:sty m:val="p"/>
-          </m:rPr>
-          <m:t>)</m:t>
-        </m:r>
+        <m:d>
+          <m:dPr>
+            <m:begChr m:val="("/>
+            <m:endChr m:val=")"/>
+            <m:sepChr m:val=""/>
+            <m:grow/>
+          </m:dPr>
+          <m:e>
+            <m:r>
+              <m:t>λ</m:t>
+            </m:r>
+          </m:e>
+        </m:d>
       </m:oMath>
       <w:r>
         <w:t xml:space="preserve"> </w:t>
@@ -3106,30 +3336,28 @@
           <m:r>
             <m:t>P</m:t>
           </m:r>
-          <m:r>
-            <m:rPr>
-              <m:sty m:val="p"/>
-            </m:rPr>
-            <m:t>(</m:t>
-          </m:r>
-          <m:r>
-            <m:t>T</m:t>
-          </m:r>
-          <m:r>
-            <m:rPr>
-              <m:sty m:val="p"/>
-            </m:rPr>
-            <m:t>&gt;</m:t>
-          </m:r>
-          <m:r>
-            <m:t>3</m:t>
-          </m:r>
-          <m:r>
-            <m:rPr>
-              <m:sty m:val="p"/>
-            </m:rPr>
-            <m:t>)</m:t>
-          </m:r>
+          <m:d>
+            <m:dPr>
+              <m:begChr m:val="("/>
+              <m:endChr m:val=")"/>
+              <m:sepChr m:val=""/>
+              <m:grow/>
+            </m:dPr>
+            <m:e>
+              <m:r>
+                <m:t>T</m:t>
+              </m:r>
+              <m:r>
+                <m:rPr>
+                  <m:sty m:val="p"/>
+                </m:rPr>
+                <m:t>&gt;</m:t>
+              </m:r>
+              <m:r>
+                <m:t>3</m:t>
+              </m:r>
+            </m:e>
+          </m:d>
           <m:r>
             <m:rPr>
               <m:sty m:val="p"/>
@@ -3190,26 +3418,24 @@
       <m:oMath>
         <m:r>
           <m:rPr>
+            <m:sty m:val="p"/>
             <m:scr m:val="double-struck"/>
-            <m:sty m:val="p"/>
           </m:rPr>
           <m:t>E</m:t>
         </m:r>
-        <m:r>
-          <m:rPr>
-            <m:sty m:val="p"/>
-          </m:rPr>
-          <m:t>(</m:t>
-        </m:r>
-        <m:r>
-          <m:t>T</m:t>
-        </m:r>
-        <m:r>
-          <m:rPr>
-            <m:sty m:val="p"/>
-          </m:rPr>
-          <m:t>)</m:t>
-        </m:r>
+        <m:d>
+          <m:dPr>
+            <m:begChr m:val="("/>
+            <m:endChr m:val=")"/>
+            <m:sepChr m:val=""/>
+            <m:grow/>
+          </m:dPr>
+          <m:e>
+            <m:r>
+              <m:t>T</m:t>
+            </m:r>
+          </m:e>
+        </m:d>
       </m:oMath>
       <w:r>
         <w:t xml:space="preserve">, puis calculer</w:t>
@@ -3221,30 +3447,28 @@
         <m:r>
           <m:t>P</m:t>
         </m:r>
-        <m:r>
-          <m:rPr>
-            <m:sty m:val="p"/>
-          </m:rPr>
-          <m:t>(</m:t>
-        </m:r>
-        <m:r>
-          <m:t>T</m:t>
-        </m:r>
-        <m:r>
-          <m:rPr>
-            <m:sty m:val="p"/>
-          </m:rPr>
-          <m:t>&gt;</m:t>
-        </m:r>
-        <m:r>
-          <m:t>1</m:t>
-        </m:r>
-        <m:r>
-          <m:rPr>
-            <m:sty m:val="p"/>
-          </m:rPr>
-          <m:t>)</m:t>
-        </m:r>
+        <m:d>
+          <m:dPr>
+            <m:begChr m:val="("/>
+            <m:endChr m:val=")"/>
+            <m:sepChr m:val=""/>
+            <m:grow/>
+          </m:dPr>
+          <m:e>
+            <m:r>
+              <m:t>T</m:t>
+            </m:r>
+            <m:r>
+              <m:rPr>
+                <m:sty m:val="p"/>
+              </m:rPr>
+              <m:t>&gt;</m:t>
+            </m:r>
+            <m:r>
+              <m:t>1</m:t>
+            </m:r>
+          </m:e>
+        </m:d>
       </m:oMath>
       <w:r>
         <w:t xml:space="preserve">.</w:t>
@@ -3257,8 +3481,8 @@
         </w:pict>
       </w:r>
     </w:p>
-    <w:bookmarkEnd w:id="12"/>
-    <w:bookmarkStart w:id="16" w:name="exercice-3-loi-normale-35-points"/>
+    <w:bookmarkEnd w:id="23"/>
+    <w:bookmarkStart w:id="27" w:name="exercice-3-loi-normale-35-points"/>
     <w:p>
       <w:pPr>
         <w:pStyle w:val="Heading2"/>
@@ -3267,7 +3491,7 @@
         <w:t xml:space="preserve">Exercice 3 — Loi normale (35 points)</w:t>
       </w:r>
     </w:p>
-    <w:bookmarkStart w:id="13" w:name="X147d5ab53a3b74abaf5de7a75e890c9e933a797"/>
+    <w:bookmarkStart w:id="24" w:name="X147d5ab53a3b74abaf5de7a75e890c9e933a797"/>
     <w:p>
       <w:pPr>
         <w:pStyle w:val="Heading3"/>
@@ -3298,25 +3522,68 @@
         </m:r>
         <m:r>
           <m:rPr>
+            <m:sty m:val="p"/>
             <m:scr m:val="script"/>
-            <m:sty m:val="p"/>
           </m:rPr>
           <m:t>N</m:t>
         </m:r>
-        <m:r>
-          <m:rPr>
-            <m:sty m:val="p"/>
-          </m:rPr>
-          <m:t>(</m:t>
-        </m:r>
-        <m:r>
-          <m:t>0</m:t>
-        </m:r>
-        <m:r>
-          <m:rPr>
-            <m:sty m:val="p"/>
-          </m:rPr>
-          <m:t>,</m:t>
+        <m:d>
+          <m:dPr>
+            <m:begChr m:val="("/>
+            <m:endChr m:val=")"/>
+            <m:sepChr m:val=""/>
+            <m:grow/>
+          </m:dPr>
+          <m:e>
+            <m:r>
+              <m:t>0</m:t>
+            </m:r>
+            <m:r>
+              <m:rPr>
+                <m:sty m:val="p"/>
+              </m:rPr>
+              <m:t>,</m:t>
+            </m:r>
+            <m:r>
+              <m:t>1</m:t>
+            </m:r>
+          </m:e>
+        </m:d>
+      </m:oMath>
+      <w:r>
+        <w:t xml:space="preserve">. On rappelle :</w:t>
+      </w:r>
+      <w:r>
+        <w:t xml:space="preserve"> </w:t>
+      </w:r>
+      <m:oMath>
+        <m:r>
+          <m:t>Φ</m:t>
+        </m:r>
+        <m:d>
+          <m:dPr>
+            <m:begChr m:val="("/>
+            <m:endChr m:val=")"/>
+            <m:sepChr m:val=""/>
+            <m:grow/>
+          </m:dPr>
+          <m:e>
+            <m:r>
+              <m:rPr>
+                <m:sty m:val="p"/>
+              </m:rPr>
+              <m:t>−</m:t>
+            </m:r>
+            <m:r>
+              <m:t>x</m:t>
+            </m:r>
+          </m:e>
+        </m:d>
+        <m:r>
+          <m:rPr>
+            <m:sty m:val="p"/>
+          </m:rPr>
+          <m:t>=</m:t>
         </m:r>
         <m:r>
           <m:t>1</m:t>
@@ -3325,43 +3592,75 @@
           <m:rPr>
             <m:sty m:val="p"/>
           </m:rPr>
-          <m:t>)</m:t>
-        </m:r>
-      </m:oMath>
-      <w:r>
-        <w:t xml:space="preserve">. On rappelle :</w:t>
-      </w:r>
-      <w:r>
-        <w:t xml:space="preserve"> </w:t>
-      </w:r>
-      <m:oMath>
-        <m:r>
-          <m:rPr>
-            <m:sty m:val="p"/>
-          </m:rPr>
+          <m:t>−</m:t>
+        </m:r>
+        <m:r>
           <m:t>Φ</m:t>
         </m:r>
-        <m:r>
-          <m:rPr>
-            <m:sty m:val="p"/>
-          </m:rPr>
-          <m:t>(</m:t>
-        </m:r>
-        <m:r>
-          <m:rPr>
-            <m:sty m:val="p"/>
-          </m:rPr>
-          <m:t>−</m:t>
-        </m:r>
-        <m:r>
-          <m:t>x</m:t>
-        </m:r>
-        <m:r>
-          <m:rPr>
-            <m:sty m:val="p"/>
-          </m:rPr>
-          <m:t>)</m:t>
-        </m:r>
+        <m:d>
+          <m:dPr>
+            <m:begChr m:val="("/>
+            <m:endChr m:val=")"/>
+            <m:sepChr m:val=""/>
+            <m:grow/>
+          </m:dPr>
+          <m:e>
+            <m:r>
+              <m:t>x</m:t>
+            </m:r>
+          </m:e>
+        </m:d>
+      </m:oMath>
+      <w:r>
+        <w:t xml:space="preserve"> </w:t>
+      </w:r>
+      <w:r>
+        <w:t xml:space="preserve">et</w:t>
+      </w:r>
+      <w:r>
+        <w:t xml:space="preserve"> </w:t>
+      </w:r>
+      <m:oMath>
+        <m:r>
+          <m:t>P</m:t>
+        </m:r>
+        <m:d>
+          <m:dPr>
+            <m:begChr m:val="("/>
+            <m:endChr m:val=")"/>
+            <m:sepChr m:val=""/>
+            <m:grow/>
+          </m:dPr>
+          <m:e>
+            <m:r>
+              <m:rPr>
+                <m:sty m:val="p"/>
+              </m:rPr>
+              <m:t>−</m:t>
+            </m:r>
+            <m:r>
+              <m:t>a</m:t>
+            </m:r>
+            <m:r>
+              <m:rPr>
+                <m:sty m:val="p"/>
+              </m:rPr>
+              <m:t>≤</m:t>
+            </m:r>
+            <m:r>
+              <m:t>Z</m:t>
+            </m:r>
+            <m:r>
+              <m:rPr>
+                <m:sty m:val="p"/>
+              </m:rPr>
+              <m:t>≤</m:t>
+            </m:r>
+            <m:r>
+              <m:t>a</m:t>
+            </m:r>
+          </m:e>
+        </m:d>
         <m:r>
           <m:rPr>
             <m:sty m:val="p"/>
@@ -3369,118 +3668,24 @@
           <m:t>=</m:t>
         </m:r>
         <m:r>
-          <m:t>1</m:t>
-        </m:r>
-        <m:r>
-          <m:rPr>
-            <m:sty m:val="p"/>
-          </m:rPr>
-          <m:t>−</m:t>
-        </m:r>
-        <m:r>
-          <m:rPr>
-            <m:sty m:val="p"/>
-          </m:rPr>
+          <m:t>2</m:t>
+        </m:r>
+        <m:r>
           <m:t>Φ</m:t>
         </m:r>
-        <m:r>
-          <m:rPr>
-            <m:sty m:val="p"/>
-          </m:rPr>
-          <m:t>(</m:t>
-        </m:r>
-        <m:r>
-          <m:t>x</m:t>
-        </m:r>
-        <m:r>
-          <m:rPr>
-            <m:sty m:val="p"/>
-          </m:rPr>
-          <m:t>)</m:t>
-        </m:r>
-      </m:oMath>
-      <w:r>
-        <w:t xml:space="preserve"> </w:t>
-      </w:r>
-      <w:r>
-        <w:t xml:space="preserve">et</w:t>
-      </w:r>
-      <w:r>
-        <w:t xml:space="preserve"> </w:t>
-      </w:r>
-      <m:oMath>
-        <m:r>
-          <m:t>P</m:t>
-        </m:r>
-        <m:r>
-          <m:rPr>
-            <m:sty m:val="p"/>
-          </m:rPr>
-          <m:t>(</m:t>
-        </m:r>
-        <m:r>
-          <m:rPr>
-            <m:sty m:val="p"/>
-          </m:rPr>
-          <m:t>−</m:t>
-        </m:r>
-        <m:r>
-          <m:t>a</m:t>
-        </m:r>
-        <m:r>
-          <m:rPr>
-            <m:sty m:val="p"/>
-          </m:rPr>
-          <m:t>≤</m:t>
-        </m:r>
-        <m:r>
-          <m:t>Z</m:t>
-        </m:r>
-        <m:r>
-          <m:rPr>
-            <m:sty m:val="p"/>
-          </m:rPr>
-          <m:t>≤</m:t>
-        </m:r>
-        <m:r>
-          <m:t>a</m:t>
-        </m:r>
-        <m:r>
-          <m:rPr>
-            <m:sty m:val="p"/>
-          </m:rPr>
-          <m:t>)</m:t>
-        </m:r>
-        <m:r>
-          <m:rPr>
-            <m:sty m:val="p"/>
-          </m:rPr>
-          <m:t>=</m:t>
-        </m:r>
-        <m:r>
-          <m:t>2</m:t>
-        </m:r>
-        <m:r>
-          <m:rPr>
-            <m:sty m:val="p"/>
-          </m:rPr>
-          <m:t>Φ</m:t>
-        </m:r>
-        <m:r>
-          <m:rPr>
-            <m:sty m:val="p"/>
-          </m:rPr>
-          <m:t>(</m:t>
-        </m:r>
-        <m:r>
-          <m:t>a</m:t>
-        </m:r>
-        <m:r>
-          <m:rPr>
-            <m:sty m:val="p"/>
-          </m:rPr>
-          <m:t>)</m:t>
-        </m:r>
+        <m:d>
+          <m:dPr>
+            <m:begChr m:val="("/>
+            <m:endChr m:val=")"/>
+            <m:sepChr m:val=""/>
+            <m:grow/>
+          </m:dPr>
+          <m:e>
+            <m:r>
+              <m:t>a</m:t>
+            </m:r>
+          </m:e>
+        </m:d>
         <m:r>
           <m:rPr>
             <m:sty m:val="p"/>
@@ -3501,8 +3706,8 @@
       </w:pPr>
       <w:r>
         <w:rPr>
+          <w:bCs/>
           <w:b/>
-          <w:bCs/>
         </w:rPr>
         <w:t xml:space="preserve">1.</w:t>
       </w:r>
@@ -3511,8 +3716,8 @@
       </w:r>
       <w:r>
         <w:rPr>
+          <w:iCs/>
           <w:i/>
-          <w:iCs/>
         </w:rPr>
         <w:t xml:space="preserve">(6 pts)</w:t>
       </w:r>
@@ -3525,49 +3730,47 @@
     </w:p>
     <w:p>
       <w:pPr>
-        <w:pStyle w:val="Compact"/>
         <w:numPr>
           <w:ilvl w:val="0"/>
           <w:numId w:val="1002"/>
         </w:numPr>
+        <w:pStyle w:val="Compact"/>
       </w:pPr>
       <m:oMath>
         <m:r>
           <m:t>P</m:t>
         </m:r>
-        <m:r>
-          <m:rPr>
-            <m:sty m:val="p"/>
-          </m:rPr>
-          <m:t>(</m:t>
-        </m:r>
-        <m:r>
-          <m:t>Z</m:t>
-        </m:r>
-        <m:r>
-          <m:rPr>
-            <m:sty m:val="p"/>
-          </m:rPr>
-          <m:t>≤</m:t>
-        </m:r>
-        <m:r>
-          <m:t>1</m:t>
-        </m:r>
-        <m:r>
-          <m:rPr>
-            <m:sty m:val="p"/>
-          </m:rPr>
-          <m:t>,</m:t>
-        </m:r>
-        <m:r>
-          <m:t>96</m:t>
-        </m:r>
-        <m:r>
-          <m:rPr>
-            <m:sty m:val="p"/>
-          </m:rPr>
-          <m:t>)</m:t>
-        </m:r>
+        <m:d>
+          <m:dPr>
+            <m:begChr m:val="("/>
+            <m:endChr m:val=")"/>
+            <m:sepChr m:val=""/>
+            <m:grow/>
+          </m:dPr>
+          <m:e>
+            <m:r>
+              <m:t>Z</m:t>
+            </m:r>
+            <m:r>
+              <m:rPr>
+                <m:sty m:val="p"/>
+              </m:rPr>
+              <m:t>≤</m:t>
+            </m:r>
+            <m:r>
+              <m:t>1</m:t>
+            </m:r>
+            <m:r>
+              <m:rPr>
+                <m:sty m:val="p"/>
+              </m:rPr>
+              <m:t>,</m:t>
+            </m:r>
+            <m:r>
+              <m:t>96</m:t>
+            </m:r>
+          </m:e>
+        </m:d>
       </m:oMath>
       <w:r>
         <w:t xml:space="preserve">,</w:t>
@@ -3575,55 +3778,53 @@
     </w:p>
     <w:p>
       <w:pPr>
-        <w:pStyle w:val="Compact"/>
         <w:numPr>
           <w:ilvl w:val="0"/>
           <w:numId w:val="1002"/>
         </w:numPr>
+        <w:pStyle w:val="Compact"/>
       </w:pPr>
       <m:oMath>
         <m:r>
           <m:t>P</m:t>
         </m:r>
-        <m:r>
-          <m:rPr>
-            <m:sty m:val="p"/>
-          </m:rPr>
-          <m:t>(</m:t>
-        </m:r>
-        <m:r>
-          <m:t>Z</m:t>
-        </m:r>
-        <m:r>
-          <m:rPr>
-            <m:sty m:val="p"/>
-          </m:rPr>
-          <m:t>&gt;</m:t>
-        </m:r>
-        <m:r>
-          <m:rPr>
-            <m:sty m:val="p"/>
-          </m:rPr>
-          <m:t>−</m:t>
-        </m:r>
-        <m:r>
-          <m:t>0</m:t>
-        </m:r>
-        <m:r>
-          <m:rPr>
-            <m:sty m:val="p"/>
-          </m:rPr>
-          <m:t>,</m:t>
-        </m:r>
-        <m:r>
-          <m:t>67</m:t>
-        </m:r>
-        <m:r>
-          <m:rPr>
-            <m:sty m:val="p"/>
-          </m:rPr>
-          <m:t>)</m:t>
-        </m:r>
+        <m:d>
+          <m:dPr>
+            <m:begChr m:val="("/>
+            <m:endChr m:val=")"/>
+            <m:sepChr m:val=""/>
+            <m:grow/>
+          </m:dPr>
+          <m:e>
+            <m:r>
+              <m:t>Z</m:t>
+            </m:r>
+            <m:r>
+              <m:rPr>
+                <m:sty m:val="p"/>
+              </m:rPr>
+              <m:t>&gt;</m:t>
+            </m:r>
+            <m:r>
+              <m:rPr>
+                <m:sty m:val="p"/>
+              </m:rPr>
+              <m:t>−</m:t>
+            </m:r>
+            <m:r>
+              <m:t>0</m:t>
+            </m:r>
+            <m:r>
+              <m:rPr>
+                <m:sty m:val="p"/>
+              </m:rPr>
+              <m:t>,</m:t>
+            </m:r>
+            <m:r>
+              <m:t>67</m:t>
+            </m:r>
+          </m:e>
+        </m:d>
       </m:oMath>
       <w:r>
         <w:t xml:space="preserve">,</w:t>
@@ -3631,73 +3832,71 @@
     </w:p>
     <w:p>
       <w:pPr>
-        <w:pStyle w:val="Compact"/>
         <w:numPr>
           <w:ilvl w:val="0"/>
           <w:numId w:val="1002"/>
         </w:numPr>
+        <w:pStyle w:val="Compact"/>
       </w:pPr>
       <m:oMath>
         <m:r>
           <m:t>P</m:t>
         </m:r>
-        <m:r>
-          <m:rPr>
-            <m:sty m:val="p"/>
-          </m:rPr>
-          <m:t>(</m:t>
-        </m:r>
-        <m:r>
-          <m:rPr>
-            <m:sty m:val="p"/>
-          </m:rPr>
-          <m:t>−</m:t>
-        </m:r>
-        <m:r>
-          <m:t>1</m:t>
-        </m:r>
-        <m:r>
-          <m:rPr>
-            <m:sty m:val="p"/>
-          </m:rPr>
-          <m:t>,</m:t>
-        </m:r>
-        <m:r>
-          <m:t>50</m:t>
-        </m:r>
-        <m:r>
-          <m:rPr>
-            <m:sty m:val="p"/>
-          </m:rPr>
-          <m:t>≤</m:t>
-        </m:r>
-        <m:r>
-          <m:t>Z</m:t>
-        </m:r>
-        <m:r>
-          <m:rPr>
-            <m:sty m:val="p"/>
-          </m:rPr>
-          <m:t>≤</m:t>
-        </m:r>
-        <m:r>
-          <m:t>2</m:t>
-        </m:r>
-        <m:r>
-          <m:rPr>
-            <m:sty m:val="p"/>
-          </m:rPr>
-          <m:t>,</m:t>
-        </m:r>
-        <m:r>
-          <m:t>33</m:t>
-        </m:r>
-        <m:r>
-          <m:rPr>
-            <m:sty m:val="p"/>
-          </m:rPr>
-          <m:t>)</m:t>
-        </m:r>
+        <m:d>
+          <m:dPr>
+            <m:begChr m:val="("/>
+            <m:endChr m:val=")"/>
+            <m:sepChr m:val=""/>
+            <m:grow/>
+          </m:dPr>
+          <m:e>
+            <m:r>
+              <m:rPr>
+                <m:sty m:val="p"/>
+              </m:rPr>
+              <m:t>−</m:t>
+            </m:r>
+            <m:r>
+              <m:t>1</m:t>
+            </m:r>
+            <m:r>
+              <m:rPr>
+                <m:sty m:val="p"/>
+              </m:rPr>
+              <m:t>,</m:t>
+            </m:r>
+            <m:r>
+              <m:t>50</m:t>
+            </m:r>
+            <m:r>
+              <m:rPr>
+                <m:sty m:val="p"/>
+              </m:rPr>
+              <m:t>≤</m:t>
+            </m:r>
+            <m:r>
+              <m:t>Z</m:t>
+            </m:r>
+            <m:r>
+              <m:rPr>
+                <m:sty m:val="p"/>
+              </m:rPr>
+              <m:t>≤</m:t>
+            </m:r>
+            <m:r>
+              <m:t>2</m:t>
+            </m:r>
+            <m:r>
+              <m:rPr>
+                <m:sty m:val="p"/>
+              </m:rPr>
+              <m:t>,</m:t>
+            </m:r>
+            <m:r>
+              <m:t>33</m:t>
+            </m:r>
+          </m:e>
+        </m:d>
       </m:oMath>
       <w:r>
         <w:t xml:space="preserve">.</w:t>
@@ -3709,8 +3908,8 @@
       </w:pPr>
       <w:r>
         <w:rPr>
+          <w:bCs/>
           <w:b/>
-          <w:bCs/>
         </w:rPr>
         <w:t xml:space="preserve">2.</w:t>
       </w:r>
@@ -3719,8 +3918,8 @@
       </w:r>
       <w:r>
         <w:rPr>
+          <w:iCs/>
           <w:i/>
-          <w:iCs/>
         </w:rPr>
         <w:t xml:space="preserve">(4 pts)</w:t>
       </w:r>
@@ -3733,11 +3932,11 @@
     </w:p>
     <w:p>
       <w:pPr>
-        <w:pStyle w:val="Compact"/>
         <w:numPr>
           <w:ilvl w:val="0"/>
           <w:numId w:val="1003"/>
         </w:numPr>
+        <w:pStyle w:val="Compact"/>
       </w:pPr>
       <m:oMath>
         <m:sSub>
@@ -3766,39 +3965,37 @@
         <m:r>
           <m:t>P</m:t>
         </m:r>
-        <m:r>
-          <m:rPr>
-            <m:sty m:val="p"/>
-          </m:rPr>
-          <m:t>(</m:t>
-        </m:r>
-        <m:r>
-          <m:t>Z</m:t>
-        </m:r>
-        <m:r>
-          <m:rPr>
-            <m:sty m:val="p"/>
-          </m:rPr>
-          <m:t>≤</m:t>
-        </m:r>
-        <m:sSub>
+        <m:d>
+          <m:dPr>
+            <m:begChr m:val="("/>
+            <m:endChr m:val=")"/>
+            <m:sepChr m:val=""/>
+            <m:grow/>
+          </m:dPr>
           <m:e>
             <m:r>
-              <m:t>z</m:t>
-            </m:r>
+              <m:t>Z</m:t>
+            </m:r>
+            <m:r>
+              <m:rPr>
+                <m:sty m:val="p"/>
+              </m:rPr>
+              <m:t>≤</m:t>
+            </m:r>
+            <m:sSub>
+              <m:e>
+                <m:r>
+                  <m:t>z</m:t>
+                </m:r>
+              </m:e>
+              <m:sub>
+                <m:r>
+                  <m:t>0</m:t>
+                </m:r>
+              </m:sub>
+            </m:sSub>
           </m:e>
-          <m:sub>
-            <m:r>
-              <m:t>0</m:t>
-            </m:r>
-          </m:sub>
-        </m:sSub>
-        <m:r>
-          <m:rPr>
-            <m:sty m:val="p"/>
-          </m:rPr>
-          <m:t>)</m:t>
-        </m:r>
+        </m:d>
         <m:r>
           <m:rPr>
             <m:sty m:val="p"/>
@@ -3824,11 +4021,11 @@
     </w:p>
     <w:p>
       <w:pPr>
-        <w:pStyle w:val="Compact"/>
         <w:numPr>
           <w:ilvl w:val="0"/>
           <w:numId w:val="1003"/>
         </w:numPr>
+        <w:pStyle w:val="Compact"/>
       </w:pPr>
       <m:oMath>
         <m:r>
@@ -3857,42 +4054,38 @@
         <m:r>
           <m:t>P</m:t>
         </m:r>
-        <m:r>
-          <m:rPr>
-            <m:sty m:val="p"/>
-          </m:rPr>
-          <m:t>(</m:t>
-        </m:r>
-        <m:r>
-          <m:rPr>
-            <m:sty m:val="p"/>
-          </m:rPr>
-          <m:t>|</m:t>
-        </m:r>
-        <m:r>
-          <m:t>Z</m:t>
-        </m:r>
-        <m:r>
-          <m:rPr>
-            <m:sty m:val="p"/>
-          </m:rPr>
-          <m:t>|</m:t>
-        </m:r>
-        <m:r>
-          <m:rPr>
-            <m:sty m:val="p"/>
-          </m:rPr>
-          <m:t>≤</m:t>
-        </m:r>
-        <m:r>
-          <m:t>d</m:t>
-        </m:r>
-        <m:r>
-          <m:rPr>
-            <m:sty m:val="p"/>
-          </m:rPr>
-          <m:t>)</m:t>
-        </m:r>
+        <m:d>
+          <m:dPr>
+            <m:begChr m:val="("/>
+            <m:endChr m:val=")"/>
+            <m:sepChr m:val=""/>
+            <m:grow/>
+          </m:dPr>
+          <m:e>
+            <m:d>
+              <m:dPr>
+                <m:begChr m:val="|"/>
+                <m:endChr m:val="|"/>
+                <m:sepChr m:val=""/>
+                <m:grow/>
+              </m:dPr>
+              <m:e>
+                <m:r>
+                  <m:t>Z</m:t>
+                </m:r>
+              </m:e>
+            </m:d>
+            <m:r>
+              <m:rPr>
+                <m:sty m:val="p"/>
+              </m:rPr>
+              <m:t>≤</m:t>
+            </m:r>
+            <m:r>
+              <m:t>d</m:t>
+            </m:r>
+          </m:e>
+        </m:d>
         <m:r>
           <m:rPr>
             <m:sty m:val="p"/>
@@ -3923,8 +4116,8 @@
         </w:pict>
       </w:r>
     </w:p>
-    <w:bookmarkEnd w:id="13"/>
-    <w:bookmarkStart w:id="14" w:name="partie-b-loi-normale-générale-17-points"/>
+    <w:bookmarkEnd w:id="24"/>
+    <w:bookmarkStart w:id="25" w:name="partie-b-loi-normale-générale-17-points"/>
     <w:p>
       <w:pPr>
         <w:pStyle w:val="Heading3"/>
@@ -3946,38 +4139,36 @@
       <m:oMath>
         <m:r>
           <m:rPr>
+            <m:sty m:val="p"/>
             <m:scr m:val="script"/>
-            <m:sty m:val="p"/>
           </m:rPr>
           <m:t>N</m:t>
         </m:r>
-        <m:r>
-          <m:rPr>
-            <m:sty m:val="p"/>
-          </m:rPr>
-          <m:t>(</m:t>
-        </m:r>
-        <m:r>
-          <m:t>250</m:t>
-        </m:r>
-        <m:r>
-          <m:rPr>
-            <m:sty m:val="p"/>
-          </m:rPr>
-          <m:t>,</m:t>
-        </m:r>
-        <m:r>
-          <m:t> </m:t>
-        </m:r>
-        <m:r>
-          <m:t>100</m:t>
-        </m:r>
-        <m:r>
-          <m:rPr>
-            <m:sty m:val="p"/>
-          </m:rPr>
-          <m:t>)</m:t>
-        </m:r>
+        <m:d>
+          <m:dPr>
+            <m:begChr m:val="("/>
+            <m:endChr m:val=")"/>
+            <m:sepChr m:val=""/>
+            <m:grow/>
+          </m:dPr>
+          <m:e>
+            <m:r>
+              <m:t>250</m:t>
+            </m:r>
+            <m:r>
+              <m:rPr>
+                <m:sty m:val="p"/>
+              </m:rPr>
+              <m:t>,</m:t>
+            </m:r>
+            <m:r>
+              <m:t> </m:t>
+            </m:r>
+            <m:r>
+              <m:t>100</m:t>
+            </m:r>
+          </m:e>
+        </m:d>
       </m:oMath>
       <w:r>
         <w:t xml:space="preserve">.</w:t>
@@ -3989,8 +4180,8 @@
       </w:pPr>
       <w:r>
         <w:rPr>
+          <w:bCs/>
           <w:b/>
-          <w:bCs/>
         </w:rPr>
         <w:t xml:space="preserve">3.</w:t>
       </w:r>
@@ -3999,8 +4190,8 @@
       </w:r>
       <w:r>
         <w:rPr>
+          <w:iCs/>
           <w:i/>
-          <w:iCs/>
         </w:rPr>
         <w:t xml:space="preserve">(1 pt)</w:t>
       </w:r>
@@ -4016,26 +4207,24 @@
       <m:oMath>
         <m:r>
           <m:rPr>
+            <m:sty m:val="p"/>
             <m:scr m:val="double-struck"/>
-            <m:sty m:val="p"/>
           </m:rPr>
           <m:t>E</m:t>
         </m:r>
-        <m:r>
-          <m:rPr>
-            <m:sty m:val="p"/>
-          </m:rPr>
-          <m:t>(</m:t>
-        </m:r>
-        <m:r>
-          <m:t>X</m:t>
-        </m:r>
-        <m:r>
-          <m:rPr>
-            <m:sty m:val="p"/>
-          </m:rPr>
-          <m:t>)</m:t>
-        </m:r>
+        <m:d>
+          <m:dPr>
+            <m:begChr m:val="("/>
+            <m:endChr m:val=")"/>
+            <m:sepChr m:val=""/>
+            <m:grow/>
+          </m:dPr>
+          <m:e>
+            <m:r>
+              <m:t>X</m:t>
+            </m:r>
+          </m:e>
+        </m:d>
       </m:oMath>
       <w:r>
         <w:t xml:space="preserve"> </w:t>
@@ -4070,8 +4259,8 @@
       </w:pPr>
       <w:r>
         <w:rPr>
+          <w:bCs/>
           <w:b/>
-          <w:bCs/>
         </w:rPr>
         <w:t xml:space="preserve">4.</w:t>
       </w:r>
@@ -4080,8 +4269,8 @@
       </w:r>
       <w:r>
         <w:rPr>
+          <w:iCs/>
           <w:i/>
-          <w:iCs/>
         </w:rPr>
         <w:t xml:space="preserve">(8 pts)</w:t>
       </w:r>
@@ -4094,40 +4283,38 @@
     </w:p>
     <w:p>
       <w:pPr>
-        <w:pStyle w:val="Compact"/>
         <w:numPr>
           <w:ilvl w:val="0"/>
           <w:numId w:val="1004"/>
         </w:numPr>
+        <w:pStyle w:val="Compact"/>
       </w:pPr>
       <m:oMath>
         <m:r>
           <m:t>P</m:t>
         </m:r>
-        <m:r>
-          <m:rPr>
-            <m:sty m:val="p"/>
-          </m:rPr>
-          <m:t>(</m:t>
-        </m:r>
-        <m:r>
-          <m:t>X</m:t>
-        </m:r>
-        <m:r>
-          <m:rPr>
-            <m:sty m:val="p"/>
-          </m:rPr>
-          <m:t>≤</m:t>
-        </m:r>
-        <m:r>
-          <m:t>265</m:t>
-        </m:r>
-        <m:r>
-          <m:rPr>
-            <m:sty m:val="p"/>
-          </m:rPr>
-          <m:t>)</m:t>
-        </m:r>
+        <m:d>
+          <m:dPr>
+            <m:begChr m:val="("/>
+            <m:endChr m:val=")"/>
+            <m:sepChr m:val=""/>
+            <m:grow/>
+          </m:dPr>
+          <m:e>
+            <m:r>
+              <m:t>X</m:t>
+            </m:r>
+            <m:r>
+              <m:rPr>
+                <m:sty m:val="p"/>
+              </m:rPr>
+              <m:t>≤</m:t>
+            </m:r>
+            <m:r>
+              <m:t>265</m:t>
+            </m:r>
+          </m:e>
+        </m:d>
       </m:oMath>
       <w:r>
         <w:t xml:space="preserve">,</w:t>
@@ -4135,49 +4322,47 @@
     </w:p>
     <w:p>
       <w:pPr>
-        <w:pStyle w:val="Compact"/>
         <w:numPr>
           <w:ilvl w:val="0"/>
           <w:numId w:val="1004"/>
         </w:numPr>
+        <w:pStyle w:val="Compact"/>
       </w:pPr>
       <m:oMath>
         <m:r>
           <m:t>P</m:t>
         </m:r>
-        <m:r>
-          <m:rPr>
-            <m:sty m:val="p"/>
-          </m:rPr>
-          <m:t>(</m:t>
-        </m:r>
-        <m:r>
-          <m:t>235</m:t>
-        </m:r>
-        <m:r>
-          <m:rPr>
-            <m:sty m:val="p"/>
-          </m:rPr>
-          <m:t>≤</m:t>
-        </m:r>
-        <m:r>
-          <m:t>X</m:t>
-        </m:r>
-        <m:r>
-          <m:rPr>
-            <m:sty m:val="p"/>
-          </m:rPr>
-          <m:t>≤</m:t>
-        </m:r>
-        <m:r>
-          <m:t>260</m:t>
-        </m:r>
-        <m:r>
-          <m:rPr>
-            <m:sty m:val="p"/>
-          </m:rPr>
-          <m:t>)</m:t>
-        </m:r>
+        <m:d>
+          <m:dPr>
+            <m:begChr m:val="("/>
+            <m:endChr m:val=")"/>
+            <m:sepChr m:val=""/>
+            <m:grow/>
+          </m:dPr>
+          <m:e>
+            <m:r>
+              <m:t>235</m:t>
+            </m:r>
+            <m:r>
+              <m:rPr>
+                <m:sty m:val="p"/>
+              </m:rPr>
+              <m:t>≤</m:t>
+            </m:r>
+            <m:r>
+              <m:t>X</m:t>
+            </m:r>
+            <m:r>
+              <m:rPr>
+                <m:sty m:val="p"/>
+              </m:rPr>
+              <m:t>≤</m:t>
+            </m:r>
+            <m:r>
+              <m:t>260</m:t>
+            </m:r>
+          </m:e>
+        </m:d>
       </m:oMath>
       <w:r>
         <w:t xml:space="preserve">.</w:t>
@@ -4211,30 +4396,28 @@
         <m:r>
           <m:t>P</m:t>
         </m:r>
-        <m:r>
-          <m:rPr>
-            <m:sty m:val="p"/>
-          </m:rPr>
-          <m:t>(</m:t>
-        </m:r>
-        <m:r>
-          <m:t>X</m:t>
-        </m:r>
-        <m:r>
-          <m:rPr>
-            <m:sty m:val="p"/>
-          </m:rPr>
-          <m:t>&gt;</m:t>
-        </m:r>
-        <m:r>
-          <m:t>s</m:t>
-        </m:r>
-        <m:r>
-          <m:rPr>
-            <m:sty m:val="p"/>
-          </m:rPr>
-          <m:t>)</m:t>
-        </m:r>
+        <m:d>
+          <m:dPr>
+            <m:begChr m:val="("/>
+            <m:endChr m:val=")"/>
+            <m:sepChr m:val=""/>
+            <m:grow/>
+          </m:dPr>
+          <m:e>
+            <m:r>
+              <m:t>X</m:t>
+            </m:r>
+            <m:r>
+              <m:rPr>
+                <m:sty m:val="p"/>
+              </m:rPr>
+              <m:t>&gt;</m:t>
+            </m:r>
+            <m:r>
+              <m:t>s</m:t>
+            </m:r>
+          </m:e>
+        </m:d>
         <m:r>
           <m:rPr>
             <m:sty m:val="p"/>
@@ -4264,8 +4447,8 @@
       </w:pPr>
       <w:r>
         <w:rPr>
+          <w:bCs/>
           <w:b/>
-          <w:bCs/>
         </w:rPr>
         <w:t xml:space="preserve">5.</w:t>
       </w:r>
@@ -4274,8 +4457,8 @@
       </w:r>
       <w:r>
         <w:rPr>
+          <w:iCs/>
           <w:i/>
-          <w:iCs/>
         </w:rPr>
         <w:t xml:space="preserve">(8 pts)</w:t>
       </w:r>
@@ -4397,38 +4580,36 @@
       <m:oMath>
         <m:r>
           <m:rPr>
+            <m:sty m:val="p"/>
             <m:scr m:val="script"/>
-            <m:sty m:val="p"/>
           </m:rPr>
           <m:t>N</m:t>
         </m:r>
-        <m:r>
-          <m:rPr>
-            <m:sty m:val="p"/>
-          </m:rPr>
-          <m:t>(</m:t>
-        </m:r>
-        <m:r>
-          <m:t>250</m:t>
-        </m:r>
-        <m:r>
-          <m:rPr>
-            <m:sty m:val="p"/>
-          </m:rPr>
-          <m:t>,</m:t>
-        </m:r>
-        <m:r>
-          <m:t> </m:t>
-        </m:r>
-        <m:r>
-          <m:t>100</m:t>
-        </m:r>
-        <m:r>
-          <m:rPr>
-            <m:sty m:val="p"/>
-          </m:rPr>
-          <m:t>)</m:t>
-        </m:r>
+        <m:d>
+          <m:dPr>
+            <m:begChr m:val="("/>
+            <m:endChr m:val=")"/>
+            <m:sepChr m:val=""/>
+            <m:grow/>
+          </m:dPr>
+          <m:e>
+            <m:r>
+              <m:t>250</m:t>
+            </m:r>
+            <m:r>
+              <m:rPr>
+                <m:sty m:val="p"/>
+              </m:rPr>
+              <m:t>,</m:t>
+            </m:r>
+            <m:r>
+              <m:t> </m:t>
+            </m:r>
+            <m:r>
+              <m:t>100</m:t>
+            </m:r>
+          </m:e>
+        </m:d>
       </m:oMath>
       <w:r>
         <w:t xml:space="preserve">. On note</w:t>
@@ -4528,11 +4709,11 @@
     </w:p>
     <w:p>
       <w:pPr>
-        <w:pStyle w:val="Compact"/>
         <w:numPr>
           <w:ilvl w:val="0"/>
           <w:numId w:val="1005"/>
         </w:numPr>
+        <w:pStyle w:val="Compact"/>
       </w:pPr>
       <w:r>
         <w:t xml:space="preserve">Donner la loi de</w:t>
@@ -4554,11 +4735,11 @@
     </w:p>
     <w:p>
       <w:pPr>
-        <w:pStyle w:val="Compact"/>
         <w:numPr>
           <w:ilvl w:val="0"/>
           <w:numId w:val="1005"/>
         </w:numPr>
+        <w:pStyle w:val="Compact"/>
       </w:pPr>
       <w:r>
         <w:t xml:space="preserve">Calculer</w:t>
@@ -4570,30 +4751,28 @@
         <m:r>
           <m:t>P</m:t>
         </m:r>
-        <m:r>
-          <m:rPr>
-            <m:sty m:val="p"/>
-          </m:rPr>
-          <m:t>(</m:t>
-        </m:r>
-        <m:r>
-          <m:t>S</m:t>
-        </m:r>
-        <m:r>
-          <m:rPr>
-            <m:sty m:val="p"/>
-          </m:rPr>
-          <m:t>&gt;</m:t>
-        </m:r>
-        <m:r>
-          <m:t>1030</m:t>
-        </m:r>
-        <m:r>
-          <m:rPr>
-            <m:sty m:val="p"/>
-          </m:rPr>
-          <m:t>)</m:t>
-        </m:r>
+        <m:d>
+          <m:dPr>
+            <m:begChr m:val="("/>
+            <m:endChr m:val=")"/>
+            <m:sepChr m:val=""/>
+            <m:grow/>
+          </m:dPr>
+          <m:e>
+            <m:r>
+              <m:t>S</m:t>
+            </m:r>
+            <m:r>
+              <m:rPr>
+                <m:sty m:val="p"/>
+              </m:rPr>
+              <m:t>&gt;</m:t>
+            </m:r>
+            <m:r>
+              <m:t>1030</m:t>
+            </m:r>
+          </m:e>
+        </m:d>
       </m:oMath>
       <w:r>
         <w:t xml:space="preserve">.</w:t>
@@ -4606,8 +4785,8 @@
         </w:pict>
       </w:r>
     </w:p>
-    <w:bookmarkEnd w:id="14"/>
-    <w:bookmarkStart w:id="15" w:name="Xf0ce554300671a44940235467ca45c162c81504"/>
+    <w:bookmarkEnd w:id="25"/>
+    <w:bookmarkStart w:id="26" w:name="Xf0ce554300671a44940235467ca45c162c81504"/>
     <w:p>
       <w:pPr>
         <w:pStyle w:val="Heading3"/>
@@ -4629,44 +4808,42 @@
       <m:oMath>
         <m:r>
           <m:rPr>
+            <m:sty m:val="p"/>
             <m:scr m:val="script"/>
-            <m:sty m:val="p"/>
           </m:rPr>
           <m:t>N</m:t>
         </m:r>
-        <m:r>
-          <m:rPr>
-            <m:sty m:val="p"/>
-          </m:rPr>
-          <m:t>(</m:t>
-        </m:r>
-        <m:r>
-          <m:t>m</m:t>
-        </m:r>
-        <m:r>
-          <m:rPr>
-            <m:sty m:val="p"/>
-          </m:rPr>
-          <m:t>,</m:t>
-        </m:r>
-        <m:sSup>
+        <m:d>
+          <m:dPr>
+            <m:begChr m:val="("/>
+            <m:endChr m:val=")"/>
+            <m:sepChr m:val=""/>
+            <m:grow/>
+          </m:dPr>
           <m:e>
             <m:r>
-              <m:t>σ</m:t>
-            </m:r>
+              <m:t>m</m:t>
+            </m:r>
+            <m:r>
+              <m:rPr>
+                <m:sty m:val="p"/>
+              </m:rPr>
+              <m:t>,</m:t>
+            </m:r>
+            <m:sSup>
+              <m:e>
+                <m:r>
+                  <m:t>σ</m:t>
+                </m:r>
+              </m:e>
+              <m:sup>
+                <m:r>
+                  <m:t>2</m:t>
+                </m:r>
+              </m:sup>
+            </m:sSup>
           </m:e>
-          <m:sup>
-            <m:r>
-              <m:t>2</m:t>
-            </m:r>
-          </m:sup>
-        </m:sSup>
-        <m:r>
-          <m:rPr>
-            <m:sty m:val="p"/>
-          </m:rPr>
-          <m:t>)</m:t>
-        </m:r>
+        </m:d>
       </m:oMath>
       <w:r>
         <w:t xml:space="preserve">. On sait que :</w:t>
@@ -4674,11 +4851,11 @@
     </w:p>
     <w:p>
       <w:pPr>
-        <w:pStyle w:val="Compact"/>
         <w:numPr>
           <w:ilvl w:val="0"/>
           <w:numId w:val="1006"/>
         </w:numPr>
+        <w:pStyle w:val="Compact"/>
       </w:pPr>
       <w:r>
         <w:t xml:space="preserve">84,13 % des composants ont une durée de vie inférieure à</w:t>
@@ -4688,8 +4865,8 @@
       </w:r>
       <w:r>
         <w:rPr>
+          <w:bCs/>
           <w:b/>
-          <w:bCs/>
         </w:rPr>
         <w:t xml:space="preserve">540 heures</w:t>
       </w:r>
@@ -4699,11 +4876,11 @@
     </w:p>
     <w:p>
       <w:pPr>
-        <w:pStyle w:val="Compact"/>
         <w:numPr>
           <w:ilvl w:val="0"/>
           <w:numId w:val="1006"/>
         </w:numPr>
+        <w:pStyle w:val="Compact"/>
       </w:pPr>
       <w:r>
         <w:t xml:space="preserve">97,72 % des composants ont une durée de vie inférieure à</w:t>
@@ -4713,8 +4890,8 @@
       </w:r>
       <w:r>
         <w:rPr>
+          <w:bCs/>
           <w:b/>
-          <w:bCs/>
         </w:rPr>
         <w:t xml:space="preserve">560 heures</w:t>
       </w:r>
@@ -4728,8 +4905,8 @@
       </w:pPr>
       <w:r>
         <w:rPr>
+          <w:bCs/>
           <w:b/>
-          <w:bCs/>
         </w:rPr>
         <w:t xml:space="preserve">6.</w:t>
       </w:r>
@@ -4738,8 +4915,8 @@
       </w:r>
       <w:r>
         <w:rPr>
+          <w:iCs/>
           <w:i/>
-          <w:iCs/>
         </w:rPr>
         <w:t xml:space="preserve">(8 pts)</w:t>
       </w:r>
@@ -4754,9 +4931,6 @@
       </w:r>
       <m:oMath>
         <m:r>
-          <m:rPr>
-            <m:sty m:val="p"/>
-          </m:rPr>
           <m:t>Φ</m:t>
         </m:r>
       </m:oMath>
@@ -4820,13 +4994,9 @@
         <w:t xml:space="preserve">.</w:t>
       </w:r>
     </w:p>
-    <w:bookmarkEnd w:id="15"/>
-    <w:bookmarkEnd w:id="16"/>
-    <w:sectPr>
-      <w:footnotePr>
-        <w:numRestart w:val="eachSect"/>
-      </w:footnotePr>
-    </w:sectPr>
+    <w:bookmarkEnd w:id="26"/>
+    <w:bookmarkEnd w:id="27"/>
+    <w:sectPr/>
   </w:body>
 </w:document>
 </file>
@@ -4857,14 +5027,14 @@
 <file path=word/numbering.xml><?xml version="1.0" encoding="utf-8"?>
 <w:numbering xmlns:w="http://schemas.openxmlformats.org/wordprocessingml/2006/main">
   <w:abstractNum w:abstractNumId="990">
-    <w:nsid w:val="0000A990"/>
+    <w:nsid w:val="A990"/>
     <w:multiLevelType w:val="multilevel"/>
     <w:lvl w:ilvl="0">
       <w:numFmt w:val="bullet"/>
       <w:lvlText w:val=" "/>
       <w:lvlJc w:val="left"/>
       <w:pPr>
-        <w:ind w:left="720" w:hanging="360"/>
+        <w:ind w:left="720" w:hanging="480"/>
       </w:pPr>
     </w:lvl>
     <w:lvl w:ilvl="1">
@@ -4872,7 +5042,7 @@
       <w:lvlText w:val=" "/>
       <w:lvlJc w:val="left"/>
       <w:pPr>
-        <w:ind w:left="1440" w:hanging="360"/>
+        <w:ind w:left="1440" w:hanging="480"/>
       </w:pPr>
     </w:lvl>
     <w:lvl w:ilvl="2">
@@ -4880,7 +5050,7 @@
       <w:lvlText w:val=" "/>
       <w:lvlJc w:val="left"/>
       <w:pPr>
-        <w:ind w:left="2160" w:hanging="360"/>
+        <w:ind w:left="2160" w:hanging="480"/>
       </w:pPr>
     </w:lvl>
     <w:lvl w:ilvl="3">
@@ -4888,7 +5058,7 @@
       <w:lvlText w:val=" "/>
       <w:lvlJc w:val="left"/>
       <w:pPr>
-        <w:ind w:left="2880" w:hanging="360"/>
+        <w:ind w:left="2880" w:hanging="480"/>
       </w:pPr>
     </w:lvl>
     <w:lvl w:ilvl="4">
@@ -4896,7 +5066,7 @@
       <w:lvlText w:val=" "/>
       <w:lvlJc w:val="left"/>
       <w:pPr>
-        <w:ind w:left="3600" w:hanging="360"/>
+        <w:ind w:left="3600" w:hanging="480"/>
       </w:pPr>
     </w:lvl>
     <w:lvl w:ilvl="5">
@@ -4904,7 +5074,7 @@
       <w:lvlText w:val=" "/>
       <w:lvlJc w:val="left"/>
       <w:pPr>
-        <w:ind w:left="4320" w:hanging="360"/>
+        <w:ind w:left="4320" w:hanging="480"/>
       </w:pPr>
     </w:lvl>
     <w:lvl w:ilvl="6">
@@ -4912,7 +5082,7 @@
       <w:lvlText w:val=" "/>
       <w:lvlJc w:val="left"/>
       <w:pPr>
-        <w:ind w:left="5040" w:hanging="360"/>
+        <w:ind w:left="5040" w:hanging="480"/>
       </w:pPr>
     </w:lvl>
     <w:lvl w:ilvl="7">
@@ -4920,7 +5090,7 @@
       <w:lvlText w:val=" "/>
       <w:lvlJc w:val="left"/>
       <w:pPr>
-        <w:ind w:left="5760" w:hanging="360"/>
+        <w:ind w:left="5760" w:hanging="480"/>
       </w:pPr>
     </w:lvl>
     <w:lvl w:ilvl="8">
@@ -4928,111 +5098,84 @@
       <w:lvlText w:val=" "/>
       <w:lvlJc w:val="left"/>
       <w:pPr>
-        <w:ind w:left="6480" w:hanging="360"/>
+        <w:ind w:left="6480" w:hanging="480"/>
       </w:pPr>
     </w:lvl>
   </w:abstractNum>
   <w:abstractNum w:abstractNumId="991">
-    <w:nsid w:val="0000A991"/>
+    <w:nsid w:val="A991"/>
     <w:multiLevelType w:val="multilevel"/>
     <w:lvl w:ilvl="0">
       <w:numFmt w:val="bullet"/>
-      <w:lvlText w:val=""/>
+      <w:lvlText w:val="•"/>
       <w:lvlJc w:val="left"/>
       <w:pPr>
-        <w:ind w:left="720" w:hanging="360"/>
-      </w:pPr>
-      <w:rPr>
-        <w:rFonts w:ascii="Symbol" w:hAnsi="Symbol" w:cs="Symbol" w:hint="default"/>
-      </w:rPr>
+        <w:ind w:left="720" w:hanging="480"/>
+      </w:pPr>
     </w:lvl>
     <w:lvl w:ilvl="1">
       <w:numFmt w:val="bullet"/>
-      <w:lvlText w:val="o"/>
+      <w:lvlText w:val="–"/>
       <w:lvlJc w:val="left"/>
       <w:pPr>
-        <w:ind w:left="1440" w:hanging="360"/>
-      </w:pPr>
-      <w:rPr>
-        <w:rFonts w:ascii="Courier New" w:hAnsi="Courier New" w:cs="Courier New" w:hint="default"/>
-      </w:rPr>
+        <w:ind w:left="1440" w:hanging="480"/>
+      </w:pPr>
     </w:lvl>
     <w:lvl w:ilvl="2">
       <w:numFmt w:val="bullet"/>
-      <w:lvlText w:val=""/>
+      <w:lvlText w:val="•"/>
       <w:lvlJc w:val="left"/>
       <w:pPr>
-        <w:ind w:left="2160" w:hanging="360"/>
-      </w:pPr>
-      <w:rPr>
-        <w:rFonts w:ascii="Wingdings" w:hAnsi="Wingdings" w:cs="Wingdings" w:hint="default"/>
-      </w:rPr>
+        <w:ind w:left="2160" w:hanging="480"/>
+      </w:pPr>
     </w:lvl>
     <w:lvl w:ilvl="3">
       <w:numFmt w:val="bullet"/>
-      <w:lvlText w:val=""/>
+      <w:lvlText w:val="–"/>
       <w:lvlJc w:val="left"/>
       <w:pPr>
-        <w:ind w:left="2880" w:hanging="360"/>
-      </w:pPr>
-      <w:rPr>
-        <w:rFonts w:ascii="Symbol" w:hAnsi="Symbol" w:cs="Symbol" w:hint="default"/>
-      </w:rPr>
+        <w:ind w:left="2880" w:hanging="480"/>
+      </w:pPr>
     </w:lvl>
     <w:lvl w:ilvl="4">
       <w:numFmt w:val="bullet"/>
-      <w:lvlText w:val="o"/>
+      <w:lvlText w:val="•"/>
       <w:lvlJc w:val="left"/>
       <w:pPr>
-        <w:ind w:left="3600" w:hanging="360"/>
-      </w:pPr>
-      <w:rPr>
-        <w:rFonts w:ascii="Courier New" w:hAnsi="Courier New" w:cs="Courier New" w:hint="default"/>
-      </w:rPr>
+        <w:ind w:left="3600" w:hanging="480"/>
+      </w:pPr>
     </w:lvl>
     <w:lvl w:ilvl="5">
       <w:numFmt w:val="bullet"/>
-      <w:lvlText w:val=""/>
+      <w:lvlText w:val="–"/>
       <w:lvlJc w:val="left"/>
       <w:pPr>
-        <w:ind w:left="4320" w:hanging="360"/>
-      </w:pPr>
-      <w:rPr>
-        <w:rFonts w:ascii="Wingdings" w:hAnsi="Wingdings" w:cs="Wingdings" w:hint="default"/>
-      </w:rPr>
+        <w:ind w:left="4320" w:hanging="480"/>
+      </w:pPr>
     </w:lvl>
     <w:lvl w:ilvl="6">
       <w:numFmt w:val="bullet"/>
-      <w:lvlText w:val=""/>
+      <w:lvlText w:val="•"/>
       <w:lvlJc w:val="left"/>
       <w:pPr>
-        <w:ind w:left="5040" w:hanging="360"/>
-      </w:pPr>
-      <w:rPr>
-        <w:rFonts w:ascii="Symbol" w:hAnsi="Symbol" w:cs="Symbol" w:hint="default"/>
-      </w:rPr>
+        <w:ind w:left="5040" w:hanging="480"/>
+      </w:pPr>
     </w:lvl>
     <w:lvl w:ilvl="7">
       <w:numFmt w:val="bullet"/>
-      <w:lvlText w:val="o"/>
+      <w:lvlText w:val="–"/>
       <w:lvlJc w:val="left"/>
       <w:pPr>
-        <w:ind w:left="5760" w:hanging="360"/>
-      </w:pPr>
-      <w:rPr>
-        <w:rFonts w:ascii="Courier New" w:hAnsi="Courier New" w:cs="Courier New" w:hint="default"/>
-      </w:rPr>
+        <w:ind w:left="5760" w:hanging="480"/>
+      </w:pPr>
     </w:lvl>
     <w:lvl w:ilvl="8">
       <w:numFmt w:val="bullet"/>
-      <w:lvlText w:val=""/>
+      <w:lvlText w:val="•"/>
       <w:lvlJc w:val="left"/>
       <w:pPr>
-        <w:ind w:left="6480" w:hanging="360"/>
-      </w:pPr>
-      <w:rPr>
-        <w:rFonts w:ascii="Wingdings" w:hAnsi="Wingdings" w:cs="Wingdings" w:hint="default"/>
-      </w:rPr>
+        <w:ind w:left="6480" w:hanging="480"/>
+      </w:pPr>
     </w:lvl>
   </w:abstractNum>
   <w:num w:numId="1000">
@@ -5064,10 +5207,10 @@
   <w:docDefaults>
     <w:rPrDefault>
       <w:rPr>
-        <w:rFonts w:asciiTheme="minorHAnsi" w:cstheme="minorBidi" w:eastAsiaTheme="minorEastAsia" w:hAnsiTheme="minorHAnsi"/>
+        <w:rFonts w:asciiTheme="minorHAnsi" w:cstheme="minorBidi" w:eastAsiaTheme="minorHAnsi" w:hAnsiTheme="minorHAnsi"/>
         <w:sz w:val="24"/>
         <w:szCs w:val="24"/>
-        <w:lang w:bidi="ar-SA" w:eastAsia="zh-CN" w:val="fr"/>
+        <w:lang w:bidi="ar-SA" w:eastAsia="en-US" w:val="fr"/>
       </w:rPr>
     </w:rPrDefault>
     <w:pPrDefault>
@@ -5085,10 +5228,10 @@
     <w:name w:val="Body Text"/>
     <w:basedOn w:val="Normal"/>
     <w:link w:val="BodyTextChar"/>
-    <w:qFormat/>
     <w:pPr>
       <w:spacing w:after="180" w:before="180"/>
     </w:pPr>
+    <w:qFormat/>
   </w:style>
   <w:style w:customStyle="1" w:styleId="FirstParagraph" w:type="paragraph">
     <w:name w:val="First Paragraph"/>
@@ -5108,94 +5251,57 @@
     <w:name w:val="Title"/>
     <w:basedOn w:val="Normal"/>
     <w:next w:val="BodyText"/>
-    <w:link w:val="TitleChar"/>
-    <w:uiPriority w:val="10"/>
     <w:qFormat/>
-    <w:rsid w:val="00A10FD9"/>
     <w:pPr>
-      <w:spacing w:after="80" w:line="240" w:lineRule="auto"/>
-      <w:contextualSpacing/>
+      <w:keepNext/>
+      <w:keepLines/>
+      <w:spacing w:after="240" w:before="480"/>
       <w:jc w:val="center"/>
     </w:pPr>
     <w:rPr>
       <w:rFonts w:asciiTheme="majorHAnsi" w:cstheme="majorBidi" w:eastAsiaTheme="majorEastAsia" w:hAnsiTheme="majorHAnsi"/>
-      <w:sz w:val="56"/>
-      <w:szCs w:val="56"/>
-    </w:rPr>
-  </w:style>
-  <w:style w:customStyle="1" w:styleId="TitleChar" w:type="character">
-    <w:name w:val="Title Char"/>
-    <w:basedOn w:val="DefaultParagraphFont"/>
-    <w:link w:val="Title"/>
-    <w:uiPriority w:val="10"/>
-    <w:rsid w:val="00A10FD9"/>
-    <w:rPr>
-      <w:rFonts w:asciiTheme="majorHAnsi" w:cstheme="majorBidi" w:eastAsiaTheme="majorEastAsia" w:hAnsiTheme="majorHAnsi"/>
-      <w:sz w:val="56"/>
-      <w:szCs w:val="56"/>
+      <w:b/>
+      <w:bCs/>
+      <w:color w:themeColor="accent1" w:themeShade="B5" w:val="345A8A"/>
+      <w:sz w:val="36"/>
+      <w:szCs w:val="36"/>
     </w:rPr>
   </w:style>
   <w:style w:styleId="Subtitle" w:type="paragraph">
     <w:name w:val="Subtitle"/>
-    <w:basedOn w:val="Title"/>
-    <w:next w:val="BodyText"/>
-    <w:link w:val="SubtitleChar"/>
-    <w:uiPriority w:val="11"/>
-    <w:qFormat/>
-    <w:rsid w:val="00A10FD9"/>
-    <w:pPr>
-      <w:numPr>
-        <w:ilvl w:val="1"/>
-      </w:numPr>
-    </w:pPr>
-    <w:rPr>
-      <w:rFonts w:cstheme="majorBidi" w:eastAsiaTheme="majorEastAsia"/>
-      <w:spacing w:val="15"/>
-      <w:sz w:val="28"/>
-      <w:szCs w:val="28"/>
-    </w:rPr>
-  </w:style>
-  <w:style w:customStyle="1" w:styleId="SubtitleChar" w:type="character">
-    <w:name w:val="Subtitle Char"/>
-    <w:basedOn w:val="DefaultParagraphFont"/>
-    <w:link w:val="Subtitle"/>
-    <w:uiPriority w:val="11"/>
-    <w:rsid w:val="00A10FD9"/>
-    <w:rPr>
-      <w:rFonts w:cstheme="majorBidi" w:eastAsiaTheme="majorEastAsia"/>
-      <w:color w:themeColor="text1" w:themeTint="A6" w:val="595959"/>
-      <w:spacing w:val="15"/>
-      <w:sz w:val="28"/>
-      <w:szCs w:val="28"/>
-    </w:rPr>
-  </w:style>
-  <w:style w:customStyle="1" w:styleId="Author" w:type="paragraph">
-    <w:name w:val="Author"/>
     <w:basedOn w:val="Title"/>
     <w:next w:val="BodyText"/>
     <w:qFormat/>
     <w:pPr>
       <w:keepNext/>
       <w:keepLines/>
+      <w:spacing w:after="240" w:before="240"/>
+      <w:jc w:val="center"/>
     </w:pPr>
     <w:rPr>
-      <w:sz w:val="24"/>
-      <w:szCs w:val="24"/>
+      <w:sz w:val="30"/>
+      <w:szCs w:val="30"/>
     </w:rPr>
   </w:style>
-  <w:style w:styleId="Date" w:type="paragraph">
-    <w:name w:val="Date"/>
-    <w:basedOn w:val="Title"/>
+  <w:style w:customStyle="1" w:styleId="Author" w:type="paragraph">
+    <w:name w:val="Author"/>
     <w:next w:val="BodyText"/>
     <w:qFormat/>
     <w:pPr>
       <w:keepNext/>
       <w:keepLines/>
+      <w:jc w:val="center"/>
     </w:pPr>
-    <w:rPr>
-      <w:sz w:val="24"/>
-      <w:szCs w:val="24"/>
-    </w:rPr>
+  </w:style>
+  <w:style w:styleId="Date" w:type="paragraph">
+    <w:name w:val="Date"/>
+    <w:next w:val="BodyText"/>
+    <w:qFormat/>
+    <w:pPr>
+      <w:keepNext/>
+      <w:keepLines/>
+      <w:jc w:val="center"/>
+    </w:pPr>
   </w:style>
   <w:style w:customStyle="1" w:styleId="AbstractTitle" w:type="paragraph">
     <w:name w:val="Abstract Title"/>
@@ -5205,13 +5311,15 @@
     <w:pPr>
       <w:keepNext/>
       <w:keepLines/>
+      <w:jc w:val="center"/>
       <w:spacing w:after="0" w:before="300"/>
-      <w:jc w:val="center"/>
     </w:pPr>
     <w:rPr>
-      <w:b/>
       <w:sz w:val="20"/>
       <w:szCs w:val="20"/>
+      <w:b/>
+      <w:color w:val="345A8A"/>
+      &gt;
     </w:rPr>
   </w:style>
   <w:style w:customStyle="1" w:styleId="Abstract" w:type="paragraph">
@@ -5238,321 +5346,191 @@
     <w:rPr/>
   </w:style>
   <w:style w:styleId="Heading1" w:type="paragraph">
-    <w:name w:val="heading 1"/>
+    <w:name w:val="Heading 1"/>
     <w:basedOn w:val="Normal"/>
     <w:next w:val="BodyText"/>
-    <w:link w:val="Heading1Char"/>
     <w:uiPriority w:val="9"/>
     <w:qFormat/>
-    <w:rsid w:val="00A10FD9"/>
     <w:pPr>
       <w:keepNext/>
       <w:keepLines/>
-      <w:spacing w:after="80" w:before="360"/>
+      <w:spacing w:after="0" w:before="480"/>
       <w:outlineLvl w:val="0"/>
     </w:pPr>
     <w:rPr>
       <w:rFonts w:asciiTheme="majorHAnsi" w:cstheme="majorBidi" w:eastAsiaTheme="majorEastAsia" w:hAnsiTheme="majorHAnsi"/>
-      <w:color w:themeColor="accent1" w:themeShade="BF" w:val="0F4761"/>
-      <w:sz w:val="40"/>
-      <w:szCs w:val="40"/>
+      <w:b/>
+      <w:bCs/>
+      <w:color w:themeColor="accent1" w:val="4F81BD"/>
+      <w:sz w:val="32"/>
+      <w:szCs w:val="32"/>
     </w:rPr>
   </w:style>
   <w:style w:styleId="Heading2" w:type="paragraph">
-    <w:name w:val="heading 2"/>
+    <w:name w:val="Heading 2"/>
     <w:basedOn w:val="Normal"/>
     <w:next w:val="BodyText"/>
-    <w:link w:val="Heading2Char"/>
     <w:uiPriority w:val="9"/>
-    <w:semiHidden/>
     <w:unhideWhenUsed/>
     <w:qFormat/>
-    <w:rsid w:val="00A10FD9"/>
     <w:pPr>
       <w:keepNext/>
       <w:keepLines/>
-      <w:spacing w:after="80" w:before="160"/>
+      <w:spacing w:after="0" w:before="200"/>
       <w:outlineLvl w:val="1"/>
     </w:pPr>
     <w:rPr>
       <w:rFonts w:asciiTheme="majorHAnsi" w:cstheme="majorBidi" w:eastAsiaTheme="majorEastAsia" w:hAnsiTheme="majorHAnsi"/>
-      <w:color w:themeColor="accent1" w:themeShade="BF" w:val="0F4761"/>
-      <w:sz w:val="32"/>
-      <w:szCs w:val="32"/>
+      <w:b/>
+      <w:bCs/>
+      <w:color w:themeColor="accent1" w:val="4F81BD"/>
+      <w:sz w:val="28"/>
+      <w:szCs w:val="28"/>
     </w:rPr>
   </w:style>
   <w:style w:styleId="Heading3" w:type="paragraph">
-    <w:name w:val="heading 3"/>
+    <w:name w:val="Heading 3"/>
     <w:basedOn w:val="Normal"/>
     <w:next w:val="BodyText"/>
-    <w:link w:val="Heading3Char"/>
     <w:uiPriority w:val="9"/>
-    <w:semiHidden/>
     <w:unhideWhenUsed/>
     <w:qFormat/>
-    <w:rsid w:val="00A10FD9"/>
     <w:pPr>
       <w:keepNext/>
       <w:keepLines/>
-      <w:spacing w:after="80" w:before="160"/>
+      <w:spacing w:after="0" w:before="200"/>
       <w:outlineLvl w:val="2"/>
     </w:pPr>
     <w:rPr>
-      <w:rFonts w:cstheme="majorBidi" w:eastAsiaTheme="majorEastAsia"/>
-      <w:color w:themeColor="accent1" w:themeShade="BF" w:val="0F4761"/>
-      <w:sz w:val="28"/>
-      <w:szCs w:val="28"/>
+      <w:rFonts w:asciiTheme="majorHAnsi" w:cstheme="majorBidi" w:eastAsiaTheme="majorEastAsia" w:hAnsiTheme="majorHAnsi"/>
+      <w:b/>
+      <w:bCs/>
+      <w:color w:themeColor="accent1" w:val="4F81BD"/>
+      <w:sz w:val="24"/>
+      <w:szCs w:val="24"/>
     </w:rPr>
   </w:style>
   <w:style w:styleId="Heading4" w:type="paragraph">
-    <w:name w:val="heading 4"/>
+    <w:name w:val="Heading 4"/>
     <w:basedOn w:val="Normal"/>
     <w:next w:val="BodyText"/>
-    <w:link w:val="Heading4Char"/>
     <w:uiPriority w:val="9"/>
-    <w:semiHidden/>
     <w:unhideWhenUsed/>
     <w:qFormat/>
-    <w:rsid w:val="00A10FD9"/>
     <w:pPr>
       <w:keepNext/>
       <w:keepLines/>
-      <w:spacing w:after="40" w:before="80"/>
+      <w:spacing w:after="0" w:before="200"/>
       <w:outlineLvl w:val="3"/>
     </w:pPr>
     <w:rPr>
-      <w:rFonts w:cstheme="majorBidi" w:eastAsiaTheme="majorEastAsia"/>
+      <w:rFonts w:asciiTheme="majorHAnsi" w:cstheme="majorBidi" w:eastAsiaTheme="majorEastAsia" w:hAnsiTheme="majorHAnsi"/>
       <w:i/>
-      <w:iCs/>
-      <w:color w:themeColor="accent1" w:themeShade="BF" w:val="0F4761"/>
+      <w:bCs/>
+      <w:color w:themeColor="accent1" w:val="4F81BD"/>
+      <w:sz w:val="24"/>
+      <w:szCs w:val="24"/>
     </w:rPr>
   </w:style>
   <w:style w:styleId="Heading5" w:type="paragraph">
-    <w:name w:val="heading 5"/>
+    <w:name w:val="Heading 5"/>
     <w:basedOn w:val="Normal"/>
     <w:next w:val="BodyText"/>
-    <w:link w:val="Heading5Char"/>
     <w:uiPriority w:val="9"/>
-    <w:semiHidden/>
     <w:unhideWhenUsed/>
     <w:qFormat/>
-    <w:rsid w:val="00A10FD9"/>
     <w:pPr>
       <w:keepNext/>
       <w:keepLines/>
-      <w:spacing w:after="40" w:before="80"/>
+      <w:spacing w:after="0" w:before="200"/>
       <w:outlineLvl w:val="4"/>
     </w:pPr>
     <w:rPr>
-      <w:rFonts w:cstheme="majorBidi" w:eastAsiaTheme="majorEastAsia"/>
-      <w:color w:themeColor="accent1" w:themeShade="BF" w:val="0F4761"/>
+      <w:rFonts w:asciiTheme="majorHAnsi" w:cstheme="majorBidi" w:eastAsiaTheme="majorEastAsia" w:hAnsiTheme="majorHAnsi"/>
+      <w:iCs/>
+      <w:color w:themeColor="accent1" w:val="4F81BD"/>
+      <w:sz w:val="24"/>
+      <w:szCs w:val="24"/>
     </w:rPr>
   </w:style>
   <w:style w:styleId="Heading6" w:type="paragraph">
-    <w:name w:val="heading 6"/>
+    <w:name w:val="Heading 6"/>
     <w:basedOn w:val="Normal"/>
     <w:next w:val="BodyText"/>
-    <w:link w:val="Heading6Char"/>
     <w:uiPriority w:val="9"/>
-    <w:semiHidden/>
     <w:unhideWhenUsed/>
     <w:qFormat/>
-    <w:rsid w:val="00A10FD9"/>
     <w:pPr>
       <w:keepNext/>
       <w:keepLines/>
-      <w:spacing w:after="0" w:before="40"/>
+      <w:spacing w:after="0" w:before="200"/>
       <w:outlineLvl w:val="5"/>
     </w:pPr>
     <w:rPr>
-      <w:rFonts w:cstheme="majorBidi" w:eastAsiaTheme="majorEastAsia"/>
-      <w:i/>
-      <w:iCs/>
-      <w:color w:themeColor="text1" w:themeTint="A6" w:val="595959"/>
+      <w:rFonts w:asciiTheme="majorHAnsi" w:cstheme="majorBidi" w:eastAsiaTheme="majorEastAsia" w:hAnsiTheme="majorHAnsi"/>
+      <w:color w:themeColor="accent1" w:val="4F81BD"/>
+      <w:sz w:val="24"/>
+      <w:szCs w:val="24"/>
     </w:rPr>
   </w:style>
   <w:style w:styleId="Heading7" w:type="paragraph">
-    <w:name w:val="heading 7"/>
+    <w:name w:val="Heading 7"/>
     <w:basedOn w:val="Normal"/>
     <w:next w:val="BodyText"/>
-    <w:link w:val="Heading7Char"/>
     <w:uiPriority w:val="9"/>
-    <w:semiHidden/>
     <w:unhideWhenUsed/>
     <w:qFormat/>
-    <w:rsid w:val="00A10FD9"/>
     <w:pPr>
       <w:keepNext/>
       <w:keepLines/>
-      <w:spacing w:after="0" w:before="40"/>
+      <w:spacing w:after="0" w:before="200"/>
       <w:outlineLvl w:val="6"/>
     </w:pPr>
     <w:rPr>
-      <w:rFonts w:cstheme="majorBidi" w:eastAsiaTheme="majorEastAsia"/>
-      <w:color w:themeColor="text1" w:themeTint="A6" w:val="595959"/>
+      <w:rFonts w:asciiTheme="majorHAnsi" w:cstheme="majorBidi" w:eastAsiaTheme="majorEastAsia" w:hAnsiTheme="majorHAnsi"/>
+      <w:color w:themeColor="accent1" w:val="4F81BD"/>
+      <w:sz w:val="24"/>
+      <w:szCs w:val="24"/>
     </w:rPr>
   </w:style>
   <w:style w:styleId="Heading8" w:type="paragraph">
-    <w:name w:val="heading 8"/>
+    <w:name w:val="Heading 8"/>
     <w:basedOn w:val="Normal"/>
     <w:next w:val="BodyText"/>
-    <w:link w:val="Heading8Char"/>
     <w:uiPriority w:val="9"/>
-    <w:semiHidden/>
     <w:unhideWhenUsed/>
     <w:qFormat/>
-    <w:rsid w:val="00A10FD9"/>
     <w:pPr>
       <w:keepNext/>
       <w:keepLines/>
-      <w:spacing w:after="0"/>
+      <w:spacing w:after="0" w:before="200"/>
       <w:outlineLvl w:val="7"/>
     </w:pPr>
     <w:rPr>
-      <w:rFonts w:cstheme="majorBidi" w:eastAsiaTheme="majorEastAsia"/>
-      <w:i/>
-      <w:iCs/>
-      <w:color w:themeColor="text1" w:themeTint="D8" w:val="272727"/>
+      <w:rFonts w:asciiTheme="majorHAnsi" w:cstheme="majorBidi" w:eastAsiaTheme="majorEastAsia" w:hAnsiTheme="majorHAnsi"/>
+      <w:color w:themeColor="accent1" w:val="4F81BD"/>
+      <w:sz w:val="24"/>
+      <w:szCs w:val="24"/>
     </w:rPr>
   </w:style>
   <w:style w:styleId="Heading9" w:type="paragraph">
-    <w:name w:val="heading 9"/>
+    <w:name w:val="Heading 9"/>
     <w:basedOn w:val="Normal"/>
     <w:next w:val="BodyText"/>
-    <w:link w:val="Heading9Char"/>
     <w:uiPriority w:val="9"/>
-    <w:semiHidden/>
     <w:unhideWhenUsed/>
     <w:qFormat/>
-    <w:rsid w:val="00A10FD9"/>
     <w:pPr>
       <w:keepNext/>
       <w:keepLines/>
-      <w:spacing w:after="0"/>
+      <w:spacing w:after="0" w:before="200"/>
       <w:outlineLvl w:val="8"/>
     </w:pPr>
     <w:rPr>
-      <w:rFonts w:cstheme="majorBidi" w:eastAsiaTheme="majorEastAsia"/>
-      <w:color w:themeColor="text1" w:themeTint="D8" w:val="272727"/>
-    </w:rPr>
-  </w:style>
-  <w:style w:customStyle="1" w:styleId="Heading1Char" w:type="character">
-    <w:name w:val="Heading 1 Char"/>
-    <w:basedOn w:val="DefaultParagraphFont"/>
-    <w:link w:val="Heading1"/>
-    <w:uiPriority w:val="9"/>
-    <w:rsid w:val="00A10FD9"/>
-    <w:rPr>
       <w:rFonts w:asciiTheme="majorHAnsi" w:cstheme="majorBidi" w:eastAsiaTheme="majorEastAsia" w:hAnsiTheme="majorHAnsi"/>
-      <w:color w:themeColor="accent1" w:themeShade="BF" w:val="0F4761"/>
-      <w:sz w:val="40"/>
-      <w:szCs w:val="40"/>
-    </w:rPr>
-  </w:style>
-  <w:style w:customStyle="1" w:styleId="Heading2Char" w:type="character">
-    <w:name w:val="Heading 2 Char"/>
-    <w:basedOn w:val="DefaultParagraphFont"/>
-    <w:link w:val="Heading2"/>
-    <w:uiPriority w:val="9"/>
-    <w:semiHidden/>
-    <w:rsid w:val="00A10FD9"/>
-    <w:rPr>
-      <w:rFonts w:asciiTheme="majorHAnsi" w:cstheme="majorBidi" w:eastAsiaTheme="majorEastAsia" w:hAnsiTheme="majorHAnsi"/>
-      <w:color w:themeColor="accent1" w:themeShade="BF" w:val="0F4761"/>
-      <w:sz w:val="32"/>
-      <w:szCs w:val="32"/>
-    </w:rPr>
-  </w:style>
-  <w:style w:customStyle="1" w:styleId="Heading3Char" w:type="character">
-    <w:name w:val="Heading 3 Char"/>
-    <w:basedOn w:val="DefaultParagraphFont"/>
-    <w:link w:val="Heading3"/>
-    <w:uiPriority w:val="9"/>
-    <w:semiHidden/>
-    <w:rsid w:val="00A10FD9"/>
-    <w:rPr>
-      <w:rFonts w:cstheme="majorBidi" w:eastAsiaTheme="majorEastAsia"/>
-      <w:color w:themeColor="accent1" w:themeShade="BF" w:val="0F4761"/>
-      <w:sz w:val="28"/>
-      <w:szCs w:val="28"/>
-    </w:rPr>
-  </w:style>
-  <w:style w:customStyle="1" w:styleId="Heading4Char" w:type="character">
-    <w:name w:val="Heading 4 Char"/>
-    <w:basedOn w:val="DefaultParagraphFont"/>
-    <w:link w:val="Heading4"/>
-    <w:uiPriority w:val="9"/>
-    <w:semiHidden/>
-    <w:rsid w:val="00A10FD9"/>
-    <w:rPr>
-      <w:rFonts w:cstheme="majorBidi" w:eastAsiaTheme="majorEastAsia"/>
-      <w:i/>
-      <w:iCs/>
-      <w:color w:themeColor="accent1" w:themeShade="BF" w:val="0F4761"/>
-    </w:rPr>
-  </w:style>
-  <w:style w:customStyle="1" w:styleId="Heading5Char" w:type="character">
-    <w:name w:val="Heading 5 Char"/>
-    <w:basedOn w:val="DefaultParagraphFont"/>
-    <w:link w:val="Heading5"/>
-    <w:uiPriority w:val="9"/>
-    <w:semiHidden/>
-    <w:rsid w:val="00A10FD9"/>
-    <w:rPr>
-      <w:rFonts w:cstheme="majorBidi" w:eastAsiaTheme="majorEastAsia"/>
-      <w:color w:themeColor="accent1" w:themeShade="BF" w:val="0F4761"/>
-    </w:rPr>
-  </w:style>
-  <w:style w:customStyle="1" w:styleId="Heading6Char" w:type="character">
-    <w:name w:val="Heading 6 Char"/>
-    <w:basedOn w:val="DefaultParagraphFont"/>
-    <w:link w:val="Heading6"/>
-    <w:uiPriority w:val="9"/>
-    <w:semiHidden/>
-    <w:rsid w:val="00A10FD9"/>
-    <w:rPr>
-      <w:rFonts w:cstheme="majorBidi" w:eastAsiaTheme="majorEastAsia"/>
-      <w:i/>
-      <w:iCs/>
-      <w:color w:themeColor="text1" w:themeTint="A6" w:val="595959"/>
-    </w:rPr>
-  </w:style>
-  <w:style w:customStyle="1" w:styleId="Heading7Char" w:type="character">
-    <w:name w:val="Heading 7 Char"/>
-    <w:basedOn w:val="DefaultParagraphFont"/>
-    <w:link w:val="Heading7"/>
-    <w:uiPriority w:val="9"/>
-    <w:semiHidden/>
-    <w:rsid w:val="00A10FD9"/>
-    <w:rPr>
-      <w:rFonts w:cstheme="majorBidi" w:eastAsiaTheme="majorEastAsia"/>
-      <w:color w:themeColor="text1" w:themeTint="A6" w:val="595959"/>
-    </w:rPr>
-  </w:style>
-  <w:style w:customStyle="1" w:styleId="Heading8Char" w:type="character">
-    <w:name w:val="Heading 8 Char"/>
-    <w:basedOn w:val="DefaultParagraphFont"/>
-    <w:link w:val="Heading8"/>
-    <w:uiPriority w:val="9"/>
-    <w:semiHidden/>
-    <w:rsid w:val="00A10FD9"/>
-    <w:rPr>
-      <w:rFonts w:cstheme="majorBidi" w:eastAsiaTheme="majorEastAsia"/>
-      <w:i/>
-      <w:iCs/>
-      <w:color w:themeColor="text1" w:themeTint="D8" w:val="272727"/>
-    </w:rPr>
-  </w:style>
-  <w:style w:customStyle="1" w:styleId="Heading9Char" w:type="character">
-    <w:name w:val="Heading 9 Char"/>
-    <w:basedOn w:val="DefaultParagraphFont"/>
-    <w:link w:val="Heading9"/>
-    <w:uiPriority w:val="9"/>
-    <w:semiHidden/>
-    <w:rsid w:val="00A10FD9"/>
-    <w:rPr>
-      <w:rFonts w:cstheme="majorBidi" w:eastAsiaTheme="majorEastAsia"/>
-      <w:color w:themeColor="text1" w:themeTint="D8" w:val="272727"/>
+      <w:color w:themeColor="accent1" w:val="4F81BD"/>
+      <w:sz w:val="24"/>
+      <w:szCs w:val="24"/>
     </w:rPr>
   </w:style>
   <w:style w:styleId="BlockText" w:type="paragraph">
@@ -5577,8 +5555,8 @@
   </w:style>
   <w:style w:styleId="FootnoteBlockText" w:type="paragraph">
     <w:name w:val="Footnote Block Text"/>
-    <w:basedOn w:val="FootnoteText"/>
-    <w:next w:val="FootnoteText"/>
+    <w:basedOn w:val="Footnote Text"/>
+    <w:next w:val="Footnote Text"/>
     <w:uiPriority w:val="9"/>
     <w:unhideWhenUsed/>
     <w:qFormat/>
@@ -5608,11 +5586,18 @@
       </w:tblCellMar>
     </w:tblPr>
     <w:tblStylePr w:type="firstRow">
+      <w:tblPr>
+        <w:jc w:val="left"/>
+        <w:tblInd w:type="dxa" w:w="0"/>
+      </w:tblPr>
+      <w:trPr>
+        <w:jc w:val="left"/>
+      </w:trPr>
       <w:tcPr>
+        <w:vAlign w:val="bottom"/>
         <w:tcBorders>
           <w:bottom w:val="single"/>
         </w:tcBorders>
-        <w:vAlign w:val="bottom"/>
       </w:tcPr>
     </w:tblStylePr>
   </w:style>
@@ -5728,7 +5713,6 @@
     <w:name w:val="KeywordTok"/>
     <w:basedOn w:val="VerbatimChar"/>
     <w:rPr>
-      <w:b/>
       <w:color w:val="003b4f"/>
       <w:shd w:val="clear" w:fill="f1f3f5"/>
     </w:rPr>
@@ -5833,9 +5817,9 @@
     <w:name w:val="DocumentationTok"/>
     <w:basedOn w:val="VerbatimChar"/>
     <w:rPr>
-      <w:i/>
       <w:color w:val="5e5e5e"/>
       <w:shd w:val="clear" w:fill="f1f3f5"/>
+      <w:i/>
     </w:rPr>
   </w:style>
   <w:style w:type="character" w:customStyle="1" w:styleId="AnnotationTok">
@@ -5850,9 +5834,9 @@
     <w:name w:val="CommentVarTok"/>
     <w:basedOn w:val="VerbatimChar"/>
     <w:rPr>
-      <w:i/>
       <w:color w:val="5e5e5e"/>
       <w:shd w:val="clear" w:fill="f1f3f5"/>
+      <w:i/>
     </w:rPr>
   </w:style>
   <w:style w:type="character" w:customStyle="1" w:styleId="OtherTok">
@@ -5883,7 +5867,6 @@
     <w:name w:val="ControlFlowTok"/>
     <w:basedOn w:val="VerbatimChar"/>
     <w:rPr>
-      <w:b/>
       <w:color w:val="003b4f"/>
       <w:shd w:val="clear" w:fill="f1f3f5"/>
     </w:rPr>
@@ -5948,9 +5931,9 @@
     <w:name w:val="WarningTok"/>
     <w:basedOn w:val="VerbatimChar"/>
     <w:rPr>
-      <w:i/>
       <w:color w:val="5e5e5e"/>
       <w:shd w:val="clear" w:fill="f1f3f5"/>
+      <w:i/>
     </w:rPr>
   </w:style>
   <w:style w:type="character" w:customStyle="1" w:styleId="AlertTok">
@@ -5991,44 +5974,44 @@
         <a:sysClr val="window" lastClr="FFFFFF"/>
       </a:lt1>
       <a:dk2>
-        <a:srgbClr val="0E2841"/>
+        <a:srgbClr val="1F497D"/>
       </a:dk2>
       <a:lt2>
-        <a:srgbClr val="E8E8E8"/>
+        <a:srgbClr val="EEECE1"/>
       </a:lt2>
       <a:accent1>
-        <a:srgbClr val="156082"/>
+        <a:srgbClr val="4F81BD"/>
       </a:accent1>
       <a:accent2>
-        <a:srgbClr val="E97132"/>
+        <a:srgbClr val="C0504D"/>
       </a:accent2>
       <a:accent3>
-        <a:srgbClr val="196B24"/>
+        <a:srgbClr val="9BBB59"/>
       </a:accent3>
       <a:accent4>
-        <a:srgbClr val="0F9ED5"/>
+        <a:srgbClr val="8064A2"/>
       </a:accent4>
       <a:accent5>
-        <a:srgbClr val="A02B93"/>
+        <a:srgbClr val="4BACC6"/>
       </a:accent5>
       <a:accent6>
-        <a:srgbClr val="4EA72E"/>
+        <a:srgbClr val="F79646"/>
       </a:accent6>
       <a:hlink>
-        <a:srgbClr val="467886"/>
+        <a:srgbClr val="0000FF"/>
       </a:hlink>
       <a:folHlink>
-        <a:srgbClr val="96607D"/>
+        <a:srgbClr val="800080"/>
       </a:folHlink>
     </a:clrScheme>
     <a:fontScheme name="Office">
       <a:majorFont>
-        <a:latin typeface="Aptos Display" panose="02110004020202020204"/>
+        <a:latin typeface="Calibri"/>
         <a:ea typeface=""/>
         <a:cs typeface=""/>
-        <a:font script="Jpan" typeface="游ゴシック Light"/>
+        <a:font script="Jpan" typeface="ＭＳ ゴシック"/>
         <a:font script="Hang" typeface="맑은 고딕"/>
-        <a:font script="Hans" typeface="等线 Light"/>
+        <a:font script="Hans" typeface="宋体"/>
         <a:font script="Hant" typeface="新細明體"/>
         <a:font script="Arab" typeface="Times New Roman"/>
         <a:font script="Hebr" typeface="Times New Roman"/>
@@ -6055,32 +6038,14 @@
         <a:font script="Mong" typeface="Mongolian Baiti"/>
         <a:font script="Viet" typeface="Times New Roman"/>
         <a:font script="Uigh" typeface="Microsoft Uighur"/>
-        <a:font script="Geor" typeface="Sylfaen"/>
-        <a:font script="Armn" typeface="Arial"/>
-        <a:font script="Bugi" typeface="Leelawadee UI"/>
-        <a:font script="Bopo" typeface="Microsoft JhengHei"/>
-        <a:font script="Java" typeface="Javanese Text"/>
-        <a:font script="Lisu" typeface="Segoe UI"/>
-        <a:font script="Mymr" typeface="Myanmar Text"/>
-        <a:font script="Nkoo" typeface="Ebrima"/>
-        <a:font script="Olck" typeface="Nirmala UI"/>
-        <a:font script="Osma" typeface="Ebrima"/>
-        <a:font script="Phag" typeface="Phagspa"/>
-        <a:font script="Syrn" typeface="Estrangelo Edessa"/>
-        <a:font script="Syrj" typeface="Estrangelo Edessa"/>
-        <a:font script="Syre" typeface="Estrangelo Edessa"/>
-        <a:font script="Sora" typeface="Nirmala UI"/>
-        <a:font script="Tale" typeface="Microsoft Tai Le"/>
-        <a:font script="Talu" typeface="Microsoft New Tai Lue"/>
-        <a:font script="Tfng" typeface="Ebrima"/>
       </a:majorFont>
       <a:minorFont>
-        <a:latin typeface="Aptos" panose="02110004020202020204"/>
+        <a:latin typeface="Cambria"/>
         <a:ea typeface=""/>
         <a:cs typeface=""/>
-        <a:font script="Jpan" typeface="游明朝"/>
+        <a:font script="Jpan" typeface="ＭＳ 明朝"/>
         <a:font script="Hang" typeface="맑은 고딕"/>
-        <a:font script="Hans" typeface="等线"/>
+        <a:font script="Hans" typeface="宋体"/>
         <a:font script="Hant" typeface="新細明體"/>
         <a:font script="Arab" typeface="Arial"/>
         <a:font script="Hebr" typeface="Arial"/>
@@ -6107,24 +6072,6 @@
         <a:font script="Mong" typeface="Mongolian Baiti"/>
         <a:font script="Viet" typeface="Arial"/>
         <a:font script="Uigh" typeface="Microsoft Uighur"/>
-        <a:font script="Geor" typeface="Sylfaen"/>
-        <a:font script="Armn" typeface="Arial"/>
-        <a:font script="Bugi" typeface="Leelawadee UI"/>
-        <a:font script="Bopo" typeface="Microsoft JhengHei"/>
-        <a:font script="Java" typeface="Javanese Text"/>
-        <a:font script="Lisu" typeface="Segoe UI"/>
-        <a:font script="Mymr" typeface="Myanmar Text"/>
-        <a:font script="Nkoo" typeface="Ebrima"/>
-        <a:font script="Olck" typeface="Nirmala UI"/>
-        <a:font script="Osma" typeface="Ebrima"/>
-        <a:font script="Phag" typeface="Phagspa"/>
-        <a:font script="Syrn" typeface="Estrangelo Edessa"/>
-        <a:font script="Syrj" typeface="Estrangelo Edessa"/>
-        <a:font script="Syre" typeface="Estrangelo Edessa"/>
-        <a:font script="Sora" typeface="Nirmala UI"/>
-        <a:font script="Tale" typeface="Microsoft Tai Le"/>
-        <a:font script="Talu" typeface="Microsoft New Tai Lue"/>
-        <a:font script="Tfng" typeface="Ebrima"/>
       </a:minorFont>
     </a:fontScheme>
     <a:fmtScheme name="Office">
@@ -6136,141 +6083,200 @@
           <a:gsLst>
             <a:gs pos="0">
               <a:schemeClr val="phClr">
-                <a:lumMod val="110000"/>
-                <a:satMod val="105000"/>
-                <a:tint val="67000"/>
+                <a:tint val="50000"/>
+                <a:satMod val="300000"/>
               </a:schemeClr>
             </a:gs>
-            <a:gs pos="50000">
+            <a:gs pos="35000">
               <a:schemeClr val="phClr">
-                <a:lumMod val="105000"/>
-                <a:satMod val="103000"/>
-                <a:tint val="73000"/>
+                <a:tint val="37000"/>
+                <a:satMod val="300000"/>
               </a:schemeClr>
             </a:gs>
             <a:gs pos="100000">
               <a:schemeClr val="phClr">
-                <a:lumMod val="105000"/>
-                <a:satMod val="109000"/>
-                <a:tint val="81000"/>
+                <a:tint val="15000"/>
+                <a:satMod val="350000"/>
               </a:schemeClr>
             </a:gs>
           </a:gsLst>
-          <a:lin ang="5400000" scaled="0"/>
+          <a:lin ang="16200000" scaled="1"/>
         </a:gradFill>
         <a:gradFill rotWithShape="1">
           <a:gsLst>
             <a:gs pos="0">
               <a:schemeClr val="phClr">
-                <a:satMod val="103000"/>
-                <a:lumMod val="102000"/>
-                <a:tint val="94000"/>
-              </a:schemeClr>
-            </a:gs>
-            <a:gs pos="50000">
-              <a:schemeClr val="phClr">
-                <a:satMod val="110000"/>
-                <a:lumMod val="100000"/>
+                <a:tint val="100000"/>
                 <a:shade val="100000"/>
+                <a:satMod val="130000"/>
               </a:schemeClr>
             </a:gs>
             <a:gs pos="100000">
               <a:schemeClr val="phClr">
-                <a:lumMod val="99000"/>
-                <a:satMod val="120000"/>
-                <a:shade val="78000"/>
+                <a:tint val="50000"/>
+                <a:shade val="100000"/>
+                <a:satMod val="350000"/>
               </a:schemeClr>
             </a:gs>
           </a:gsLst>
-          <a:lin ang="5400000" scaled="0"/>
+          <a:lin ang="16200000" scaled="0"/>
         </a:gradFill>
       </a:fillStyleLst>
       <a:lnStyleLst>
-        <a:ln w="6350" cap="flat" cmpd="sng" algn="ctr">
+        <a:ln w="9525" cap="flat" cmpd="sng" algn="ctr">
+          <a:solidFill>
+            <a:schemeClr val="phClr">
+              <a:shade val="95000"/>
+              <a:satMod val="105000"/>
+            </a:schemeClr>
+          </a:solidFill>
+          <a:prstDash val="solid"/>
+        </a:ln>
+        <a:ln w="25400" cap="flat" cmpd="sng" algn="ctr">
           <a:solidFill>
             <a:schemeClr val="phClr"/>
           </a:solidFill>
           <a:prstDash val="solid"/>
-          <a:miter lim="800000"/>
         </a:ln>
-        <a:ln w="12700" cap="flat" cmpd="sng" algn="ctr">
+        <a:ln w="38100" cap="flat" cmpd="sng" algn="ctr">
           <a:solidFill>
             <a:schemeClr val="phClr"/>
           </a:solidFill>
           <a:prstDash val="solid"/>
-          <a:miter lim="800000"/>
-        </a:ln>
-        <a:ln w="19050" cap="flat" cmpd="sng" algn="ctr">
-          <a:solidFill>
-            <a:schemeClr val="phClr"/>
-          </a:solidFill>
-          <a:prstDash val="solid"/>
-          <a:miter lim="800000"/>
         </a:ln>
       </a:lnStyleLst>
       <a:effectStyleLst>
         <a:effectStyle>
-          <a:effectLst/>
-        </a:effectStyle>
-        <a:effectStyle>
-          <a:effectLst/>
+          <a:effectLst>
+            <a:outerShdw blurRad="40000" dist="20000" dir="5400000" rotWithShape="0">
+              <a:srgbClr val="000000">
+                <a:alpha val="38000"/>
+              </a:srgbClr>
+            </a:outerShdw>
+          </a:effectLst>
         </a:effectStyle>
         <a:effectStyle>
           <a:effectLst>
-            <a:outerShdw blurRad="57150" dist="19050" dir="5400000" algn="ctr" rotWithShape="0">
+            <a:outerShdw blurRad="40000" dist="23000" dir="5400000" rotWithShape="0">
               <a:srgbClr val="000000">
-                <a:alpha val="63000"/>
+                <a:alpha val="35000"/>
               </a:srgbClr>
             </a:outerShdw>
           </a:effectLst>
+        </a:effectStyle>
+        <a:effectStyle>
+          <a:effectLst>
+            <a:outerShdw blurRad="40000" dist="23000" dir="5400000" rotWithShape="0">
+              <a:srgbClr val="000000">
+                <a:alpha val="35000"/>
+              </a:srgbClr>
+            </a:outerShdw>
+          </a:effectLst>
+          <a:scene3d>
+            <a:camera prst="orthographicFront">
+              <a:rot lat="0" lon="0" rev="0"/>
+            </a:camera>
+            <a:lightRig rig="threePt" dir="t">
+              <a:rot lat="0" lon="0" rev="1200000"/>
+            </a:lightRig>
+          </a:scene3d>
+          <a:sp3d>
+            <a:bevelT w="63500" h="25400"/>
+          </a:sp3d>
         </a:effectStyle>
       </a:effectStyleLst>
       <a:bgFillStyleLst>
         <a:solidFill>
           <a:schemeClr val="phClr"/>
         </a:solidFill>
-        <a:solidFill>
-          <a:schemeClr val="phClr">
-            <a:tint val="95000"/>
-            <a:satMod val="170000"/>
-          </a:schemeClr>
-        </a:solidFill>
         <a:gradFill rotWithShape="1">
           <a:gsLst>
             <a:gs pos="0">
               <a:schemeClr val="phClr">
-                <a:tint val="93000"/>
-                <a:satMod val="150000"/>
-                <a:shade val="98000"/>
-                <a:lumMod val="102000"/>
+                <a:tint val="40000"/>
+                <a:satMod val="350000"/>
               </a:schemeClr>
             </a:gs>
-            <a:gs pos="50000">
+            <a:gs pos="40000">
               <a:schemeClr val="phClr">
-                <a:tint val="98000"/>
-                <a:satMod val="130000"/>
-                <a:shade val="90000"/>
-                <a:lumMod val="103000"/>
+                <a:tint val="45000"/>
+                <a:shade val="99000"/>
+                <a:satMod val="350000"/>
               </a:schemeClr>
             </a:gs>
             <a:gs pos="100000">
               <a:schemeClr val="phClr">
-                <a:shade val="63000"/>
-                <a:satMod val="120000"/>
+                <a:shade val="20000"/>
+                <a:satMod val="255000"/>
               </a:schemeClr>
             </a:gs>
           </a:gsLst>
-          <a:lin ang="5400000" scaled="0"/>
+          <a:path path="circle">
+            <a:fillToRect l="50000" t="-80000" r="50000" b="180000"/>
+          </a:path>
+        </a:gradFill>
+        <a:gradFill rotWithShape="1">
+          <a:gsLst>
+            <a:gs pos="0">
+              <a:schemeClr val="phClr">
+                <a:tint val="80000"/>
+                <a:satMod val="300000"/>
+              </a:schemeClr>
+            </a:gs>
+            <a:gs pos="100000">
+              <a:schemeClr val="phClr">
+                <a:shade val="30000"/>
+                <a:satMod val="200000"/>
+              </a:schemeClr>
+            </a:gs>
+          </a:gsLst>
+          <a:path path="circle">
+            <a:fillToRect l="50000" t="50000" r="50000" b="50000"/>
+          </a:path>
         </a:gradFill>
       </a:bgFillStyleLst>
     </a:fmtScheme>
   </a:themeElements>
-  <a:objectDefaults/>
+  <a:objectDefaults>
+    <a:spDef>
+      <a:spPr/>
+      <a:bodyPr/>
+      <a:lstStyle/>
+      <a:style>
+        <a:lnRef idx="1">
+          <a:schemeClr val="accent1"/>
+        </a:lnRef>
+        <a:fillRef idx="3">
+          <a:schemeClr val="accent1"/>
+        </a:fillRef>
+        <a:effectRef idx="2">
+          <a:schemeClr val="accent1"/>
+        </a:effectRef>
+        <a:fontRef idx="minor">
+          <a:schemeClr val="lt1"/>
+        </a:fontRef>
+      </a:style>
+    </a:spDef>
+    <a:lnDef>
+      <a:spPr/>
+      <a:bodyPr/>
+      <a:lstStyle/>
+      <a:style>
+        <a:lnRef idx="2">
+          <a:schemeClr val="accent1"/>
+        </a:lnRef>
+        <a:fillRef idx="0">
+          <a:schemeClr val="accent1"/>
+        </a:fillRef>
+        <a:effectRef idx="1">
+          <a:schemeClr val="accent1"/>
+        </a:effectRef>
+        <a:fontRef idx="minor">
+          <a:schemeClr val="tx1"/>
+        </a:fontRef>
+      </a:style>
+    </a:lnDef>
+  </a:objectDefaults>
   <a:extraClrSchemeLst/>
-  <a:extLst>
-    <a:ext uri="{05A4C25C-085E-4340-85A3-A5531E510DB2}">
-      <thm15:themeFamily xmlns:thm15="http://schemas.microsoft.com/office/thememl/2012/main" name="Office Theme" id="{2E142A2C-CD16-42D6-873A-C26D2A0506FA}" vid="{1BDDFF52-6CD6-40A5-AB3C-68EB2F1E4D0A}"/>
-    </a:ext>
-  </a:extLst>
 </a:theme>
 </file>
</xml_diff>